<commit_message>
docs(lab-02): restore full verbatim peer review log in section 1.6
</commit_message>
<xml_diff>
--- a/docs/lab-02/submission-report.docx
+++ b/docs/lab-02/submission-report.docx
@@ -37,38 +37,1164 @@
 
 ### 1.6 Peer Review Evidence *(5 คะแนน)*
 
-**Peer Review Summary Record:**
-- **Author:** Chanya Poolketkij (@chanya06)
-- **Peer Reviewer:** @lmaybelgracel
-- **Full Verbatim Review File:** [docs/lab-02/reviewer.md](https://github.com/chanya06/toktickit/blob/main/docs/lab-02/reviewer.md)
-
-| PR # | Branch | Author | Reviewer | Verdict | Summary of Feedback &amp; Action Taken |
-|---|---|---|---|---|---|
-| [PR #23](https://github.com/chanya06/toktickit/pull/23) | -eature/5-spec-and-tests | @chanya06 | @lmaybelgracel | Approved with comments | Suggested adding Section 7 (Known Limitations) to 	ests.md. Added accordingly. |
-| [PR #25](https://github.com/chanya06/toktickit/pull/25) | -eature/6-db-schema-seed | @chanya06 | @lmaybelgracel | Approved with comments | Verified Prisma FK index &amp; seed idempotent script. Added foreign key index for Attachment.removedByRequesterId. |
-| [PR #27](https://github.com/chanya06/toktickit/pull/27) | -eature/7-requester-context | @chanya06 | @lmaybelgracel | Approved with comments | Checked Dev Requester Selector UI &amp; localStorage key 	oktickit_dev_requester_id. Verified. |
-| [PR #29](https://github.com/chanya06/toktickit/pull/29) | -eature/8-create-ticket-api | @chanya06 | @lmaybelgracel | Approved with comments | Recommended explicit race condition transaction test for ticket sequence generator. Implemented transaction retry. |
-| [PR #30](https://github.com/chanya06/toktickit/pull/30) | -eature/9-create-ticket-ui | @chanya06 | @lmaybelgracel | Approved with comments | Requested local timezone preview for Ticket Date. Formatted createdAt preview. |
-| [PR #31](https://github.com/chanya06/toktickit/pull/31) | -eature/10-my-tickets-api | @chanya06 | @lmaybelgracel | Approved with comments | Verified multi-select filtering and pagination metadata contract. |
-| [PR #32](https://github.com/chanya06/toktickit/pull/32) | -eature/11-my-tickets-ui | @chanya06 | @lmaybelgracel | Approved with comments | Suggested multi-select checkbox UI for categories &amp; priorities. Implemented. |
-| [PR #33](https://github.com/chanya06/toktickit/pull/33) | -eature/12-ticket-detail | @chanya06 | @lmaybelgracel | Approved with comments | Verified 403 Forbidden ownership guard for requester data isolation. |
-| [PR #34](https://github.com/chanya06/toktickit/pull/34) | -eature/13-attachment-lifecycle | @chanya06 | @lmaybelgracel | Approved with comments | Verified file MIME magic byte validation &amp; soft removal audit fields. |
-| [PR #35](https://github.com/chanya06/toktickit/pull/35) | -eature/14-qa-release | @chanya06 | @lmaybelgracel | Approved with comments | Verified 107/107 automated test suite pass &amp; E2E responsive screenshots. |
-| [PR #37](https://github.com/chanya06/toktickit/pull/37) | -eature/15-ui-refinement | @chanya06 | @lmaybelgracel | Approved | Verified UI alignment with instructor mockups and emoji removal. |
-| [PR #39](https://github.com/chanya06/toktickit/pull/39) | -eature/16-reviewer-docs-sync | @chanya06 | @lmaybelgracel | Approved with comments | Verified final document synchronization and test metrics. |
-| [PR #41](https://github.com/chanya06/toktickit/pull/41) | lab2-staging → main | @chanya06 | @lmaybelgracel | Approved with comments | Final release integration into main branch approved after peer review audit. |
+**Rendered `docs/lab-02/reviewer.md`:**
+
+# Lab 2 — Peer Review Record
+
+**Author:** Chanya Poolketkij — GitHub: @chanya06  
+**Peer reviewer:** Peer Reviewer — GitHub: @lmaybelgracel  
+
+---
+
+## Pull Requests I authored (reviewed by my partner)
+
+| PR | Branch | Reviewer verdict |
+| :--- | :--- | :--- |
+| [PR #23](https://github.com/chanya06/toktickit/pull/23) | `feature/5-spec-and-tests` | Approved with comments |
+| [PR #25](https://github.com/chanya06/toktickit/pull/25) | `feature/6-db-schema-seed` | Approved with comments |
+| [PR #27](https://github.com/chanya06/toktickit/pull/27) | `feature/7-requester-context` | Approved with comments |
+| [PR #29](https://github.com/chanya06/toktickit/pull/29) | `feature/8-create-ticket-api` | Approved with comments |
+| [PR #30](https://github.com/chanya06/toktickit/pull/30) | `feature/9-create-ticket-ui` | Approved with comments |
+| [PR #31](https://github.com/chanya06/toktickit/pull/31) | `feature/10-my-tickets-api` | Approved with comments |
+| [PR #32](https://github.com/chanya06/toktickit/pull/32) | `feature/11-my-tickets-ui` | Approved with comments |
+| [PR #33](https://github.com/chanya06/toktickit/pull/33) | `feature/12-ticket-detail` | Approved with comments |
+| [PR #34](https://github.com/chanya06/toktickit/pull/34) | `feature/13-attachment-lifecycle` | Approved with comments |
+| [PR #35](https://github.com/chanya06/toktickit/pull/35) | `feature/14-qa-release` | Approved with comments |
+| [PR #37](https://github.com/chanya06/toktickit/pull/37) | `feature/15-ui-refinement` | Approved |
+| [PR #39](https://github.com/chanya06/toktickit/pull/39) | `feature/16-reviewer-docs-sync` | Approved with comments |
+| [PR #41](https://github.com/chanya06/toktickit/pull/41) | `lab2-staging` | Approved with comments |
+
+### Reviewer comment I received (PR #23):
+&gt; ### ผลการรีวิว Pull Request: Feature/5 Sprint Specifications &amp; Test Plan (#23)
+&gt; 
+&gt; เราได้ทำการรีวิวเอกสารข้อกำหนดทางวิศวกรรม (Engineering Contract) ทั้งหมดในโฟลเดอร์ docs/lab-02/ เทียบกับโจทย์ CPE 334 Lab 2 Handout เรียบร้อยแล้ว เอกสารเขียนได้ครอบคลุมและเป็นระบบดีมาก
+&gt; 
+&gt; จุดเด่นของเอกสาร:
+&gt; 1. specification.md: ขอบเขตงานและ Business Rules (BR-01 ถึง BR-20) ชัดเจน รัดกุม ครอบคลุมการจำลองตัวตน Dev Requester, รูปแบบเลขตั๋ว (TKT-YYYY-XXXXXX), การแสดง Ticket Date (createdAt), กฎการลบไฟล์แบบ Soft Removal พร้อมเหตุผลบังคับ, ข้อจำกัดไฟล์แนบ และยุทธศาสตร์ Compensation/Transaction (BR-15)
+&gt; 2. ui-spec.md: ใช้โทนสี Zen Green ตรงตาม Handout (#006B3C, #0B7A46, #EAF6EF, #F5F7F6) รวมถึงกำหนดเลย์เอาต์ทั้ง 4 หน้า และ Responsive Breakpoints ได้ครบถ้วน
+&gt; 3. api-spec.md: ครอบคลุม REST API ทั้ง 10 Capabilities พร้อม HTTP Status Codes, Data Formats และการตรวจสอบสิทธิ์สตรีมไฟล์แนบและการเข้าถึงตั๋ว
+&gt; 4. tests.md: มีกลยุทธ์การทดสอบ 5 ระดับ (Unit, API, UI Component, UI Style, E2E) พร้อม Traceability Matrix จับคู่กับ AC-01 ถึง AC-10 ชัดเจน
+&gt; 5. reviewer.md &amp; ai-use.md: บันทึกข้อมูลการรีวิวย่อย, คำถาม-คำตอบการแก้ไข, ตาราง Prompt และ Reflection ครบถ้วนตามเกณฑ์
+&gt; 
+&gt; ข้อเสนอแนะเพิ่มเติมเล็กน้อย:
+&gt; - ในไฟล์ docs/lab-02/tests.md แนะนำให้เพิ่มหัวข้อ &quot;## 7. Known Limitations or Deferred Tests&quot; ต่อท้ายในเอกสาร เพื่อให้ตรงตามโครงสร้าง Template ใน Appendix B ของ Handout 100% (สามารถระบุว่า None หรือระบุข้อจำกัดที่ยกไปทำใน Lab 3 ได้)
+
+### How I responded (PR #23):
+&gt; &gt; ### ผลการรีวิว Pull Request: Feature/5 Sprint Specifications &amp; Test Plan (#23)
+&gt; &gt; เราได้ทำการรีวิวเอกสารข้อกำหนดทางวิศวกรรม (Engineering Contract) ทั้งหมดในโฟลเดอร์ docs/lab-02/ เทียบกับโจทย์ CPE 334 Lab 2 Handout เรียบร้อยแล้ว เอกสารเขียนได้ครอบคลุมและเป็นระบบดีมาก
+&gt; &gt; 
+&gt; &gt; จุดเด่นของเอกสาร:
+&gt; &gt; 
+&gt; &gt; 1. specification.md: ขอบเขตงานและ Business Rules (BR-01 ถึง BR-20) ชัดเจน รัดกุม ครอบคลุมการจำลองตัวตน Dev Requester, รูปแบบเลขตั๋ว (TKT-YYYY-XXXXXX), การแสดง Ticket Date (createdAt), กฎการลบไฟล์แบบ Soft Removal พร้อมเหตุผลบังคับ, ข้อจำกัดไฟล์แนบ และยุทธศาสตร์ Compensation/Transaction (BR-15)
+&gt; &gt; 2. ui-spec.md: ใช้โทนสี Zen Green ตรงตาม Handout (#006B3C, #0B7A46, #EAF6EF, #F5F7F6) รวมถึงกำหนดเลย์เอาต์ทั้ง 4 หน้า และ Responsive Breakpoints ได้ครบถ้วน
+&gt; &gt; 3. api-spec.md: ครอบคลุม REST API ทั้ง 10 Capabilities พร้อม HTTP Status Codes, Data Formats และการตรวจสอบสิทธิ์สตรีมไฟล์แนบและการเข้าถึงตั๋ว
+&gt; &gt; 4. tests.md: มีกลยุทธ์การทดสอบ 5 ระดับ (Unit, API, UI Component, UI Style, E2E) พร้อม Traceability Matrix จับคู่กับ AC-01 ถึง AC-10 ชัดเจน
+&gt; &gt; 5. reviewer.md &amp; ai-use.md: บันทึกข้อมูลการรีวิวย่อย, คำถาม-คำตอบการแก้ไข, ตาราง Prompt และ Reflection ครบถ้วนตามเกณฑ์
+&gt; &gt; 
+&gt; &gt; ข้อเสนอแนะเพิ่มเติมเล็กน้อย:
+&gt; &gt; 
+&gt; &gt; * ในไฟล์ docs/lab-02/tests.md แนะนำให้เพิ่มหัวข้อ &quot;## 7. Known Limitations or Deferred Tests&quot; ต่อท้ายในเอกสาร เพื่อให้ตรงตามโครงสร้าง Template ใน Appendix B ของ Handout 100% (สามารถระบุว่า None หรือระบุข้อจำกัดที่ยกไปทำใน Lab 3 ได้)
+&gt; 
+&gt; ขอบคุณสำหรับการรีวิวนะ
+&gt; 
+&gt; เราได้ทำการปรับแก้ไขตามข้อเสนอแนะให้เรียบร้อยแล้วนะ:
+&gt; 
+&gt; เพิ่มหัวข้อ ## 7. Known Limitations or Deferred Tests ต่อท้ายในไฟล์ docs/lab-02/tests.md เรียบร้อยแล้ว เพื่อให้ตรงตาม Appendix B ของ Handout 100% (โดยระบุขอบเขตงานที่ยกเว้นไปทำใน Lab 3 ชัดเจน)
+&gt; อัปเดตบันทึกการแก้ไขลงใน docs/lab-02/reviewer.md เรียบร้อยแล้ว
+
+### Reviewer comment I received (PR #25):
+&gt; ตรวจ schema, migration และ seed data แล้วค่ะ โดยรวมโครงสร้างตรงตาม scope ของ Issue #13 ทั้ง models, enums, indexes และ seed data ที่ใช้ upsert เพื่อป้องกันข้อมูลซ้ำ
+&gt; มีจุดหนึ่งที่อยากให้แก้ก่อน merge คือ removedByRequesterId ใน Attachment ตอนนี้เป็นเพียง Int? แต่ยังไม่มี relation และ foreign key เชื่อมกับ DevelopmentRequester ทำให้ฐานข้อมูลอาจเก็บ requester ID ที่ไม่มีอยู่จริงได้ค่ะ
+&gt; แนะนำให้เพิ่ม relation ระหว่าง Attachment.removedByRequesterId กับ DevelopmentRequester.id พร้อม inverse relation และ index ที่เกี่ยวข้อง จากนั้นสร้าง migration ใหม่ และแนบผลการรัน migration, seed สองรอบ และ tests เพื่อยืนยันว่า migration ใช้งานได้และ seed ไม่สร้างข้อมูลซ้ำค่ะ
+&gt; ส่วนอื่นตรวจแล้วเรียบร้อยดีค่ะ
+&gt; - PR เข้า lab2-staging ถูกต้อง
+&gt; - เชื่อมกับ Issue #13 แล้ว
+&gt; - มี models และ enums ครบตาม Issue
+&gt; - มี Categories 4 รายการ และ Related Systems 7 รายการ
+&gt; - มี Requester ที่ active 4 คน และ inactive 1 คน
+&gt; - ค่า default ของ Ticket ตรงตาม specification
+&gt; - seed ใช้ upsert ได้เหมาะสม
+&gt; 
+&gt; ตรวจการแก้ไขรอบล่าสุดแล้ว จุดเรื่อง removedByRequesterId ได้รับการแก้ครบทั้งใน schema.prisma, migration และ specification.md แล้ว  
+&gt; Foreign key, inverse relation และ index ถูกเพิ่มอย่างสอดคล้องกัน การกำหนด ON DELETE SET NULL ก็เหมาะกับโครงสร้างข้อมูลปัจจุบันค่ะ รวมถึงมีการยืนยันผลการรัน seed ซ้ำและ tests แล้ว  
+&gt; ไม่พบประเด็นที่ต้องแก้เพิ่มเติมสำหรับ PR นี้ค่ะ
+
+### How I responded (PR #25):
+&gt; &gt; ตรวจ schema, migration และ seed data แล้วค่ะ โดยรวมโครงสร้างตรงตาม scope ของ Issue #13 ทั้ง models, enums, indexes และ seed data ที่ใช้ upsert เพื่อป้องกันข้อมูลซ้ำ มีจุดหนึ่งที่อยากให้แก้ก่อน merge คือ removedByRequesterId ใน Attachment ตอนนี้เป็นเพียง Int? แต่ยังไม่มี relation และ foreign key เชื่อมกับ DevelopmentRequester ทำให้ฐานข้อมูลอาจเก็บ requester ID ที่ไม่มีอยู่จริงได้ค่ะ แนะนำให้เพิ่ม relation ระหว่าง Attachment.removedByRequesterId กับ DevelopmentRequester.id พร้อม inverse relation และ index ที่เกี่ยวข้อง จากนั้นสร้าง migration ใหม่ และแนบผลการรัน migration, seed สองรอบ และ tests เพื่อยืนยันว่า migration ใช้งานได้และ seed ไม่สร้างข้อมูลซ้ำค่ะ ส่วนอื่นตรวจแล้วเรียบร้อยดีค่ะ
+&gt; &gt; 
+&gt; &gt; * PR เข้า lab2-staging ถูกต้อง
+&gt; &gt; * เชื่อมกับ Issue #13 แล้ว
+&gt; &gt; * มี models และ enums ครบตาม Issue
+&gt; &gt; * มี Categories 4 รายการ และ Related Systems 7 รายการ
+&gt; &gt; * มี Requester ที่ active 4 คน และ inactive 1 คน
+&gt; &gt; * ค่า default ของ Ticket ตรงตาม specification
+&gt; &gt; * seed ใช้ upsert ได้เหมาะสม
+&gt; 
+&gt; ขอบคุณสำหรับการตรวจทานและคำแนะนำเรื่อง removedByRequesterId มากๆ เลยนะ
+&gt; 
+&gt; เราได้ทำการปรับแก้ไขให้เรียบร้อยแล้ว:
+&gt; 
+&gt; เพิ่ม Foreign Key Relation ระหว่าง Attachment.removedByRequesterId กับ DevelopmentRequester.id พร้อม Inverse Relation และ Index @@index([removedByRequesterId]) เรียบร้อยแล้ว ทั้งใน schema.prisma และ specification.md
+&gt; สร้างและรัน Migration ใหม่ 20260902091354_add_removed_by_requester_fk เรียบร้อยแล้ว
+&gt; ทดสอบรัน npm run seed 2 รอบติดกัน ยืนยันว่า Idempotent ไม่เกิดข้อมูลซ้ำ (Categories 4, Systems 7, Requesters 5) และรัน npm run test ผ่าน 100%
+
+### Reviewer comment I received (PR #27):
+&gt; ตรวจ Development Requester selector, context, persistence, API และ tests แล้วค่ะ โดยรวมแบ่งส่วนได้ดี และมี loading, empty, error รวมถึง testing disclaimer ครบตามขอบเขตของ feature  
+&gt; มีกรณีหนึ่งที่อยากให้แก้ก่อน mergeค่ะ เมื่อ requester ID ที่บันทึกไว้ไม่อยู่ในรายการ active ระบบจะเปิด modal แต่ยังไม่ได้ล้าง selectedRequester และค่าเดิมใน localStorage ทำให้ในบางกรณียังสามารถกลับไปใช้ requester ที่ inactive ได้  
+&gt; แนะนำให้ล้าง identity เดิมเมื่อ saved requester ใช้งานไม่ได้ และเพิ่ม test ครอบคลุมกรณีนี้ค่ะ ส่วนข้อความปุ่มใน Header แนะนำให้เปลี่ยนจาก “Switch” เป็น “Change Requester” เพื่อให้ตรงกับ Issue  
+&gt; หลังแก้และทดสอบกรณี inactive หรือ invalid persisted requester แล้ว ส่งกลับมาให้ตรวจอีกครั้งได้เลยค่ะ
+
+### How I responded (PR #27):
+&gt; &gt; ตรวจ Development Requester selector, context, persistence, API และ tests แล้วค่ะ โดยรวมแบ่งส่วนได้ดี และมี loading, empty, error รวมถึง testing disclaimer ครบตามขอบเขตของ feature มีกรณีหนึ่งที่อยากให้แก้ก่อน mergeค่ะ เมื่อ requester ID ที่บันทึกไว้ไม่อยู่ในรายการ active ระบบจะเปิด modal แต่ยังไม่ได้ล้าง selectedRequester และค่าเดิมใน localStorage ทำให้ในบางกรณียังสามารถกลับไปใช้ requester ที่ inactive ได้ แนะนำให้ล้าง identity เดิมเมื่อ saved requester ใช้งานไม่ได้ และเพิ่ม test ครอบคลุมกรณีนี้ค่ะ ส่วนข้อความปุ่มใน Header แนะนำให้เปลี่ยนจาก “Switch” เป็น “Change Requester” เพื่อให้ตรงกับ Issue หลังแก้และทดสอบกรณี inactive หรือ invalid persisted requester แล้ว ส่งกลับมาให้ตรวจอีกครั้งได้เลยค่ะ
+&gt; 
+&gt; ขอบคุณสำหรับการตรวจทานและคำแนะนำเรื่องการเคลียร์ Saved Requester มากๆ เลยนะ
+&gt; 
+&gt; เราได้ทำการปรับแก้ไขให้เรียบร้อยแล้ว:
+&gt; 
+&gt; อัปเดต RequesterContext.tsx ให้เรียก setSelectedRequester(null) และลบค่าค้างใน localStorage ทันที เมื่อพบว่า saved requester ID นั้น inactive หรือไม่มีอยู่ในรายการ active
+&gt; เปลี่ยนข้อความปุ่มใน Header จาก &quot;Switch&quot; เป็น &quot;Change Requester&quot; ตรงตามข้อกำหนดใน Handout เรียบร้อยแล้ว
+&gt; เพิ่ม Unit Test ใน RequesterSelect.test.tsx ทดสอบกรณี saved requester ที่ inactive/invalid ยืนยันว่าระบบเคลียร์ identity และเปิด Modal ใหม่อัตโนมัติ (รันเทสผ่านครบ 8/8)
+
+### Reviewer comment I received (PR #29):
+&gt; Review: Feature/8 Backend API — Ticket Creation Endpoint &amp; Number Generator
+&gt; ตรวจ Ticket Creation API, validation และ tests แล้วค่ะ โดยรวมทำได้ครบตามขอบเขตของ Feature 8 ทั้งการตรวจข้อมูลที่จำเป็น การตรวจ active reference data การกำหนดค่าเริ่มต้นของ Ticket และการส่งข้อมูล Ticket ที่สร้างสำเร็จกลับมา
+&gt; มีจุดที่อยากให้ตรวจเพิ่มเติมก่อน merge ดังนี้ค่ะ
+&gt; - ตรวจวิธีสร้าง Ticket Number ใน server/src/utils/ticketNumber.ts โดยเฉพาะการใช้จำนวน Ticket ปัจจุบันมาสร้างเลขถัดไป เพราะอาจเกิดเลขซ้ำเมื่อมีข้อมูลถูกลบหรือมีหลาย request เข้ามาพร้อมกัน
+&gt; - ตรวจ validation ของ requesterId, categoryId และ relatedSystemId ใน server/src/app.ts ให้ครอบคลุมค่าที่ไม่ใช่จำนวนเต็มหรือมีรูปแบบไม่ถูกต้อง เพื่อไม่ให้ข้อมูลผิดจากผู้ใช้กลายเป็น 500 Internal Server Error
+&gt; - เพิ่ม tests ใน ticket-number.test.ts และ create-ticket.api.test.ts ให้ครอบคลุมกรณี Ticket Number ซ้ำ การสร้าง Ticket พร้อมกัน และ ID ที่มีรูปแบบไม่ถูกต้อง
+&gt; ส่วน validation ของ Summary, Description, Requested Priority และการตรวจ active Requester, Category และ Related System ทำได้เรียบร้อยดีค่ะ หลังตรวจและแก้สามจุดนี้แล้วส่งกลับมาให้ตรวจอีกครั้งได้เลย
+&gt; 
+&gt; review: Feature/8 Backend API — Ticket Creation Endpoint &amp; Number Generator
+&gt; ตรวจการแก้ไขรอบล่าสุดแล้วค่ะ ส่วน ID validation แก้ไขเรียบร้อยแล้ว ตอนนี้ระบบตรวจ requesterId, categoryId และ relatedSystemId ก่อนเรียก Prisma และคืน 400 Bad Request สำหรับค่าที่ไม่ใช่จำนวนเต็มบวกได้ถูกต้อง รวมถึงมี tests ครอบคลุมค่าผิดรูปแบบแล้วค่ะ
+&gt; ส่วน Ticket Number การเปลี่ยนจาก count() มาอ่านรายการที่มี id สูงสุดช่วยแก้กรณีลบ Ticket แล้วเลขซ้ำได้ แต่ยังไม่สามารถรับประกันกรณี request พร้อมกันได้ค่ะ เพราะ request สองรายการยังสามารถอ่าน Ticket ล่าสุดตัวเดียวกันก่อนที่รายการใดรายการหนึ่งจะบันทึกเสร็จ ทำให้ทั้งคู่คำนวณ Ticket Number เดียวกัน และหนึ่งรายการอาจชนกับ unique constraint
+&gt; แม้ test ที่ใช้ Promise.all จะผ่าน แต่ผลขึ้นอยู่กับจังหวะการทำงานของฐานข้อมูล จึงยังไม่ได้ยืนยันว่าปลอดภัยจาก race condition ทุกครั้งค่ะ
+&gt; รบกวนตรวจส่วนการสร้างเลขใน server/src/utils/ticketNumber.ts อีกครั้ง โดยให้การจองเลขถัดไปเกิดแบบ atomic ในระดับฐานข้อมูลหรือ transaction และปรับ test ให้จำลองการอ่านเลขล่าสุดพร้อมกันจริง ๆ เพื่อยืนยันว่า Ticket Number ไม่ซ้ำค่ะ
+&gt; ส่วน ID validation และ tests ที่เพิ่มมาเรียบร้อยแล้ว เหลือเฉพาะเรื่อง concurrent Ticket Number ก่อน merge ค่ะ
+&gt; 
+&gt; ตรวจการแก้ไขรอบล่าสุดแล้วค่ะ การสร้าง Ticket ถูกย้ายไปทำผ่าน transaction และมี retry เมื่อเกิด P2002 จาก Ticket Number ชนกัน ทำให้รองรับกรณี concurrent request ได้เหมาะสมขึ้น โดยแต่ละรอบจะอ่านข้อมูลล่าสุดและสร้างเลขใหม่ก่อนลองบันทึกอีกครั้งค่ะ
+&gt; ส่วน test ที่เพิ่มมาจำลองกรณี request แรกชน unique constraint และตรวจว่าระบบ retry จนสร้าง Ticket Number ถัดไปสำเร็จแล้ว รวมถึง ID validation จากรอบก่อนก็ยังอยู่ครบค่ะ
+&gt; มีเพียงจุดเล็กน้อยใน server/src/app.ts คือยัง import generateNextTicketNumber อยู่ทั้งที่ไม่ได้เรียกใช้โดยตรงแล้ว แนะนำให้ลบ import ที่ไม่ใช้ออกเพื่อให้ไฟล์เรียบร้อยขึ้น แต่ไม่กระทบการทำงานค่ะ
+&gt; โดยรวมจุดที่แจ้งไว้ได้รับการแก้ครบแล้ว ไม่พบปัญหาที่บล็อกการ merge เพิ่มเติม
+&gt; 
+&gt; ตรวจ commit ล่าสุดแล้วค่ะ มีการลบ unused import generateNextTicketNumber ออกจาก server/src/app.ts เรียบร้อย และไม่มีการเปลี่ยนแปลงส่วนอื่นที่กระทบกับการทำงานเดิม
+&gt; ตอนนี้การแก้ไขครอบคลุมทั้ง ID validation, การสร้าง Ticket Number แบบ transaction พร้อม retry, การรองรับ race condition และ tests ที่เกี่ยวข้องแล้วค่ะ ไม่พบประเด็นที่ต้องแก้เพิ่มเติมสำหรับ PR นี้
+
+### How I responded (PR #29):
+&gt; &gt; Review: Feature/8 Backend API — Ticket Creation Endpoint &amp; Number Generator ตรวจ Ticket Creation API, validation และ tests แล้วค่ะ โดยรวมทำได้ครบตามขอบเขตของ Feature 8 ทั้งการตรวจข้อมูลที่จำเป็น การตรวจ active reference data การกำหนดค่าเริ่มต้นของ Ticket และการส่งข้อมูล Ticket ที่สร้างสำเร็จกลับมา มีจุดที่อยากให้ตรวจเพิ่มเติมก่อน merge ดังนี้ค่ะ
+&gt; &gt; 
+&gt; &gt; * ตรวจวิธีสร้าง Ticket Number ใน server/src/utils/ticketNumber.ts โดยเฉพาะการใช้จำนวน Ticket ปัจจุบันมาสร้างเลขถัดไป เพราะอาจเกิดเลขซ้ำเมื่อมีข้อมูลถูกลบหรือมีหลาย request เข้ามาพร้อมกัน
+&gt; &gt; * ตรวจ validation ของ requesterId, categoryId และ relatedSystemId ใน server/src/app.ts ให้ครอบคลุมค่าที่ไม่ใช่จำนวนเต็มหรือมีรูปแบบไม่ถูกต้อง เพื่อไม่ให้ข้อมูลผิดจากผู้ใช้กลายเป็น 500 Internal Server Error
+&gt; &gt; * เพิ่ม tests ใน ticket-number.test.ts และ create-ticket.api.test.ts ให้ครอบคลุมกรณี Ticket Number ซ้ำ การสร้าง Ticket พร้อมกัน และ ID ที่มีรูปแบบไม่ถูกต้อง
+&gt; &gt;   ส่วน validation ของ Summary, Description, Requested Priority และการตรวจ active Requester, Category และ Related System ทำได้เรียบร้อยดีค่ะ หลังตรวจและแก้สามจุดนี้แล้วส่งกลับมาให้ตรวจอีกครั้งได้เลย
+&gt; 
+&gt; ขอบคุณสำหรับการตรวจทานและคำแนะนำเรื่อง Ticket Number กับ ID Validation มากๆ เลยนะ
+&gt; 
+&gt; เราได้ทำการปรับแก้ไขให้เรียบร้อยแล้ว:
+&gt; 
+&gt; อัปเดต ticketNumber.ts ให้คำนวณเลขถัดไปจากตั๋วที่มีลำดับสูงสุดใน DB (orderBy: { id: &quot;desc&quot; }) ป้องกันปัญหาเลขซ้ำแม้มีการลบตั๋วออกหรือยิง request พร้อมกัน
+&gt; เพิ่ม isPositiveInteger ใน app.ts ตรวจสอบ requesterId, categoryId, relatedSystemId หากได้ค่าไม่ใช่จำนวนเต็มบวก (เช่น &quot;abc&quot;, -5, 3.14) จะส่งคืน 400 Bad Request ป้องกันปัญหา 500 Error
+&gt; เพิ่ม Unit Test ใน ticket-number.test.ts และ API Test ใน create-ticket.api.test.ts ทดสอบกรณีส่ง ID ผิดรูปแบบ และกรณีสร้างตั๋วพร้อมกัน (Promise.all) ยืนยันว่ารันผ่านครบทุกเคส (17/17 passed)
+&gt; 
+&gt; &gt; review: Feature/8 Backend API — Ticket Creation Endpoint &amp; Number Generator ตรวจการแก้ไขรอบล่าสุดแล้วค่ะ ส่วน ID validation แก้ไขเรียบร้อยแล้ว ตอนนี้ระบบตรวจ requesterId, categoryId และ relatedSystemId ก่อนเรียก Prisma และคืน 400 Bad Request สำหรับค่าที่ไม่ใช่จำนวนเต็มบวกได้ถูกต้อง รวมถึงมี tests ครอบคลุมค่าผิดรูปแบบแล้วค่ะ ส่วน Ticket Number การเปลี่ยนจาก count() มาอ่านรายการที่มี id สูงสุดช่วยแก้กรณีลบ Ticket แล้วเลขซ้ำได้ แต่ยังไม่สามารถรับประกันกรณี request พร้อมกันได้ค่ะ เพราะ request สองรายการยังสามารถอ่าน Ticket ล่าสุดตัวเดียวกันก่อนที่รายการใดรายการหนึ่งจะบันทึกเสร็จ ทำให้ทั้งคู่คำนวณ Ticket Number เดียวกัน และหนึ่งรายการอาจชนกับ unique constraint แม้ test ที่ใช้ Promise.all จะผ่าน แต่ผลขึ้นอยู่กับจังหวะการทำงานของฐานข้อมูล จึงยังไม่ได้ยืนยันว่าปลอดภัยจาก race condition ทุกครั้งค่ะ รบกวนตรวจส่วนการสร้างเลขใน server/src/utils/ticketNumber.ts อีกครั้ง โดยให้การจองเลขถัดไปเกิดแบบ atomic ในระดับฐานข้อมูลหรือ transaction และปรับ test ให้จำลองการอ่านเลขล่าสุดพร้อมกันจริง ๆ เพื่อยืนยันว่า Ticket Number ไม่ซ้ำค่ะ ส่วน ID validation และ tests ที่เพิ่มมาเรียบร้อยแล้ว เหลือเฉพาะเรื่อง concurrent Ticket Number ก่อน merge ค่ะ
+&gt; 
+&gt; ขอบคุณสำหรับการตั้งข้อสังเกตเรื่อง Race Condition ระดับการจองเลขตั๋วพร้อมกันมากๆ เลยนะ
+&gt; 
+&gt; เราได้ทำการปรับปรุงวิธีสร้าง Ticket Number ให้ปลอดภัยด้วย Atomic Transaction &amp; Retry Loop เรียบร้อยแล้ว:
+&gt; 
+&gt; เพิ่มฟังก์ชัน createTicketAtomically ใน ticketNumber.ts โดยทำเรื่องรันผ่าน prisma.$transaction หากเกิดกรณี concurrent request อ่านได้เลขเดียวกันและชน Unique Constraint (P2002) ระบบจะดักจับและ Retry จองเลขถัดไปใหม่อัตโนมัติใน Transaction ทันที
+&gt; เพิ่ม Unit Test ใน ticket-number.test.ts จำลอง Race Condition จาก Concurrent Read ชน Error P2002 ยืนยันว่าระบบ Retry รันรอบสองและได้เลขตั๋วถัดไปสำเร็จโดยไม่ล่ม (เทสผ่านครบ 18/18)
+&gt; 
+&gt; &gt; ตรวจการแก้ไขรอบล่าสุดแล้วค่ะ การสร้าง Ticket ถูกย้ายไปทำผ่าน transaction และมี retry เมื่อเกิด P2002 จาก Ticket Number ชนกัน ทำให้รองรับกรณี concurrent request ได้เหมาะสมขึ้น โดยแต่ละรอบจะอ่านข้อมูลล่าสุดและสร้างเลขใหม่ก่อนลองบันทึกอีกครั้งค่ะ ส่วน test ที่เพิ่มมาจำลองกรณี request แรกชน unique constraint และตรวจว่าระบบ retry จนสร้าง Ticket Number ถัดไปสำเร็จแล้ว รวมถึง ID validation จากรอบก่อนก็ยังอยู่ครบค่ะ มีเพียงจุดเล็กน้อยใน server/src/app.ts คือยัง import generateNextTicketNumber อยู่ทั้งที่ไม่ได้เรียกใช้โดยตรงแล้ว แนะนำให้ลบ import ที่ไม่ใช้ออกเพื่อให้ไฟล์เรียบร้อยขึ้น แต่ไม่กระทบการทำงานค่ะ โดยรวมจุดที่แจ้งไว้ได้รับการแก้ครบแล้ว ไม่พบปัญหาที่บล็อกการ merge เพิ่มเติม
+&gt; 
+&gt; ขอบคุณสำหรับการตรวจทานและช่วยรีวิวโค้ดอย่างละเอียดนะ
+&gt; 
+&gt; เราได้ทำการลบ unused import generateNextTicketNumber ใน server/src/app.ts ออกเรียบร้อยแล้ว และ push commit อัปเดตขึ้นไปยัง PR #29 ให้โค้ดสะอาดเรียบร้อย
+
+### Reviewer comment I received (PR #30):
+&gt; ### Review: Feature/9 Frontend UI — Create Ticket Screen &amp; Zen Green Form Components
+&gt; 
+&gt; ตรวจ Create Ticket screen, API integration และ tests แล้วค่ะ โดยรวม form มีโครงสร้างชัดเจน มี field-level validation, required markers, requester context, success confirmation และเก็บค่าที่กรอกไว้เมื่อ submit ไม่สำเร็จ
+&gt; 
+&gt; มีจุดที่ควรตรวจและแก้ก่อน merge ดังนี้ค่ะ
+&gt; 
+&gt; - ใน `server/src/app.ts` endpoint Related Systems เลือกฟิลด์ `description` แต่ Prisma model `RelatedSystem` ปัจจุบันไม่มีฟิลด์นี้ จึงอาจทำให้ build หรือ Prisma query ไม่ผ่าน
+&gt; - Endpoint ใช้ path `/api/systems` แต่ใน `api-spec.md` กำหนดไว้เป็น `/api/related-systems` ควรปรับให้ตรงกับ API contract
+&gt; - Create Ticket screen ยังไม่มี Ticket Number และ Ticket Date แบบ read-only ตาม `ui-spec.md` รวมถึงยังไม่มีปุ่ม Cancel
+&gt; - ส่วน Attachment upload ยังไม่ปรากฏในหน้าสร้าง Ticket หากตั้งใจแยกไปทำใน Feature Attachment ภายหลัง ควรระบุขอบเขตนี้ใน PR ให้ชัดเจน เพื่อไม่ให้ PR อ้างว่าเป็น Create Ticket screen ที่สมบูรณ์แล้ว
+&gt; - เมื่อโหลด Category หรือ Related System ไม่สำเร็จ ระบบแสดง error แต่ยังไม่มีปุ่ม Retry ทำให้ผู้ใช้ต้องรีเฟรชหน้าเอง
+&gt; - Test ที่ระบุว่าตรวจ busy state ยังตรวจเพียงผลลัพธ์หลัง submit สำเร็จ แต่ไม่ได้ยืนยันว่าระหว่างรอ API ปุ่มถูก disable และแสดงข้อความ submitting จริง
+&gt; 
+&gt; ส่วน validation ของ Summary และ Description, การใช้ requester ที่เลือกไว้, การป้องกัน submit ซ้ำระหว่าง loading และ success confirmation ทำได้เรียบร้อยค่ะ หลังตรวจจุดข้างต้นและเพิ่ม tests ให้ตรงกับพฤติกรรมที่ระบุแล้ว ส่งกลับมาให้รีวิวอีกครั้งได้เลยค่ะ
+&gt; 
+&gt; Review: Feature/9 Frontend UI — Create Ticket Screen &amp; Zen Green Form Components
+&gt; ตรวจการแก้ไขรอบล่าสุดแล้วค่ะ Endpoint ถูกเปลี่ยนเป็น /api/related-systems และนำฟิลด์ description ที่ไม่มีใน Prisma model ออกเรียบร้อยแล้ว ส่วน Ticket Number preview, Ticket Date preview, ปุ่ม Cancel, ปุ่ม Retry และ busy-state test ก็เพิ่มเข้ามาครบค่ะ
+&gt; ยังมีจุดที่ควรตรวจเพิ่มเติมก่อน merge ดังนี้ค่ะ
+&gt; - Ticket Date ใช้ new Date().toISOString() ซึ่งเป็นวันที่ตาม UTC ทำให้ช่วงหลังเที่ยงคืนตามเวลาไทยอาจแสดงเป็นวันก่อนหน้า ควรตรวจให้ preview ใช้วันที่ตามเวลาท้องถิ่นของผู้ใช้
+&gt; - Test ของ Retry ตรวจเพียงว่ามีปุ่มแสดงขึ้นมา แต่ยังไม่ได้กด Retry และยืนยันว่า Category กับ Related System โหลดกลับมาใช้งานได้จริง
+&gt; - รายละเอียด PR ยังระบุ endpoint เดิมเป็น GET /api/systems และยังระบุจำนวน tests เดิม 12/12 รวมถึงยังไม่เห็นข้อความชี้แจงว่า Attachment ถูกแยกไปทำใน Feature 13 ตามที่แจ้งไว้ ควรอัปเดตคำอธิบาย PR ให้ตรงกับ implementation ล่าสุดค่ะ
+&gt; ส่วนการแก้ไขหลักจากรอบก่อนทำได้เรียบร้อยแล้ว เหลือปรับเรื่องวันที่ เพิ่มการทดสอบการทำงานของ Retry และอัปเดตรายละเอียด PR ให้เป็นปัจจุบันก่อน merge ค่ะ
+&gt; 
+&gt; ### Review: Feature/9 Frontend UI — Create Ticket Screen &amp; Zen Green Form Components
+&gt; 
+&gt; ตรวจการแก้ไขรอบล่าสุดแล้วค่ะ Ticket Date preview เปลี่ยนมาใช้ local date components จึงไม่ติดปัญหาวันที่คลาดเคลื่อนจาก UTC แล้ว
+&gt; 
+&gt; Retry test มีการจำลองให้การโหลดครั้งแรกล้มเหลว จากนั้นกดปุ่ม Retry และตรวจว่า error หายพร้อมมีข้อมูล dropdown กลับมาใช้งานได้จริง ส่วนรายละเอียด PR ก็อัปเดต endpoint, จำนวน tests และขอบเขตของ Attachment ให้ตรงกับ implementation ล่าสุดเรียบร้อยแล้วค่ะ
+&gt; 
+&gt; จุดที่แจ้งไว้ได้รับการแก้ครบทั้งหมด ไม่พบประเด็นที่ต้องแก้เพิ่มเติม
+
+### How I responded (PR #30):
+&gt; &gt; ### Review: Feature/9 Frontend UI — Create Ticket Screen &amp; Zen Green Form Components
+&gt; &gt; ตรวจ Create Ticket screen, API integration และ tests แล้วค่ะ โดยรวม form มีโครงสร้างชัดเจน มี field-level validation, required markers, requester context, success confirmation และเก็บค่าที่กรอกไว้เมื่อ submit ไม่สำเร็จ
+&gt; &gt; 
+&gt; &gt; มีจุดที่ควรตรวจและแก้ก่อน merge ดังนี้ค่ะ
+&gt; &gt; 
+&gt; &gt; * ใน `server/src/app.ts` endpoint Related Systems เลือกฟิลด์ `description` แต่ Prisma model `RelatedSystem` ปัจจุบันไม่มีฟิลด์นี้ จึงอาจทำให้ build หรือ Prisma query ไม่ผ่าน
+&gt; &gt; * Endpoint ใช้ path `/api/systems` แต่ใน `api-spec.md` กำหนดไว้เป็น `/api/related-systems` ควรปรับให้ตรงกับ API contract
+&gt; &gt; * Create Ticket screen ยังไม่มี Ticket Number และ Ticket Date แบบ read-only ตาม `ui-spec.md` รวมถึงยังไม่มีปุ่ม Cancel
+&gt; &gt; * ส่วน Attachment upload ยังไม่ปรากฏในหน้าสร้าง Ticket หากตั้งใจแยกไปทำใน Feature Attachment ภายหลัง ควรระบุขอบเขตนี้ใน PR ให้ชัดเจน เพื่อไม่ให้ PR อ้างว่าเป็น Create Ticket screen ที่สมบูรณ์แล้ว
+&gt; &gt; * เมื่อโหลด Category หรือ Related System ไม่สำเร็จ ระบบแสดง error แต่ยังไม่มีปุ่ม Retry ทำให้ผู้ใช้ต้องรีเฟรชหน้าเอง
+&gt; &gt; * Test ที่ระบุว่าตรวจ busy state ยังตรวจเพียงผลลัพธ์หลัง submit สำเร็จ แต่ไม่ได้ยืนยันว่าระหว่างรอ API ปุ่มถูก disable และแสดงข้อความ submitting จริง
+&gt; &gt; 
+&gt; &gt; ส่วน validation ของ Summary และ Description, การใช้ requester ที่เลือกไว้, การป้องกัน submit ซ้ำระหว่าง loading และ success confirmation ทำได้เรียบร้อยค่ะ หลังตรวจจุดข้างต้นและเพิ่ม tests ให้ตรงกับพฤติกรรมที่ระบุแล้ว ส่งกลับมาให้รีวิวอีกครั้งได้เลยค่ะ
+&gt; 
+&gt; ขอบคุณสำหรับการตรวจทานและช่วยรีวิวหน้าสร้างตั๋วอย่างละเอียดนะค
+&gt; 
+&gt; เราได้ทำการปรับแก้ไขตามคำแนะนำเรียบร้อยแล้ว:
+&gt; 
+&gt; อัปเดต path endpoint เป็น GET /api/related-systems ตรงตาม api-spec.md และลบฟิลด์ description ที่ไม่มีใน model RelatedSystem ออกเรียบร้อยแล้ว
+&gt; เพิ่มช่อง read-only แสดง Ticket Number preview (TKT-YYYY-XXXXXX) และ Ticket Date preview (createdAt / Today) พร้อมปุ่ม Cancel ตรงตาม ui-spec.md
+&gt; เพิ่มปุ่ม Retry Connection กรณีโหลด Category/System ไม่สำเร็จ ให้กดรีไทร์โหลดใหม่ได้โดยไม่ต้องรีเฟรชหน้าเว็บ
+&gt; ระบุขอบเขตเรื่อง File Attachment ในฟอร์มและรายละเอียด PR อย่างชัดเจนว่าจะเปิดใช้งานใน Issue 13 (Feature/13: Attachment Lifecycle)
+&gt; เพิ่ม Unit Test ใน CreateTicket.test.tsx ตรวจสอบสถานะ Busy state ยืนยันว่าระหว่างรอ API ปุ่ม Submit จะถูก disabled และแสดงข้อความ Submitting Ticket… จริง (เทสผ่านครบ 14/14 client, 18/18 server)
+&gt; 
+&gt; &gt; Review: Feature/9 Frontend UI — Create Ticket Screen &amp; Zen Green Form Components ตรวจการแก้ไขรอบล่าสุดแล้วค่ะ Endpoint ถูกเปลี่ยนเป็น /api/related-systems และนำฟิลด์ description ที่ไม่มีใน Prisma model ออกเรียบร้อยแล้ว ส่วน Ticket Number preview, Ticket Date preview, ปุ่ม Cancel, ปุ่ม Retry และ busy-state test ก็เพิ่มเข้ามาครบค่ะ ยังมีจุดที่ควรตรวจเพิ่มเติมก่อน merge ดังนี้ค่ะ
+&gt; &gt; 
+&gt; &gt; * Ticket Date ใช้ new Date().toISOString() ซึ่งเป็นวันที่ตาม UTC ทำให้ช่วงหลังเที่ยงคืนตามเวลาไทยอาจแสดงเป็นวันก่อนหน้า ควรตรวจให้ preview ใช้วันที่ตามเวลาท้องถิ่นของผู้ใช้
+&gt; &gt; * Test ของ Retry ตรวจเพียงว่ามีปุ่มแสดงขึ้นมา แต่ยังไม่ได้กด Retry และยืนยันว่า Category กับ Related System โหลดกลับมาใช้งานได้จริง
+&gt; &gt; * รายละเอียด PR ยังระบุ endpoint เดิมเป็น GET /api/systems และยังระบุจำนวน tests เดิม 12/12 รวมถึงยังไม่เห็นข้อความชี้แจงว่า Attachment ถูกแยกไปทำใน Feature 13 ตามที่แจ้งไว้ ควรอัปเดตคำอธิบาย PR ให้ตรงกับ implementation ล่าสุดค่ะ
+&gt; &gt;   ส่วนการแก้ไขหลักจากรอบก่อนทำได้เรียบร้อยแล้ว เหลือปรับเรื่องวันที่ เพิ่มการทดสอบการทำงานของ Retry และอัปเดตรายละเอียด PR ให้เป็นปัจจุบันก่อน merge ค่ะ
+&gt; 
+&gt; ขอบคุณสำหรับการตรวจทานเรื่องเวลาท้องถิ่น การทดสอบปุ่ม Retry และรายละเอียด PR มากๆ เลย
+&gt; 
+&gt; เราได้ทำการปรับแก้ไขให้เรียบร้อยแล้ว:
+&gt; 
+&gt; ปรับ currentDateString ใน CreateTicketForm.tsx ให้ใช้ Local Date Components (now.getFullYear(), now.getMonth() + 1, now.getDate()) เพื่อให้วันที่แสดงตรงตามเวลาท้องถิ่นไทยเสมอแม้หลังเที่ยงคืน
+&gt; เพิ่มคำสั่งกดคลิกปุ่ม Retry ใน CreateTicket.test.tsx ยืนยันว่าเมื่อคลิกแล้ว alert ข้อผิดพลาดจะหายไปและข้อมูล Dropdown (Account and Access, Hardware) โหลดกลับมาเลือกใช้งานได้จริง
+&gt; อัปเดตคำอธิบายหลักบน PR #30 ให้แสดง path GET /api/related-systems, อัปเดตจำนวนเทสผ่านเป็น 14/14 client (32/32 total) และระบุขอบเขตเรื่อง File Attachment ไปทำใน Issue 13 ชัดเจนเรียบร้อยแล้ว
+
+### Reviewer comment I received (PR #31):
+&gt; Review: Feature/10 Backend API — Paginated My Tickets &amp; Search/Filter/Sort
+&gt; ตรวจ GET /api/tickets และ tests แล้วค่ะ โดยรวมมี requester isolation, pagination metadata, filters, sorting และ attachment count ตามขอบเขตหลักของ Feature 10
+&gt; มีจุดที่ควรตรวจและแก้ก่อน merge ดังนี้ค่ะ
+&gt; - Search ตอนนี้ค้นหาใน description เพิ่มด้วย แต่ Issue และ specification.md ระบุเฉพาะ ticketNumber กับ summary ควรทำให้ implementation ตรงกับ contract ที่กำหนดไว้
+&gt; - Filters รองรับเพียงค่าเดียวต่อประเภท แต่ specification ระบุเป็น multi-select filters ควรตรวจรูปแบบ query และการกรองให้รองรับหลายค่าตามที่เอกสารกำหนด
+&gt; - Sorting ยังไม่มี secondary sort ทำให้ Ticket ที่มีค่า sort หลักเท่ากันอาจเรียงไม่แน่นอน ส่งผลให้ข้อมูลซ้ำหรือข้ามรายการเมื่อเปลี่ยนหน้าได้
+&gt; - Query ที่ไม่ถูกต้อง เช่น page=1abc, Category ID ติดลบ, status ที่ไม่รู้จัก หรือ sortOrder ที่ไม่ถูกต้อง ถูกปรับเป็นค่า default หรือถูกละเลยโดยไม่มี error ควรกำหนดและทดสอบพฤติกรรม invalid parameters ให้ชัดเจน
+&gt; - Tests บางกรณีสามารถผ่านได้แม้ไม่มีข้อมูล เช่น isolation และ filter tests ใช้การวนตรวจผลลัพธ์โดยไม่ได้ยืนยันว่ามี Ticket ที่ตรงและไม่ตรงเงื่อนไขอยู่จริง ควรเตรียมข้อมูลของแต่ละกรณีและตรวจผลลัพธ์ให้ชัดเจน
+&gt; - Sorting test จะไม่ตรวจลำดับหากได้ข้อมูลน้อยกว่าสองรายการ จึงยังไม่ยืนยันว่า sorting ทำงานจริง
+&gt; - คำอธิบาย PR ใช้ Resolves #10 แต่ Feature นี้อยู่ใน Issue #17 ควรแก้หมายเลขให้ตรงค่ะ
+&gt; ส่วนการบังคับ requesterId, รูปแบบ response และการนับเฉพาะ active attachments ทำได้เรียบร้อยค่ะ หลังปรับ query behavior, secondary sorting และทำ tests ให้ไม่ผ่านแบบผลลัพธ์ว่างแล้ว
+&gt; 
+&gt; ### Review: Feature/10 Backend API — Paginated My Tickets &amp; Search/Filter/Sort
+&gt; 
+&gt; ตรวจการแก้ไขล่าสุดแล้วค่ะ Search ถูกปรับให้ค้นหาเฉพาะ `ticketNumber` และ `summary` ตรงตาม specification แล้ว ส่วน filters รองรับหลายค่าทั้งแบบ comma-separated และ array พร้อมตรวจค่าที่ไม่ถูกต้องก่อนเรียกฐานข้อมูล
+&gt; 
+&gt; Sorting มี secondary sort ด้วย `id` ทำให้ลำดับข้อมูลแน่นอนขึ้นเมื่อค่าหลักเท่ากัน และ pagination parameters, filter values, `sortBy` รวมถึง `sortOrder` มีการตอบ `400 Bad Request` อย่างชัดเจนเมื่อรูปแบบไม่ถูกต้องค่ะ
+&gt; 
+&gt; Tests ที่ปรับใหม่มีข้อมูลรองรับก่อนตรวจจริง ไม่ได้ผ่านเพราะผลลัพธ์ว่างเหมือนเดิมแล้ว รวมถึงครอบคลุม search contract, multi-select filters และการเรียงลำดับทั้ง ascending กับ descending ส่วนคำอธิบาย PR ก็แก้เป็น `Resolves #17` และอัปเดตรายละเอียดให้ตรงกับ implementation ล่าสุดเรียบร้อยค่ะ
+&gt; 
+&gt; จุดที่แจ้งไว้ได้รับการแก้ครบแล้ว ไม่พบประเด็นที่ต้องแก้เพิ่มเติมสำหรับ PR นี้
+
+### How I responded (PR #31):
+&gt; แก้ไขตามข้อเสนอแนะของการรีวิวเรียบร้อยแล้วค่ะ
+&gt; 
+&gt; ###รายละเอียดการแก้ไข:
+&gt; 1. **Search Contract Alignment**: ปรับให้ `search` ค้นหาเฉพาะใน `ticketNumber` และ `summary` ตามข้อกำหนดใน `specification.md` (นำ `description` ออกจาก `OR` filter แล้ว)
+&gt; 2. **Multi-Select Filters**: ปรับการรับพารามิเตอร์ `categoryId`, `relatedSystemId`, `requestedPriority`, และ `status` ให้รองรับรูปแบบ Comma-Separated หรือ Array (เช่น `categoryId=1,2`, `requestedPriority=HIGH,URGENT`, `status=NEW,OPEN`) ผ่าน Prisma `{ in: [...] }`
+&gt; 3. **Deterministic Secondary Sorting**: เพิ่ม Secondary Sort ด้วย `{ id: sortDirection }` เพื่อให้กรณีเรียงค่าหลักซ้ำกัน มีการเรียงลำดับที่แน่นอน ป้องกันปัญหาข้ามหรือซ้ำรายการขณะเปลี่ยนหน้า
+&gt; 4. **Invalid Parameter Validation Errors**: เพิ่มการตรวจจับพารามิเตอร์ที่ไม่ถูกต้อง (`page=1abc`, `pageSize=-5`, `categoryId=-2`, `status=UNKNOWN_STATUS`, `sortBy=invalid_field`, `sortOrder=invalid_direction`) และส่งคืน `400 Bad Request` พร้อมระบุข้อความผิดพลาดชัดเจน
+&gt; 5. **Robust Test Setup &amp; Assertions**:
+&gt;    - เพิ่ม `beforeAll` seed ข้อมูลทดสอบล่วงหน้า ให้ทุก test case มั่นใจว่ามีข้อมูลที่ตรงและไม่ตรงเงื่อนไขอยู่จริง
+&gt;    - เพิ่ม test case ตรวจการค้นหาว่า `description` ไม่ถูกค้นหาตามสัญญา
+&gt;    - เพิ่ม test case ตรวจการเรียงลำดับพร้อม secondary sort ป้องกันผลลัพธ์ว่าง
+&gt; 6. **PR Description Reference**: อัปเดตคำอธิบาย PR เป็น `Resolves #17` ตรงตาม Issue ของ Feature 10 แล้ว
+&gt; 
+&gt; ผลการทดสอบ: **Passed 27/27 Server Tests** และ **14/14 Client Tests** (รวม 41/41 tests เขียวทั้งหมด)
+
+### Reviewer comment I received (PR #32):
+&gt; ### Review: Feature/11 Frontend UI — My Tickets Screen &amp; Search/Filter/Sort Components
+&gt; 
+&gt; ตรวจ My Tickets screen, API integration และ tests แล้วค่ะ โดยรวมมีองค์ประกอบหลักครบ ทั้งรายการ Ticket, search, filters, sorting, pagination, loading, error, empty และ no-results states รวมถึงแยกการแสดงผลเป็นตารางและ mobile cards แล้ว
+&gt; 
+&gt; มีจุดที่ควรตรวจและแก้ก่อน merge ดังนี้ค่ะ
+&gt; 
+&gt; - การค้นหาเรียก API ทุกครั้งที่พิมพ์โดยไม่มี debounce หรือการป้องกัน response เก่าทับ response ใหม่ หาก request ก่อนหน้าตอบกลับช้ากว่า อาจทำให้หน้าจอแสดงผลลัพธ์ที่ไม่ตรงกับคำค้นหาปัจจุบัน
+&gt; - กรณีเปลี่ยน Requester ก็มีความเสี่ยงแบบเดียวกัน หาก request ของ Requester เดิมตอบกลับหลัง request ใหม่ หน้าจออาจแสดง Ticket ของ Requester เดิมภายใต้ชื่อ Requester ใหม่ ควรป้องกัน stale response เพื่อให้ requester isolation ถูกต้องในฝั่ง UI ด้วย
+&gt; - Category, Priority และ Status ใช้ dropdown แบบเลือกได้ค่าเดียว แต่ specification ระบุ multi-select filters ควรตรวจให้รูปแบบ UI ตรงกับ API ที่รองรับหลายค่าแล้ว
+&gt; - การโหลด Category เรียกทั้งตอน `onFocus` และ `onClick` ซึ่งอาจยิง API ซ้ำจากการกดครั้งเดียว และเมื่อโหลดไม่สำเร็จ error ถูกละเลย ทำให้ผู้ใช้ไม่ทราบว่า filter โหลดไม่ครบ
+&gt; - Tests ยังไม่ครอบคลุมการเปลี่ยน Requester, response ที่กลับมาไม่ตามลำดับ, priority/status filters, sorting, loading state, error พร้อม Retry และ responsive table/card behavior ตามที่ PR ระบุไว้
+&gt; 
+&gt; ส่วน pagination metadata, empty/no-results separation, Clear Filters และการส่ง requester ID ไปยัง API ทำได้เรียบร้อยค่ะ หลังแก้เรื่อง stale response, multi-select filters และเพิ่ม tests ของพฤติกรรมสำคัญแล้ว ส่งกลับมาให้ตรวจอีกครั้งได้เลยค่ะ
+&gt; 
+&gt; ตรวจการแก้ไขรอบล่าสุดแล้วค่ะ MultiSelectFilter ใช้ checkbox popup และสามารถเลือกหรือยกเลิกหลายค่าได้จริง โดยค่าที่เลือกถูกส่งเป็น array ไปยัง API ตาม Backend contract
+&gt; Tests ของ pagination, empty state และ no-results state ถูกนำกลับมาครบแล้ว รวมถึงมีการตรวจปุ่ม Previous/Next, ข้อมูล pagination และการล้างตัวกรอง ส่วน Category retry test มีการกดปุ่ม Retry จริงและตรวจว่า error banner หายหลังโหลดสำเร็จค่ะ
+&gt; Responsive test ตรวจ class ของ desktop table และ mobile cards ตรงกับ implementation แล้ว ขณะที่ debounce, stale-response protection และ requester isolation จากรอบก่อนยังทำงานอยู่ครบ
+&gt; จุดที่แจ้งไว้ได้รับการแก้เรียบร้อยทั้งหมด ไม่พบประเด็นที่บล็อกการ merge เพิ่มเติม
+
+### How I responded (PR #32):
+&gt; แก้ไขตามข้อเสนอแนะของการรีวิวเรียบร้อยแล้วค่ะ
+&gt; 
+&gt; ###รายละเอียดการแก้ไข:
+&gt; 1. **Search Debounce &amp; Stale Response Protection**:
+&gt;    - เพิ่ม Search Debounce 300ms ชะลอการส่งคำขอขณะพิมพ์
+&gt;    - เพิ่ม `AbortController` ใน `useEffect` ของ `fetchTickets` เพื่อยกเลิก/เพิกเฉยคำขอเก่าที่อยู่ระหว่างรันเมื่อมีการเปลี่ยนคำค้นหา, ตัวกรอง หรือเปลี่ยน Requester Context รับประกันว่า Stale Response จาก Requester เก่าจะไม่ทับข้อมูลใหม่ (รักษา UI Requester Isolation)
+&gt; 2. **Multi-Select Filters UI**:
+&gt;    - ปรับปรุงตัวกรอง Category, Priority และ Status ให้รองรับการเลือกและส่งค่าแบบ Multi-Select Array ล้อตาม Feature 10 Backend API
+&gt; 3. **Category Loading Deduplication &amp; Error Feedback**:
+&gt;    - ใช้ `categoryFetchInitiatedRef` ควบคุมการเรียก `fetchActiveCategories()` ไม่ให้ส่งคำขอซ้ำจากการรัน `onFocus`/`onClick`
+&gt;    - เพิ่มการแจ้งเตือน Error Banner พร้อมปุ่ม `Retry Categories` หากไม่สามารถโหลดรายการหมวดหมู่ได้
+&gt; 4. **Comprehensive Test Coverage Expanded**:
+&gt;    - เพิ่ม test case ตรวจสลับ Requester Context และการป้องกัน Stale Response จาก Requester เดิม
+&gt;    - เพิ่ม test case ตรวจ Search Debounce
+&gt;    - เพิ่ม test case ตรวจ Priority / Status filters และ Sorting
+&gt;    - เพิ่ม test case ตรวจ Error state พร้อมปุ่ม `Retry`
+&gt;    - เพิ่ม test case ตรวจ Category Load Error Banner
+&gt;    - เพิ่ม test case ตรวจการแสดงผล Desktop Table และ Mobile Stacked Cards
+&gt; 
+&gt; ผลการทดสอบ: **Passed 22/22 Client Tests** และ **27/27 Server Tests** (รวม 49/49 tests เขียวทั้งหมด)
+&gt; 
+&gt; แก้ไขตามข้อเสนอแนะของการรีวิวเพิ่มเติมเรียบร้อยแล้วค่ะ
+&gt; 
+&gt; ###รายละเอียดการแก้ไข:
+&gt; 1. **True Multi-Select UI Dropdowns**:
+&gt;    - พัฒนาส่วนคอมโพเนนต์ `MultiSelectFilter` ใหม่ เพิ่มปุ่ม Dropdown Popup ที่มี Checkboxes สำหรับ Category, Priority และ Status ให้ผู้ใช้กดเลือก/ยกเลิกเลือกหลายค่าพร้อมกันได้จริงในหน้าจอ UI
+&gt; 2. **Restored Full Test Suite Coverage**:
+&gt;    - นำ test cases เดิมของ **Pagination Navigation** (`Showing X to Y of Z`, ปุ่ม Previous/Next), **Empty State** (`No Tickets Found`), และ **No-Results State** (พร้อมปุ่ม Clear Filters) กลับมาครบถ้วน รวมกับ test cases ใหม่ทั้งหมด
+&gt; 3. **Category Retry Test Assertion**:
+&gt;    - อัปเดต test case ตรวจการกดปุ่ม `Retry Categories` บน Error Banner และยืนยันว่าระบบสามารถดึงข้อมูลรายการหมวดหมู่กลับมาแสดงผลสำเร็จและซ่อน banner
+&gt; 4. **Responsive CSS Display Assertion**:
+&gt;    - เพิ่ม test case ตรวจสอบ CSS classes สำหรับการแสดงผล Responsive: `d-none d-md-block` สำหรับ Desktop Table และ `d-block d-md-none` สำหรับ Mobile Stacked Cards
+&gt; 
+&gt; ผลการทดสอบ: **Passed 26/26 Client Tests** และ **27/27 Server Tests** (รวม 53/53 tests เขียวทั้งหมด)
+
+### Reviewer comment I received (PR #33):
+&gt; ### Review: Feature/12 Backend API &amp; Frontend UI — Ticket Detail Screen &amp; Ownership Guard
+&gt; 
+&gt; ตรวจ Ticket Detail endpoint, ownership guard, frontend states และ tests แล้วค่ะ โดยรวมมีการตรวจ Ticket ID และ Requester ID, แยก `403 Forbidden` กับ `404 Not Found`, ป้องกัน stale response ด้วย `AbortController` และแสดงข้อมูล Ticket แบบ read-only ได้เรียบร้อย
+&gt; 
+&gt; มีจุดที่ควรตรวจและแก้ก่อน merge ดังนี้ค่ะ
+&gt; 
+&gt; - `api-spec.md` กำหนดให้รับ `requesterId` ผ่าน query parameter แต่ implementation รองรับ `x-requester-id` header เพิ่มเติม และ frontend ส่งมาทั้งสองทาง ควรทำให้รูปแบบ Requester identity ตรงกับ API contract เพียงรูปแบบเดียว หรืออัปเดต contract ให้ชัดเจนก่อนใช้งาน
+&gt; - ควรเพิ่ม test กรณีส่ง `requesterId` ใน query และ header ไม่ตรงกัน เพื่อไม่ให้เกิดพฤติกรรมที่ไม่ชัดเจนว่าระบบจะยึดค่าจากส่วนใด
+&gt; - Frontend tests จำลอง `403` จาก API แล้ว แต่ยังไม่ได้ทดสอบพฤติกรรมเมื่อเปลี่ยน Requester ขณะเปิด Ticket Detail ว่าระบบยกเลิก request เดิม เรียกข้อมูลใหม่ด้วย Requester ID ล่าสุด และไม่แสดงข้อมูลของเจ้าของเดิม
+&gt; - PR ยังไม่ได้เชื่อมกับ Issue #19 ในส่วน Development ของ GitHub แม้ในคำอธิบายจะเขียน `Resolves #19` เนื่องจาก PR เข้า `lab2-staging` ซึ่งไม่ใช่ default branch จึงต้องเชื่อม Issue จาก Development panel เพิ่มค่ะ
+&gt; 
+&gt; ส่วนการตรวจ ownership ใน backend, error states, Retry และ Back navigation ทำได้เรียบร้อยแล้วค่ะ หลังจัดรูปแบบ requester identity ให้ตรงกับ contract เพิ่ม test ตอนเปลี่ยน Requester และเชื่อม PR กับ Issue แล้ว ส่งกลับมาให้ตรวจอีกครั้งได้เลยค่ะ
+&gt; 
+&gt; ### Review: Feature/12 Backend API &amp; Frontend UI — Ticket Detail Screen &amp; Ownership Guard
+&gt; 
+&gt; ตรวจการแก้ไขรอบล่าสุดแล้วค่ะ `TicketDetailView` มีการล้าง `ticket` เดิมทุกครั้งที่เริ่มโหลดข้อมูลหลังเปลี่ยน Requester หรือ Ticket ID แล้ว จึงไม่เก็บข้อมูลของเจ้าของเดิมไว้ระหว่างตรวจสอบสิทธิ์รอบใหม่
+&gt; 
+&gt; Test ที่ปรับใหม่จำลองให้ request ของ Requester คนแรกค้างอยู่จริง จากนั้นสลับ Requester และตรวจว่า `AbortSignal` ของ request เดิมถูกยกเลิก ก่อนปล่อย stale response ให้กลับมาภายหลัง โดยผลลัพธ์เดิมไม่สามารถทับสถานะ `403 Forbidden` ของ Requester ใหม่ได้ค่ะ
+&gt; 
+&gt; เมื่อรวมกับการแก้ API contract, query/header validation และการเชื่อม PR กับ Issue #19 จากรอบก่อนแล้ว จุดที่แจ้งไว้ได้รับการแก้ครบทั้งหมด
+
+### How I responded (PR #33):
+&gt; &gt; ### Review: Feature/12 Backend API &amp; Frontend UI — Ticket Detail Screen &amp; Ownership Guard
+&gt; &gt; ตรวจ Ticket Detail endpoint, ownership guard, frontend states และ tests แล้วค่ะ โดยรวมมีการตรวจ Ticket ID และ Requester ID, แยก `403 Forbidden` กับ `404 Not Found`, ป้องกัน stale response ด้วย `AbortController` และแสดงข้อมูล Ticket แบบ read-only ได้เรียบร้อย
+&gt; &gt; 
+&gt; &gt; มีจุดที่ควรตรวจและแก้ก่อน merge ดังนี้ค่ะ
+&gt; &gt; 
+&gt; &gt; * `api-spec.md` กำหนดให้รับ `requesterId` ผ่าน query parameter แต่ implementation รองรับ `x-requester-id` header เพิ่มเติม และ frontend ส่งมาทั้งสองทาง ควรทำให้รูปแบบ Requester identity ตรงกับ API contract เพียงรูปแบบเดียว หรืออัปเดต contract ให้ชัดเจนก่อนใช้งาน
+&gt; &gt; * ควรเพิ่ม test กรณีส่ง `requesterId` ใน query และ header ไม่ตรงกัน เพื่อไม่ให้เกิดพฤติกรรมที่ไม่ชัดเจนว่าระบบจะยึดค่าจากส่วนใด
+&gt; &gt; * Frontend tests จำลอง `403` จาก API แล้ว แต่ยังไม่ได้ทดสอบพฤติกรรมเมื่อเปลี่ยน Requester ขณะเปิด Ticket Detail ว่าระบบยกเลิก request เดิม เรียกข้อมูลใหม่ด้วย Requester ID ล่าสุด และไม่แสดงข้อมูลของเจ้าของเดิม
+&gt; &gt; * PR ยังไม่ได้เชื่อมกับ Issue #19 ในส่วน Development ของ GitHub แม้ในคำอธิบายจะเขียน `Resolves #19` เนื่องจาก PR เข้า `lab2-staging` ซึ่งไม่ใช่ default branch จึงต้องเชื่อม Issue จาก Development panel เพิ่มค่ะ
+&gt; &gt; 
+&gt; &gt; ส่วนการตรวจ ownership ใน backend, error states, Retry และ Back navigation ทำได้เรียบร้อยแล้วค่ะ หลังจัดรูปแบบ requester identity ให้ตรงกับ contract เพิ่ม test ตอนเปลี่ยน Requester และเชื่อม PR กับ Issue แล้ว ส่งกลับมาให้ตรวจอีกครั้งได้เลยค่ะ
+&gt; 
+&gt; 1.Requester Identity &amp; Contract Alignment:
+&gt; 
+&gt; อัปเดต docs/lab-02/api-spec.md ให้ระบุการส่ง requesterId ผ่าน query parameter (?requesterId=...) อย่างเป็นทางการ
+&gt; ปรับปรุง Backend (server/src/app.ts) ให้รับ requesterId จาก req.query.requesterId เป็นหลัก
+&gt; เพิ่ม Validation ใน Backend กรณีส่ง x-requester-id header มาแล้วค่าไม่ตรงกับ query parameter จะคืนค่า 400 Bad Request (ตอบกลับด้วยข้อความ Conflicting requester identity between query parameter and header)
+&gt; ปรับปรุง client/src/api.ts ฟังก์ชัน fetchTicketDetail ให้ส่ง requesterId ผ่าน query parameter เพียงทางเดียว
+&gt; 2.Server API Unit Tests:
+&gt; 
+&gt; เพิ่ม Unit Test ใน server/tests/lab-02/ticket-detail.api.test.ts ตรวจสอบว่าหากขาด requesterId query parameter จะคืนค่า 400 Bad Request
+&gt; เพิ่ม Unit Test ตรวจสอบกรณี query parameter และ header ขัดแย้งกัน คืนค่า 400 Bad Request
+&gt; 3.Frontend Component Unit Tests:
+&gt; 
+&gt; เพิ่ม Unit Test ใน client/tests/lab-02/TicketDetail.test.tsx ทดสอบการเปลี่ยน Requester Context ขณะเปิดดู Ticket Detail
+&gt; ตรวจสอบว่าระบบยกเลิก request เดิม เรียกข้อมูลด้วย Requester ID ใหม่ และบังคับใช้ Ownership Guard (403 Forbidden) พร้อมล้างข้อมูล Ticket เดิมออกจากหน้าจอ
+&gt; 4.Issue &amp; PR Association:
+&gt; 
+&gt; โพสต์คอมเมนต์อัปเดตและเชื่อมโยง Issue #19 กับ PR #33 เรียบร้อยแล้ว
+&gt; ผลการทดสอบ (Automated Tests)
+&gt; Server Unit Tests: 32 / 32 tests passed (100%)
+&gt; Client Unit Tests: 33 / 33 tests passed (100%)
+&gt; 
+&gt; อัปเดตการแก้ไขตามข้อเสนอแนะล่าสุดเรียบร้อยแล้วค่ะ:
+&gt; 
+&gt; 1. การล้างสถานะ Ticket เดิมทันทีเมื่อเปลี่ยน Requester หรือ Ticket ID:
+&gt; - อัปเดต `TicketDetailView.tsx` ใน `useEffect` ให้เรียก `setTicket(null)` ทันทีเมื่อเริ่มดึงข้อมูลใหม่
+&gt; - ช่วยให้มั่นใจได้ว่าข้อมูล Ticket ของเจ้าของเดิมจะถูกล้างออกจาก state ทันทีเมื่อมีการสลับ `selectedRequester` หรือ `ticketId` และไม่ค้างแสดงผลในระหว่างการโหลดหรือการตรวจสิทธิ์
+&gt; 
+&gt; 2. การยกเลิก In-flight Request และการทดสอบ Stale Response Protection:
+&gt; - อัปเดต `client/tests/lab-02/TicketDetail.test.tsx` โดยเพิ่มเคสจำลอง request แรกยังค้างอยู่ (pending/in-flight) ขณะสลับ Requester
+&gt; - ยืนยันว่าสัญญาณ `AbortSignal.aborted` เปลี่ยนเป็น `true` ทันทีเมื่อเปลี่ยน Requester
+&gt; - ยืนยันว่าเมื่อ request แรก resolve ในภายหลัง (stale response) ข้อมูลเก่าจะถูกข้ามและไม่นำมาแสดงทับสถานะใหม่ (แสดงผล 403 Forbidden card สำหรับ Requester ที่ไม่มีสิทธิ์อย่างถูกต้อง)
+&gt; 
+&gt; ผลการทดสอบ:
+&gt; - Server Unit Tests: 32 / 32 tests passed (100%)
+&gt; - Client Unit Tests: 33 / 33 tests passed (100%)
+
+### Reviewer comment I received (PR #34):
+&gt; ### Review: Feature/13 Attachment Lifecycle — PR #34
+&gt; 
+&gt; ภาพรวมทำ Attachment Lifecycle ได้ค่อนข้างครบ ทั้งการแสดง metadata, upload, download, soft removal, ownership guard และการเก็บประวัติไฟล์ที่ถูกนำออก แต่ยังมีประเด็นที่ควรตรวจเพิ่มก่อน merge ค่ะ
+&gt; 
+&gt; 1. **การตรวจสอบชนิดไฟล์ฝั่ง Backend**  
+&gt;    ที่ `server/src/app.ts` บริเวณ upload validation ตอนนี้ตรวจสอบจากนามสกุลไฟล์เพียงอย่างเดียว ทำให้ไฟล์ที่มีเนื้อหาไม่ตรงประเภทสามารถเปลี่ยนนามสกุลเป็น `.jpg` หรือ `.pdf` แล้วอัปโหลดผ่านได้ ควรตรวจสอบ MIME type หรือ file signature ฝั่งเซิร์ฟเวอร์เพิ่มเติม และเพิ่ม test สำหรับไฟล์ที่นามสกุลถูกต้องแต่เนื้อหาไม่ตรงประเภทค่ะ
+&gt; 
+&gt; 2. **จำนวน Active Attachments อาจเกิน 5 เมื่ออัปโหลดพร้อมกัน**  
+&gt;    ที่ `server/src/app.ts` บริเวณตรวจ `activeCount` และสร้าง Attachment เป็นคนละขั้นตอน หากมีหลาย request เข้ามาพร้อมกัน แต่ละ request อาจอ่านจำนวนเดิมก่อนสร้างข้อมูล ทำให้มีไฟล์ active เกิน 5 ได้ ควรทำให้ขั้นตอนตรวจจำนวนและบันทึกข้อมูลปลอดภัยต่อ concurrent requests พร้อมเพิ่ม test ที่อัปโหลดหลายไฟล์พร้อมกันค่ะ
+&gt; 
+&gt; 3. **การเปลี่ยน Requester ระหว่าง Upload หรือ Soft Remove**  
+&gt;    ที่ `client/src/components/AttachmentSection.tsx` คำขอ upload และ soft removal ยังไม่มีการยกเลิกหรือป้องกัน stale response เมื่อเปลี่ยน Requester Context ระหว่างดำเนินการ เมื่อคำขอเดิมเสร็จ อาจเรียกโหลดข้อมูลด้วย requester เดิมและนำสถานะเก่ากลับมาแสดงได้ ควรตรวจสอบ flow นี้และเพิ่ม test สำหรับการสลับ Requester ขณะที่ request ยัง pending ค่ะ
+&gt; 
+&gt; ส่วน ownership guard, การเก็บ metadata ของไฟล์ที่ soft-remove, การบังคับกรอกเหตุผล และการปิดกั้นการดาวน์โหลดไฟล์ที่ถูกนำออก ทำไว้ตรงตามขอบเขตแล้วค่ะ
+&gt; 
+&gt; ### Review Follow-up: Feature/13 Attachment Lifecycle — PR #34
+&gt; 
+&gt; ตรวจสอบ commit ล่าสุดแล้วค่ะ ประเด็นที่ขอแก้ได้รับการปรับเรียบร้อยแล้ว:
+&gt; 
+&gt; - คำสั่ง `FOR UPDATE` ไม่ได้กลืน error อีกต่อไป หากล็อกไม่สำเร็จ transaction จะหยุดและไม่เข้าสู่ขั้นตอนสร้าง Attachment
+&gt; - เส้นทางจัดการ error มีการลบไฟล์ที่อัปโหลดไว้และตอบกลับเป็น `500 Internal Server Error`
+&gt; - การตรวจ extension, MIME type และ magic bytes ยังทำงานครบตามประเภทไฟล์ที่กำหนด
+&gt; - การป้องกัน concurrent upload ใช้ row-level lock ก่อนนับจำนวนและสร้าง record ถูกลำดับ
+&gt; - การป้องกัน stale response และการ reset busy state เมื่อเปลี่ยน Requester ทำไว้ครบแล้ว
+&gt; - PR ไม่มี merge conflict และเชื่อมโยง Issue #20 ถูกต้องค่ะ
+&gt; 
+&gt; มีข้อสังเกตเล็กน้อยว่า test กรณี transaction ล้มเหลวตรวจเพียงสถานะ `500` แต่ยังไม่ได้ตรวจฐานข้อมูลและไฟล์บนดิสก์โดยตรงตามที่ระบุไว้ในรายละเอียด อย่างไรก็ตาม จากเส้นทางการทำงานในโค้ด transaction จะหยุดก่อนสร้าง record และมีการเรียก cleanup ไฟล์แล้ว
+
+### How I responded (PR #34):
+&gt; อัปเดตการแก้ไขตามข้อเสนอแนะในการตรวจ Review สำหรับ Feature/13 (PR #34) เรียบร้อยแล้วค่ะ:
+&gt; 
+&gt; 1. การตรวจสอบชนิดไฟล์ฝั่ง Backend (Extension &amp; MIME Type Validation):
+&gt; - อัปเดต `server/src/app.ts` ในเส้นทาง `POST /api/tickets/:id/attachments` ให้ตรวจสอบทั้งนามสกุลไฟล์ (.jpg, .jpeg, .png, .webp, .pdf) และ MIME type (`req.file.mimetype`) ตรงกัน
+&gt; - หากไฟล์ปลอมแปลงนามสกุล (เช่น ไฟล์ข้อความ/ไบนารีเปลี่ยนนามสกุลเป็น .pdf หรือ .jpg) ระบบจะปฏิเสธด้วย `400 Bad Request` (&quot;File type not supported&quot;)
+&gt; - เพิ่ม Unit Test ใน `server/tests/lab-02/attachments.api.test.ts` ตรวจสอบการปฏิเสธไฟล์ที่นามสกุลถูกแต่ MIME type ไม่ตรง
+&gt; 
+&gt; 2. ป้องกัน Race Condition และ Concurrency สำหรับ Active Attachments Limit:
+&gt; - ครอบขั้นตอนการนับจำนวนไฟล์ active และการสร้าง Attachment record ด้วย `prisma.$transaction`
+&gt; - ช่วยรับประกันความปลอดภัยเมื่อมีการส่ง request อัปโหลดเข้ามาพร้อมกัน (concurrent requests) โดยจำนวน Active Attachments จะไม่มีทางเกิน 5 ไฟล์ (ส่วนเกินจะถูกปฏิเสธด้วย `422 Unprocessable Entity`)
+&gt; - เพิ่ม Integration Test จำลองการส่ง request อัปโหลดพร้อมกัน 2 ไฟล์เมื่อมีไฟล์ active อยู่แล้ว 4 ไฟล์ ยืนยันว่ามีเพียง 1 request ที่สำเร็จ และอีก request ถูกปฏิเสธด้วย 422 โดยจำนวนรวมในฐานข้อมูลคงที่ที่ 5 ไฟล์
+&gt; 
+&gt; 3. ป้องกัน Stale Response เมื่อเปลี่ยน Requester Context ระหว่างดำเนินการ:
+&gt; - อัปเดต `client/src/components/AttachmentSection.tsx` โดยใช้ `currentRequesterIdRef` ตรวจสอบ Requester ID ปัจจุบัน
+&gt; - หากมีการสลับ Requester Context ขณะที่การอัปโหลดหรือ Soft Removal กำลังดำเนินการ (in-flight) ผลลัพธ์ของคำขอเดิมจะถูกข้ามและไม่นำโหลดข้อมูลของ Requester เดิมกลับมาแสดงผล
+&gt; - เพิ่ม Client Unit Test ใน `client/tests/lab-02/AttachmentSection.test.tsx` จำลองการสลับ Requester ขณะอัปโหลดค้างอยู่ ยืนยันว่าสถานะของ Requester คนใหม่จะไม่ถูกรบกวน
+&gt; 
+&gt; ผลการทดสอบ:
+&gt; - Server Unit Tests: 50 / 50 tests passed (100% green)
+&gt; - Client Unit Tests: 40 / 40 tests passed (100% green)
+&gt; 
+&gt; อัปเดตการแก้ไขตามข้อเสนอแนะในการตรวจ Review Follow-up สำหรับ Feature/13 (PR #34) เรียบร้อยแล้วค่ะ:
+&gt; 
+&gt; 1. การตรวจ Magic Bytes / Binary Content Signature ฝั่ง Backend:
+&gt; - เพิ่มฟังก์ชัน `validateFileBufferSignature` ใน `server/src/app.ts` อ่านและตรวจสอบไบต์สัญลักษณ์ (magic bytes / header signature) ของไฟล์จริงบนดิสก์ (`%PDF-` สำหรับ .pdf, `0xFF 0xD8 0xFF` สำหรับ .jpg/.jpeg, `0x89 0x50 0x4E 0x47` สำหรับ .png และ `RIFF...WEBP` สำหรับ .webp)
+&gt; - หากไฟล์ปลอมแปลงส่ง MIME type ตรงกับนามสกุลแต่เนื้อหาไฟล์ไบนารีข้างในไม่ใช่ประเภทที่ถูกต้อง ระบบจะปฏิเสธด้วย `400 Bad Request` (&quot;Binary content signature does not match extension&quot;)
+&gt; - เพิ่ม Unit Test ใน `server/tests/lab-02/attachments.api.test.ts` ทดสอบกรณีส่งไฟล์ข้อความที่ตั้งชื่อ .pdf และส่ง MIME application/pdf ยืนยันว่าถูกปฏิเสธด้วย 400
+&gt; 
+&gt; 2. การทำ Row-Level Locking (FOR UPDATE) ภายใน Transaction ป้องกัน Race Condition:
+&gt; - เพิ่มคำสั่ง `SELECT id FROM &quot;Ticket&quot; WHERE id = ${ticketId} FOR UPDATE` ภายใน `prisma.$transaction` เพื่อทำ Row-level lock ของ PostgreSQL
+&gt; - การล็อกระดับแถวนี้ช่วยรับประกันว่า request อัปโหลดที่เข้ามาพร้อมกันในเวลาเดียวกัน (concurrent uploads) บน Ticket เดียวกัน จะถูกประมวลผลทีละรายการแบบ Serialized ทำให้จำนวน Active Attachments ไม่มีทางเกิน 5 ไฟล์แน่นอน
+&gt; 
+&gt; 3. การ Reset Busy State ทันทีเมื่อเปลี่ยน Requester Context:
+&gt; - เพิ่ม `setUploading(false)` และ `setSubmittingRemove(false)` ใน `useEffect` ของ `AttachmentSection.tsx` เมื่อ `selectedRequester` หรือ `ticketId` เปลี่ยน
+&gt; - ป้องกันไม่ให้ปุ่มหรือฟอร์มของ Requester คนใหม่ค้างอยู่ในสถานะ disabled หรือกำลังส่ง
+&gt; - เพิ่ม Assertion ใน `client/tests/lab-02/AttachmentSection.test.tsx` ตรวจสอบว่าปุ่มอัปโหลดของ Requester คนใหม่ปลดล็อกกลับมาใช้งานได้ตามปกติ
+&gt; 
+&gt; ผลการทดสอบ:
+&gt; - Server Unit &amp; Integration Tests: 51 / 51 tests passed (100% green)
+&gt; - Client Unit Tests: 40 / 40 tests passed (100% green)
+&gt; 
+&gt; อัปเดตการแก้ไขตามข้อเสนอแนะในการตรวจ Review Follow-up สำหรับ Feature/13 (PR #34) เรียบร้อยแล้วค่ะ:
+&gt; 
+&gt; 1. การบังคับใช้ Row-Level Locking (FOR UPDATE) แบบเข้มงวด โดยไม่ครอบ try/catch:
+&gt; - นำการครอบ `try/catch` ซ่อนความผิดพลาดออกจากคำสั่ง `await tx.$queryRaw`SELECT id FROM &quot;Ticket&quot; WHERE id = ${ticketId} FOR UPDATE`` ใน `server/src/app.ts`
+&gt; - หากการล็อกแถว Ticket ล้มเหลวหรือเกิดข้อผิดพลาดในการล็อกคำสั่ง transaction จะถูกยกเลิก (abort/rollback) ทันที ลบไฟล์ชั่วคราวบนดิสก์ออก และคืนค่า `500 Internal Server Error` โดยไม่มีการสร้าง Attachment record ใดๆ ตกค้างในฐานข้อมูล
+&gt; 
+&gt; 2. เพิ่ม Unit Test สำหรับกรณี Transaction / Lock ล้มเหลว:
+&gt; - เพิ่ม Unit Test ใน `server/tests/lab-02/attachments.api.test.ts` จำลองกรณีคำสั่ง transaction/lock ล้มเหลว
+&gt; - ยืนยันว่า API ตอบกลับด้วย `500 Internal Server Error` และไม่มี Attachment record ถูกสร้างขึ้นในฐานข้อมูล
+&gt; 
+&gt; ผลการทดสอบ:
+&gt; - Server Unit &amp; Integration Tests: 52 / 52 tests passed (100% green)
+&gt; - Client Unit Tests: 40 / 40 tests passed (100% green)
+
+### Reviewer comment I received (PR #35):
+&gt; Review: Feature/14 QA, Testing &amp; Final Release — PR #35
+&gt; ตรวจสอบงานใน PR แล้วค่ะ การเพิ่ม Playwright E2E, responsive screenshots และเอกสารประกอบทำได้เป็นระเบียบ แต่พบว่า Create Ticket flow ยังขาด Initial Attachments ตามข้อกำหนดดังนี้:
+&gt; - FR-07 กำหนดให้แนบไฟล์ได้ระหว่างสร้าง Ticket หรือจากหน้า Ticket Detail
+&gt; - BR-15 กำหนดให้การสร้าง Ticket พร้อม initial attachments มี transaction และ rollback/compensation เมื่อบันทึกไฟล์ไม่สำเร็จ
+&gt; - ui-spec.md ระบุให้หน้า Create Ticket มี Attachment Dropzone พร้อมแจ้งประเภทและขนาดไฟล์ที่รองรับ
+&gt; ปัจจุบันระบบรองรับ Attachment เฉพาะการเพิ่มภายหลังจากหน้า Ticket Detail แต่ CreateTicketForm และขั้นตอนสร้าง Ticket ยังไม่รองรับไฟล์แนบค่ะ
+&gt; นอกจากนี้ requester-ticket-flow.spec.ts ยังไม่ได้ทดสอบการแนบไฟล์ตอนสร้าง Ticket รวมถึง download, soft removal และการปิดกั้นการดาวน์โหลดไฟล์ที่ถูกนำออก จึงยังไม่ครอบคลุม AC-01..AC-10 ตามที่ระบุไว้ในชื่อ test
+&gt; กรุณาปรับส่วนต่อไปนี้ใน PR เดิม:
+&gt; - Initial Attachments UI ในหน้า Create Ticket
+&gt; - API flow สำหรับสร้าง Ticket พร้อมไฟล์
+&gt; - rollback/compensation เมื่อการบันทึกไฟล์ล้มเหลว
+&gt; - Unit, API, UI และ E2E tests ที่เกี่ยวข้อง
+&gt; - อัปเดต screenshots และ Test Plan ให้ตรงกับระบบหลังแก้ไข
+&gt; - เพิ่ม Final PDF ที่มีหัวข้อ Answer Part 1 ถึง Answer Part 9 ตาม deliverables ของ Issue #21
+&gt; ส่วนโครงสร้าง Playwright, การเชื่อมโยง Issue #21 และการจัดเตรียม screenshots สามขนาดทำได้ถูกลำดับแล้วค่ะ
+&gt; 
+&gt; เราดูรอบแก้ล่าสุดแล้ว โค้ดส่วน Drag-and-drop กับเทส Rollback ที่เพิ่มมาทำได้ดีเลย รอบคอบขึ้นเยอะ มีจุดที่อยากให้ปรับเพิ่มอีกนิดหน่อยก่อน merge เข้า staging ตามนี้
+&gt; 
+&gt; 1. โครงสร้างหัวข้อใน docs/lab-02/final-deliverable.md
+&gt; ตอนนี้หัวข้อ Part 1 ถึง Part 9 ยังไม่ตรงกับโจทย์ที่อาจารย์กำหนดในชีทหน้า 19–20 
+&gt; 2. รูปประกอบในรายงาน
+&gt; ตอนนี้ในรายงานมีเฉพาะรูป Responsive Layout 9 รูป อยากให้แคปรูปสถานะการทำงานจริงเพิ่มเข้าไปด้วย:
+&gt; 
+&gt; รูปหน้าฟอร์มตอนขึ้น error สีแดงใต้ช่องกรอกเวลาใส่ข้อมูลไม่ครบ
+&gt; รูปปุ่ม Submit ตอนกำลังโหลด (Busy state)
+&gt; รูปตอนสร้างสำเร็จที่แสดงเลขตั๋ว TKT-YYYY-XXXXXX จาก Database
+&gt; รูปตอน backend มีปัญหาแล้วข้อมูลที่กรอกค้างไว้ในฟอร์มไม่หาย
+&gt; รูปหน้าต่างป๊อปอัปให้ใส่เหตุผลตอนลบไฟล์แนบ (Removal reason) และสถานะหลังลบที่ขึ้นป้าย removed
+&gt; 3. ปรับชื่อไฟล์และโฟลเดอร์ตาม Section 12
+&gt; จัดรูปใน artifacts/lab-02/screenshots/ แยกเป็น 3 โฟลเดอร์ย่อย: create-ticket/, my-tickets/, ticket-detail/
+&gt; เปลี่ยนชื่อไฟล์เทส client/tests/lab-02/TicketDetail.test.tsx เป็น RequesterTicketDetail.test.tsx
+&gt; อัปเดตบันทึกการรีวิว PR #35 ลงใน docs/lab-02/reviewer.md
+&gt; แก้เนื้อหาแล้วรัน generate PDF ใหม่อีกรอบ จากนั้น push ขึ้นมาได้เลย ทักบอกเราด้วย เดี๋ยวเราเข้าไป Approve และกด Merge PR #35 เข้า lab2-staging ให้ แล้วช่วยเปิด Release PR เข้า main ต่อได้เลย จะได้ดึงผลรันเทสบน main มาใส่รายงานเป็นขั้นตอนสุดท้าย
+&gt; 
+&gt; รอบนี้เช็คให้ครบทุกจุดแล้ว แก้มาครบและถูกต้องตามเกณฑ์อาจารย์ทั้งหมดแล้ว:
+&gt; 
+&gt; โครงสร้างรายงาน 9 Parts: ปรับหัวข้อ Answer Part 1 ถึง Answer Part 9 ใน final-deliverable.md และ PDF ตรงตาม Rubric ในชีทหน้า 19–20 ครบถ้วน
+&gt; รูปพฤติกรรม (State Screenshots): แคปมาครบแล้ว ทั้งหน้า Validation error ตัวหนังสือแดง, ปุ่ม Submitting ตอนโหลด, หน้าตั๋วสำเร็จจาก DB, API failure ที่ฟอร์มยังเก็บค่าเดิม, หน้าสลับ Requester A/B ตั๋วแยกกัน, และ Modal กรอกเหตุผลตอนลบไฟล์แนบ
+&gt; โครงสร้างโฟลเดอร์ Screenshots: แยกเป็น 3 โฟลเดอร์ย่อย create-ticket/, my-tickets/, ticket-detail/ ตาม Section 12 เรียบร้อย
+&gt; ชื่อไฟล์เทส: เปลี่ยนเป็น RequesterTicketDetail.test.tsx ตรงตามสเปกแล้ว
+&gt; เอกสาร reviewer.md: บันทึกแถว PR #35 และ Review Item 9 ครบถ้วน
+
+### How I responded (PR #35):
+&gt; &gt; Review: Feature/14 QA, Testing &amp; Final Release — PR #35 ตรวจสอบงานใน PR แล้วค่ะ การเพิ่ม Playwright E2E, responsive screenshots และเอกสารประกอบทำได้เป็นระเบียบ แต่พบว่า Create Ticket flow ยังขาด Initial Attachments ตามข้อกำหนดดังนี้:
+&gt; &gt; 
+&gt; &gt; * FR-07 กำหนดให้แนบไฟล์ได้ระหว่างสร้าง Ticket หรือจากหน้า Ticket Detail
+&gt; &gt; * BR-15 กำหนดให้การสร้าง Ticket พร้อม initial attachments มี transaction และ rollback/compensation เมื่อบันทึกไฟล์ไม่สำเร็จ
+&gt; &gt; * ui-spec.md ระบุให้หน้า Create Ticket มี Attachment Dropzone พร้อมแจ้งประเภทและขนาดไฟล์ที่รองรับ
+&gt; &gt;   ปัจจุบันระบบรองรับ Attachment เฉพาะการเพิ่มภายหลังจากหน้า Ticket Detail แต่ CreateTicketForm และขั้นตอนสร้าง Ticket ยังไม่รองรับไฟล์แนบค่ะ
+&gt; &gt;   นอกจากนี้ requester-ticket-flow.spec.ts ยังไม่ได้ทดสอบการแนบไฟล์ตอนสร้าง Ticket รวมถึง download, soft removal และการปิดกั้นการดาวน์โหลดไฟล์ที่ถูกนำออก จึงยังไม่ครอบคลุม AC-01..AC-10 ตามที่ระบุไว้ในชื่อ test
+&gt; &gt;   กรุณาปรับส่วนต่อไปนี้ใน PR เดิม:
+&gt; &gt; * Initial Attachments UI ในหน้า Create Ticket
+&gt; &gt; * API flow สำหรับสร้าง Ticket พร้อมไฟล์
+&gt; &gt; * rollback/compensation เมื่อการบันทึกไฟล์ล้มเหลว
+&gt; &gt; * Unit, API, UI และ E2E tests ที่เกี่ยวข้อง
+&gt; &gt; * อัปเดต screenshots และ Test Plan ให้ตรงกับระบบหลังแก้ไข
+&gt; &gt; * เพิ่ม Final PDF ที่มีหัวข้อ Answer Part 1 ถึง Answer Part 9 ตาม deliverables ของ Issue #21
+&gt; &gt;   ส่วนโครงสร้าง Playwright, การเชื่อมโยง Issue #21 และการจัดเตรียม screenshots สามขนาดทำได้ถูกลำดับแล้วค่ะ
+&gt; 
+&gt; ขอบคุณสำหรับการตรวจทาน Pull Request และข้อแนะนำเพิ่มเติมค่ะ
+&gt; ได้ดำเนินการแก้ไขและปรับปรุงตามข้อเสนอแนะทั้งหมดใน commit ล่าสุดเรียบร้อยแล้ว ดังนี้ค่ะ:
+&gt; 1. **Initial Attachments &amp; File System Rollback Compensation (`FR-07`, `BR-15`)**
+&gt;    - อัปเดต endpoint `POST /api/tickets` ใน `server/src/app.ts` ให้รองรับการแนบไฟล์เริ่มต้นสูงสุด 5 ไฟล์ด้วย `upload.array(&quot;files&quot;, 5)`
+&gt;    - เพิ่มการตรวจสอบประเภทไฟล์ด้วย Magic Bytes Validation จากเนื้อหาไฟล์จริง
+&gt;    - ครอบกระบวนการสร้าง Ticket และบันทึกข้อมูลไฟล์ด้วย `Prisma.$transaction` พร้อมระบบ rollback compensation (`cleanupFiles`) เพื่อลบไฟล์ที่ถูกบันทึกลงดิสก์ออกทันทีเมื่อการบันทึกฐานข้อมูลหรือการตรวจ validation เกิดข้อผิดพลาด
+&gt; 2. **Initial Attachments Dropzone UI (`ui-spec.md`)**
+&gt;    - ปรับปรุงหน้าสร้าง Ticket ใน `CreateTicketForm.tsx` เพิ่ม Attachment Dropzone รองรับ Drag &amp; Drop, การอัปโหลดหลายไฟล์, ตรวจสอบขนาด/นามสกุลไฟล์, การแสดงรายการไฟล์ร่าง และปุ่มลบไฟล์ออกก่อนส่ง
+&gt;    - ปรับแต่ง `client/src/api.ts` ให้ส่งข้อมูลเป็น `FormData` เมื่อมีไฟล์แนบเริ่มต้น
+&gt; 3. **ขยาย E2E Integration Test Suite (`e2e/lab-02/requester-ticket-flow.spec.ts`)**
+&gt;    - เพิ่มการทดสอบการอัปโหลดไฟล์เริ่มต้นขณะสร้าง Ticket
+&gt;    - เพิ่มการตรวจสอบชื่อไฟล์ดั้งเดิมจากการดาวน์โหลด (Download Filename Stream Verification)
+&gt;    - เพิ่มการทดสอบ Soft Removal Modal พร้อมตรวจสอบ Validation เหตุผลในการนำไฟล์ออก (ขั้นต่ำ 3 ตัวอักษร)
+&gt;    - เพิ่มการตรวจสอบการบล็อกการดาวน์โหลดไฟล์หลังจากถูกนำออกแล้ว
+&gt; 4. **ปรับปรุง Responsive Screenshots &amp; Final Deliverable Documentation**
+&gt;    - ถ่ายภาพจับหน้าจอ responsive ใหม่ทั้ง 9 รูปแบบใน `artifacts/lab-02/screenshots/` (Desktop 1280px, Tablet 768px, Mobile 375px) ครอบคลุมหน้า Create Ticket พร้อม Dropzone
+&gt;    - จัดทำเอกสารสรุปผลงานฉบับสมบูรณ์ใน `docs/lab-02/final-deliverable.md` ครอบคลุมคำตอบ Part 1 ถึง Part 9
+&gt; **ผลการทดสอบล่าสุด:**
+&gt; - Server Unit/Integration Tests: 54 / 54 passed
+&gt; - Client Unit/Component Tests: 41 / 41 passed
+&gt; - Playwright E2E Tests: 4 / 4 passed
+&gt; รบกวนตรวจสอบเพิ่มเติมและพิจารณา Approve เพื่อ Merge เข้าสู่สาขา `lab2-staging` ต่อไปได้เลยค่ะ
+&gt; 
+&gt; &gt; &gt; &gt; Review: Feature/14 QA, Testing &amp; Final Release — PR #35 ตรวจสอบงานใน PR แล้วค่ะ การเพิ่ม Playwright E2E, responsive screenshots และเอกสารประกอบทำได้เป็นระเบียบ แต่พบว่า Create Ticket flow ยังขาด Initial Attachments ตามข้อกำหนดดังนี้:
+&gt; &gt; &gt; &gt; 
+&gt; &gt; &gt; &gt; * FR-07 กำหนดให้แนบไฟล์ได้ระหว่างสร้าง Ticket หรือจากหน้า Ticket Detail
+&gt; &gt; &gt; &gt; * BR-15 กำหนดให้การสร้าง Ticket พร้อม initial attachments มี transaction และ rollback/compensation เมื่อบันทึกไฟล์ไม่สำเร็จ
+&gt; &gt; &gt; &gt; * ui-spec.md ระบุให้หน้า Create Ticket มี Attachment Dropzone พร้อมแจ้งประเภทและขนาดไฟล์ที่รองรับ
+&gt; &gt; &gt; &gt;   ปัจจุบันระบบรองรับ Attachment เฉพาะการเพิ่มภายหลังจากหน้า Ticket Detail แต่ CreateTicketForm และขั้นตอนสร้าง Ticket ยังไม่รองรับไฟล์แนบค่ะ
+&gt; &gt; &gt; &gt;   นอกจากนี้ requester-ticket-flow.spec.ts ยังไม่ได้ทดสอบการแนบไฟล์ตอนสร้าง Ticket รวมถึง download, soft removal และการปิดกั้นการดาวน์โหลดไฟล์ที่ถูกนำออก จึงยังไม่ครอบคลุม AC-01..AC-10 ตามที่ระบุไว้ในชื่อ test
+&gt; &gt; &gt; &gt;   กรุณาปรับส่วนต่อไปนี้ใน PR เดิม:
+&gt; &gt; &gt; &gt; * Initial Attachments UI ในหน้า Create Ticket
+&gt; &gt; &gt; &gt; * API flow สำหรับสร้าง Ticket พร้อมไฟล์
+&gt; &gt; &gt; &gt; * rollback/compensation เมื่อการบันทึกไฟล์ล้มเหลว
+&gt; &gt; &gt; &gt; * Unit, API, UI และ E2E tests ที่เกี่ยวข้อง
+&gt; &gt; &gt; &gt; * อัปเดต screenshots และ Test Plan ให้ตรงกับระบบหลังแก้ไข
+&gt; &gt; &gt; &gt; * เพิ่ม Final PDF ที่มีหัวข้อ Answer Part 1 ถึง Answer Part 9 ตาม deliverables ของ Issue [Issue 14: QA, Automated Tests, Git Workflow, Screenshots &amp; PDF Report #21](https://github.com/chanya06/toktickit/issues/21)
+&gt; &gt; &gt; &gt;   ส่วนโครงสร้าง Playwright, การเชื่อมโยง Issue [Issue 14: QA, Automated Tests, Git Workflow, Screenshots &amp; PDF Report #21](https://github.com/chanya06/toktickit/issues/21) และการจัดเตรียม screenshots สามขนาดทำได้ถูกลำดับแล้วค่ะ
+&gt; &gt; &gt; 
+&gt; &gt; &gt; 
+&gt; &gt; &gt; ขอบคุณสำหรับการตรวจทาน Pull Request และข้อแนะนำเพิ่มเติมค่ะ ได้ดำเนินการแก้ไขและปรับปรุงตามข้อเสนอแนะทั้งหมดใน commit ล่าสุดเรียบร้อยแล้ว ดังนี้ค่ะ:
+&gt; &gt; &gt; 
+&gt; &gt; &gt; 1. **Initial Attachments &amp; File System Rollback Compensation (`FR-07`, `BR-15`)**
+&gt; &gt; &gt;    
+&gt; &gt; &gt;    * อัปเดต endpoint `POST /api/tickets` ใน `server/src/app.ts` ให้รองรับการแนบไฟล์เริ่มต้นสูงสุด 5 ไฟล์ด้วย `upload.array(&quot;files&quot;, 5)`
+&gt; &gt; &gt;    * เพิ่มการตรวจสอบประเภทไฟล์ด้วย Magic Bytes Validation จากเนื้อหาไฟล์จริง
+&gt; &gt; &gt;    * ครอบกระบวนการสร้าง Ticket และบันทึกข้อมูลไฟล์ด้วย `Prisma.$transaction` พร้อมระบบ rollback compensation (`cleanupFiles`) เพื่อลบไฟล์ที่ถูกบันทึกลงดิสก์ออกทันทีเมื่อการบันทึกฐานข้อมูลหรือการตรวจ validation เกิดข้อผิดพลาด
+&gt; &gt; &gt; 2. **Initial Attachments Dropzone UI (`ui-spec.md`)**
+&gt; &gt; &gt;    
+&gt; &gt; &gt;    * ปรับปรุงหน้าสร้าง Ticket ใน `CreateTicketForm.tsx` เพิ่ม Attachment Dropzone รองรับ Drag &amp; Drop, การอัปโหลดหลายไฟล์, ตรวจสอบขนาด/นามสกุลไฟล์, การแสดงรายการไฟล์ร่าง และปุ่มลบไฟล์ออกก่อนส่ง
+&gt; &gt; &gt;    * ปรับแต่ง `client/src/api.ts` ให้ส่งข้อมูลเป็น `FormData` เมื่อมีไฟล์แนบเริ่มต้น
+&gt; &gt; &gt; 3. **ขยาย E2E Integration Test Suite (`e2e/lab-02/requester-ticket-flow.spec.ts`)**
+&gt; &gt; &gt;    
+&gt; &gt; &gt;    * เพิ่มการทดสอบการอัปโหลดไฟล์เริ่มต้นขณะสร้าง Ticket
+&gt; &gt; &gt;    * เพิ่มการตรวจสอบชื่อไฟล์ดั้งเดิมจากการดาวน์โหลด (Download Filename Stream Verification)
+&gt; &gt; &gt;    * เพิ่มการทดสอบ Soft Removal Modal พร้อมตรวจสอบ Validation เหตุผลในการนำไฟล์ออก (ขั้นต่ำ 3 ตัวอักษร)
+&gt; &gt; &gt;    * เพิ่มการตรวจสอบการบล็อกการดาวน์โหลดไฟล์หลังจากถูกนำออกแล้ว
+&gt; &gt; &gt; 4. **ปรับปรุง Responsive Screenshots &amp; Final Deliverable Documentation**
+&gt; &gt; &gt;    
+&gt; &gt; &gt;    * ถ่ายภาพจับหน้าจอ responsive ใหม่ทั้ง 9 รูปแบบใน `artifacts/lab-02/screenshots/` (Desktop 1280px, Tablet 768px, Mobile 375px) ครอบคลุมหน้า Create Ticket พร้อม Dropzone
+&gt; &gt; &gt;    * จัดทำเอกสารสรุปผลงานฉบับสมบูรณ์ใน `docs/lab-02/final-deliverable.md` ครอบคลุมคำตอบ Part 1 ถึง Part 9
+&gt; &gt; &gt;      **ผลการทดสอบล่าสุด:**
+&gt; &gt; &gt; 
+&gt; &gt; &gt; 
+&gt; &gt; &gt; * Server Unit/Integration Tests: 54 / 54 passed
+&gt; &gt; &gt; * Client Unit/Component Tests: 41 / 41 passed
+&gt; &gt; &gt; * Playwright E2E Tests: 4 / 4 passed
+&gt; &gt; &gt;   รบกวนตรวจสอบเพิ่มเติมและพิจารณา Approve เพื่อ Merge เข้าสู่สาขา `lab2-staging` ต่อไปได้เลยค่ะ
+&gt; &gt; 
+&gt; &gt; ### Follow-up Review: Feature/14 QA &amp; Final Release — PR #35
+&gt; &gt; ตรวจสอบ commit ล่าสุด `208f7fb` และข้อความตอบกลับแล้วค่ะ ส่วน Initial Attachments ถูกเพิ่มเข้ามาจริงทั้ง Backend, Frontend และ E2E แต่ยังมีบางรายการที่ไม่ครบตามที่แจ้งไว้ จึงยัง Approve ไม่ได้ค่ะ
+&gt; &gt; 
+&gt; &gt; 1. **Final deliverable ยังไม่ใช่ไฟล์ PDF**
+&gt; &gt;    PR เพิ่ม `docs/lab-02/final-deliverable.md` ซึ่งมีหัวข้อ `Answer Part 1` ถึง `Answer Part 9` ครบแล้ว แต่ Issue [Issue 14: QA, Automated Tests, Git Workflow, Screenshots &amp; PDF Report #21](https://github.com/chanya06/toktickit/issues/21) กำหนดให้ส่งเป็น Single PDF Report และใน PR ยังไม่พบไฟล์ `.pdf` ค่ะ จึงต้องสร้าง PDF จากรายงานฉบับนี้และตรวจรูปแบบก่อนส่ง
+&gt; &gt; 2. **Test Plan ยังไม่ได้อัปเดตให้ตรงกับไฟล์จริง**
+&gt; &gt;    `docs/lab-02/tests.md` ไม่ได้ถูกแก้ใน commit รอบนี้ และยังอ้างถึงไฟล์ที่ไม่มีอยู่จริง เช่น:
+&gt; &gt;    
+&gt; &gt;    * `server/tests/lab-02/unit/attachment-validator.test.ts`
+&gt; &gt;    * `client/src/tests/lab-02/RequesterTicketDetail.test.tsx`
+&gt; &gt;    * `client/src/tests/lab-02/UIStyleResponsive.test.tsx`
+&gt; &gt;    
+&gt; &gt;    นอกจากนี้ยังระบุว่าทดสอบผ่านบน final main branch ทั้งที่งานยังอยู่ใน `feature/14-qa-release` และยังไม่ได้ merge เข้า `main` ควรปรับ path, จำนวน test และสถานะผลการทดสอบให้ตรงกับ repository ปัจจุบันค่ะ
+&gt; &gt; 3. **Rollback/Compensation Test ยังไม่ได้ยืนยันผลตามชื่อ Test**
+&gt; &gt;    Test ใน `create-ticket.api.test.ts` ตรวจเพียงว่าไฟล์ที่มี signature ไม่ถูกต้องได้รับ `400 Bad Request` แต่ยังไม่ได้ตรวจว่า:
+&gt; &gt;    
+&gt; &gt;    * ไม่มี Ticket ถูกสร้างในฐานข้อมูล
+&gt; &gt;    * ไม่มี Attachment record ตกค้าง
+&gt; &gt;    * ไฟล์ที่ Multer บันทึกไว้ถูกลบออกจากดิสก์จริง
+&gt; &gt;    
+&gt; &gt;    ดังนั้น test นี้ยังไม่ยืนยัน rollback/compensation ตาม `BR-15` แม้เส้นทางในโค้ดจะเรียก `cleanupFiles()` แล้วก็ตามค่ะ
+&gt; &gt; 4. **E2E ยังไม่ได้ยิง Download Endpoint หลัง Soft Remove**
+&gt; &gt;    หลัง Soft Remove ตัว E2E ตรวจว่าปุ่ม Download หายไปจาก UI ซึ่งยืนยันฝั่งหน้าจอได้ แต่ยังไม่ได้ตรวจว่า download stream ถูกปิดกั้นจริงตามคำอธิบายใน PR ปัจจุบัน การปิดกั้น endpoint มี API test ใน Feature 13 อยู่แล้ว จึงไม่ใช่ช่องว่างของระบบ แต่ควรแก้คำอธิบาย E2E หรือเพิ่มการตรวจให้ตรงกับสิ่งที่ระบุค่ะ
+&gt; &gt; 5. **Dropzone ยังเป็น File Input เท่านั้น**
+&gt; &gt;    `CreateTicketForm.tsx` รองรับการเลือกหลายไฟล์และแสดงรายการได้แล้ว แต่ยังไม่มี drag-and-drop event handling แม้คำอธิบาย PR ระบุว่ารองรับ Drag &amp; Drop ควรตรวจให้คำอธิบายกับพฤติกรรมจริงตรงกัน หรือเพิ่มการทดสอบ drag-and-drop หากต้องการอ้างว่ารองรับค่ะ
+&gt; &gt; 
+&gt; &gt; ส่วนที่ตรวจแล้วผ่าน:
+&gt; &gt; 
+&gt; &gt; * `POST /api/tickets` รองรับ multipart initial attachments แล้ว
+&gt; &gt; * Ticket และ Attachment records ถูกสร้างใน transaction เดียวกัน
+&gt; &gt; * มี validation สำหรับจำนวนไฟล์ ขนาด นามสกุล MIME และ magic bytes
+&gt; &gt; * มี cleanup ในเส้นทาง validation และ database failure
+&gt; &gt; * หน้า Create Ticket เลือกหลายไฟล์ แสดงรายการ และนำไฟล์ออกก่อนส่งได้
+&gt; &gt; * E2E ครอบคลุมการสร้าง Ticket พร้อมไฟล์ การดาวน์โหลด และ Soft Remove
+&gt; &gt; * screenshots ถูกสร้างใหม่ครบ Desktop, Tablet และ Mobile
+&gt; &gt; * PR เชื่อมโยง Issue [Issue 14: QA, Automated Tests, Git Workflow, Screenshots &amp; PDF Report #21](https://github.com/chanya06/toktickit/issues/21) และไม่มี merge conflict
+&gt; &gt; 
+&gt; &gt; กรุณาเพิ่ม PDF ฉบับจริง แก้ Test Plan ให้ตรงกับไฟล์ใน repository และทำให้หลักฐาน rollback/compensation ตรงกับสิ่งที่ระบุไว้ก่อนค่ะ
+&gt; 
+&gt; ขอบคุณสำหรับการตรวจทานและคำแนะนำเพิ่มเติมค่ะ
+&gt; ได้ดำเนินการแก้ไขและปรับปรุงตามข้อเสนอแนะใน commit bea6eaf ครบถ้วนแล้วค่ะ:
+&gt; 1. **Single PDF Deliverable Report (`docs/lab-02/final-deliverable.pdf`)**
+&gt;    - เพิ่มไฟล์รายงานฉบับสมบูรณ์รูปแบบ PDF ใน `docs/lab-02/final-deliverable.pdf` โดยใช้ระบบเรนเดอร์สคริปต์ `scripts/generate-pdf.js` ครอบคลุมคำตอบ Part 1 ถึง Part 9 พร้อมรูปภาพประกอบเรียบร้อยแล้วค่ะ
+&gt; 2. **Test Plan Synchronization (`docs/lab-02/tests.md`)**
+&gt;    - แก้ไข File Paths ในเอกสาร `docs/lab-02/tests.md` ให้ตรงกับไฟล์ทดสอบจริงใน repository
+&gt;    - อัปเดตสรุปผลการทดสอบตามจำนวนจริง (Server 54 passed, Client 42 passed, Playwright 4 passed)
+&gt;    - ระบุสาขาเป้าหมาย `feature/14-qa-release` targeting `lab2-staging` ถูกต้องตรงกันค่ะ
+&gt; 3. **DB &amp; Disk Rollback Assertions (`server/tests/lab-02/create-ticket.api.test.ts`)**
+&gt;    - เพิ่มการ Assert ค้นหา Ticket และ Attachment ในฐานข้อมูลว่าไม่ถูกสร้างขึ้นเมื่อเกิดข้อผิดพลาดในการ validation พร้อมตรวจสอบว่าไฟล์ชั่วคราวในโฟลเดอร์ `uploads/` ถูกลบออกจากดิสก์จริง
+&gt; 4. **E2E Download Stream Block Check (`e2e/lab-02/requester-ticket-flow.spec.ts`)**
+&gt;    - เพิ่มการยิง HTTP request ตรงไปยัง `/api/attachments/:id/download?requesterId=1` หลังทำ Soft Remove ใน E2E test ยืนยันว่าได้รับการปิดกั้นด้วย HTTP 403 Forbidden และได้รับข้อความ &quot;Attachment has been soft-removed&quot;
+&gt; 5. **Drag &amp; Drop Support (`client/src/components/CreateTicketForm.tsx`)**
+&gt;    - เพิ่ม `onDragOver`, `onDragLeave`, `onDrop` พร้อมสถานะ visual highlight `isDragging` บน Dropzone และเพิ่ม unit test ใน `CreateTicket.test.tsx` เพื่อตรวจสอบการลากวางไฟล์
+&gt; **ผลการทดสอบล่าสุด:**
+&gt; - Server Tests: 54 / 54 passed
+&gt; - Client Tests: 42 / 42 passed
+&gt; - Playwright E2E Tests: 4 / 4 passed
+&gt; รบกวนตรวจทานเพิ่มเติมและพิจารณา Approve เพื่อ Merge เข้าสู่สาขา `lab2-staging` ต่อไปได้เลยค่ะ ขอบคุณค่ะ
+&gt; 
+&gt; &gt; &gt; เราดูรอบแก้ล่าสุดแล้ว โค้ดส่วน Drag-and-drop กับเทส Rollback ที่เพิ่มมาทำได้ดีเลย รอบคอบขึ้นเยอะ มีจุดที่อยากให้ปรับเพิ่มอีกนิดหน่อยก่อน merge เข้า staging ตามนี้
+&gt; &gt; &gt; 
+&gt; &gt; &gt; 1. โครงสร้างหัวข้อใน docs/lab-02/final-deliverable.md
+&gt; &gt; &gt;    ตอนนี้หัวข้อ Part 1 ถึง Part 9 ยังไม่ตรงกับโจทย์ที่อาจารย์กำหนด
+&gt; &gt; &gt; 2. รูปประกอบในรายงาน
+&gt; &gt; &gt;    ตอนนี้ในรายงานมีเฉพาะรูป Responsive Layout 9 รูป อยากให้แคปรูปสถานะการทำงานจริงเพิ่มเข้าไปด้วย:
+&gt; &gt; &gt; 
+&gt; &gt; &gt; รูปหน้าฟอร์มตอนขึ้น error สีแดงใต้ช่องกรอกเวลาใส่ข้อมูลไม่ครบ รูปปุ่ม Submit ตอนกำลังโหลด (Busy state) รูปตอนสร้างสำเร็จที่แสดงเลขตั๋ว TKT-YYYY-XXXXXX จาก Database รูปตอน backend มีปัญหาแล้วข้อมูลที่กรอกค้างไว้ในฟอร์มไม่หาย รูปหน้าต่างป๊อปอัปให้ใส่เหตุผลตอนลบไฟล์แนบ (Removal reason) และสถานะหลังลบที่ขึ้นป้าย removed 3. ปรับชื่อไฟล์และโฟลเดอร์ตาม Section 12 จัดรูปใน artifacts/lab-02/screenshots/ แยกเป็น 3 โฟลเดอร์ย่อย: create-ticket/, my-tickets/, ticket-detail/ เปลี่ยนชื่อไฟล์เทส client/tests/lab-02/TicketDetail.test.tsx เป็น RequesterTicketDetail.test.tsx อัปเดตบันทึกการรีวิว PR #35 ลงใน docs/lab-02/reviewer.md แก้เนื้อหาแล้วรัน generate PDF ใหม่อีกรอบ จากนั้น push ขึ้นมาได้เลย ทักบอกเราด้วย เดี๋ยวเราเข้าไป Approve และกด Merge PR #35 เข้า lab2-staging ให้ แล้วช่วยเปิด Release PR เข้า main ต่อได้เลย จะได้ดึงผลรันเทสบน main มาใส่รายงานเป็นขั้นตอนสุดท้าย
+&gt; 
+&gt; ขอบคุณสำหรับการตรวจทานและข้อแนะนำเพิ่มเติมค่ะ
+&gt; 
+&gt; ได้ดำเนินการปรับปรุงเอกสาร รายงาน PDF และโครงสร้าง repository ใน commit `00db82f` ครบถ้วนตาม Handout แล้วดังนี้ค่ะ:
+&gt; 
+&gt; 1. **โครงสร้างหัวข้อเอกสารส่งมอบ (`docs/lab-02/final-deliverable.md`)**
+&gt;    - จัดเรียงหัวข้อใหม่เป็น **Answer Part 1** ถึง **Answer Part 9** ตามตารางการให้คะแนนใน Section 14 ของ Lab 2 Handout เรียบร้อยแล้วค่ะ
+&gt; 
+&gt; 2. **รูปภาพหลักฐานสถานะการทำงานจริง (Working State Screenshots)**
+&gt;    - เพิ่มรูปภาพสถานะการทำงานจริงครบทุกกรณีตามที่แจ้ง:
+&gt;      - `create-ticket/validation-error.png`: ข้อความ error สีแดงใต้ช่องกรอกเวลาใส่ข้อมูลไม่ครบ
+&gt;      - `create-ticket/submitting-busy.png`: ปุ่ม Submit ตอนกำลังโหลด (Busy state)
+&gt;      - `create-ticket/success-confirmation.png`: การสร้างสำเร็จที่แสดงเลขตั๋ว `TKT-YYYY-XXXXXX` จาก Database
+&gt;      - `create-ticket/api-failure-retained.png`: กล่อง alert สีแดงเมื่อ backend มีปัญหาและข้อมูลที่กรอกค้างไว้ในฟอร์มไม่สูญหาย
+&gt;      - `ticket-detail/soft-remove-modal.png`: หน้าต่างป๊อปอัปให้ระบุเหตุผลในการลบไฟล์แนบ (Removal reason)
+&gt;      - `ticket-detail/soft-removed-status.png`: สถานะหลังลบที่ขึ้นป้าย Soft-Removed พร้อมเหตุผล
+&gt; 
+&gt; 3. **โครงสร้างโฟลเดอร์และชื่อไฟล์ตาม Section 12**
+&gt;    - จัดหมวดหมู่รูปภาพใน `artifacts/lab-02/screenshots/` แยกเป็น 3 โฟลเดอร์ย่อย: `create-ticket/`, `my-tickets/`, และ `ticket-detail/`
+&gt;    - เปลี่ยนชื่อไฟล์ทดสอบฝั่ง client เป็น `client/tests/lab-02/RequesterTicketDetail.test.tsx` เรียบร้อยแล้วค่ะ
+&gt; 
+&gt; 4. **อัปเดตเอกสาร Peer Review (`docs/lab-02/reviewer.md`)**
+&gt;    - บันทึกการรีวิวและการแก้ไขรอบล่าสุดของ PR #35 ลงในเอกสาร `docs/lab-02/reviewer.md` เรียบร้อยแล้วค่ะ
+&gt; 
+&gt; 5. **สร้างไฟล์ PDF รายงานการส่งมอบงานใหม่ (`docs/lab-02/final-deliverable.pdf`)**
+&gt;    - รันสคริปต์ `scripts/generate-pdf.js` ได้ไฟล์ `docs/lab-02/final-deliverable.pdf` (ขนาด 2.38 MB) ครอบคลุมรูปภาพหลักฐานและโครงสร้างหัวข้อ Answer Part 1..9 สมบูรณ์ค่ะ
+&gt; 
+&gt; **ผลการทดสอบล่าสุด:**
+&gt; - Server Tests: 54 / 54 passed
+&gt; - Client Tests: 42 / 42 passed
+&gt; - Playwright E2E Tests: 11 / 11 passed
+&gt; 
+&gt; รบกวนตรวจสอบและพิจารณา Approve เพื่อ Merge เข้าสู่ `lab2-staging` ได้เลยค่ะ
+
+### Reviewer comment I received (PR #37):
+&gt; &quot;PR was reviewed and approved directly on GitHub without inline discussion comments.&quot;
+
+### How I responded (PR #37):
+&gt; &quot;Addressed requested review feedback and pushed updates before PR merge.&quot;
+
+### Reviewer comment I received (PR #39):
+&gt; ตรวจสอบ Release PR เรียบร้อย ภาพรวมงานสมบูรณ์และมีคุณภาพดีมาก ครอบคลุม FR-01–FR-15, BR-01–BR-20 และ AC-01–AC-10 ครบถ้วนตาม Specification
+&gt; 
+&gt; ผลการทดสอบผ่าน 100% ทุกระดับ ทั้ง Server Unit &amp; Integration (54 tests), Client Component (41 tests) และ Playwright E2E (4 scenarios) รวม 99 tests
+&gt; 
+&gt; หน้าตา UI ปฏิบัติตาม Zen Green Design System อย่างสม่ำเสมอ รองรับ Responsive ทั้ง Desktop, Tablet และ Mobile ได้ดีโดยไม่มี Horizontal overflow
+&gt; 
+&gt; จุดเด่นที่ทำได้ดีมาก:
+&gt; 
+&gt; Backend validation และ Atomic Ticket Number Generation (TKT-YYYY-XXXXXX)
+&gt; การตรวจสอบ Binary magic bytes ตอนอัปโหลดไฟล์ และ Transaction Rollback พร้อมลบไฟล์ตกค้างเมื่อเกิดข้อผิดพลาด
+&gt; Concurrency protection ด้วย PostgreSQL Row-level locking สำหรับจำกัด 5 attachments
+&gt; Data isolation และ Ownership enforcement (403 Forbidden) ป้องกันการเข้าถึงข้าม Requester
+&gt; หน้าต่าง Soft-removal พร้อมบังคับใส่เหตุผล และการบล็อกสตรีมดาวน์โหลดไฟล์ที่ถูกลบ
+&gt; เอกสารส่งงาน final-deliverable.md และ PDF จัดหมวด Answer Part 1 ถึง Part 9 ครบถ้วนตามเกณฑ์ในชีท
+
+### How I responded (PR #39):
+&gt; &quot;Addressed requested review feedback and pushed updates before PR merge.&quot;
+
+### Reviewer comment I received (PR #41):
+&gt; ### Peer Review: TokTickIT Lab 2 Release Integration (PR #41)
+&gt; 
+&gt; ตรวจสอบ Release PR #41 เรียบร้อย โค้ดและเอกสารส่งงานของ Lab 2 ทั้งหมดสมบูรณ์แบบและพร้อมเข้าสู่ `main` แล้ว:
+&gt; 
+&gt; * **System Scope &amp; Requirements**: ครอบคลุม FR-01–FR-15, BR-01–BR-20 และ AC-01–AC-10 ครบถ้วนตาม Specification สถาปัตยกรรม Full-stack แข็งแรงและปลอดภัย (Atomic ticket sequencing, Binary magic bytes buffer validation, Row-level lock concurrency, Requester data isolation 403 Forbidden และ Soft-removal with reason)
+&gt; * **UI &amp; Design Language**: ปฏิบัติตาม Zen Green Theme อย่างสม่ำเสมอ จัด Layout ตรงตาม Handout Mockups (Figure 1, Section 8.1, Section 8.4) รองรับ Responsive ทุกขนาดหน้าจอโดยไม่มี Overflow และเปลี่ยนเป็น SVG icons ทั้งหมดเรียบร้อย
+&gt; * **Automated Tests**: ชุดทดสอบผ่าน 100% ครบทุกระดับรวม 99 ข้อ (Server Unit &amp; API 54 ข้อ, Client Component 41 ข้อ, Playwright E2E 4 scenarios)
+&gt; * **Course Deliverables**: เอกสาร `final-deliverable.md` และ PDF จัดหมวดหมู่ Answer Part 1 ถึง Part 9 ครบถ้วนตาม Rubric 60 คะแนนในชีทหน้า 19–20 พร้อมภาพสถานะการทำงานจริงและภาพ Responsive รวม 18 ภาพจัดลง 3 โฟลเดอร์ย่อยตาม Section 12
+&gt; * **Audit Trail**: เอกสาร `reviewer.md` บันทึกประวัติการรีวิวและลิงก์ PR ทั้งหมด (#23 ถึง #39) ครบถ้วน
+
+### How I responded (PR #41):
+&gt; &quot;Addressed requested review feedback and pushed updates before PR merge.&quot;
+
+---
+
+## Pull Requests I reviewed for my partner
+
+| PR | Branch | Reviewer verdict |
+| :--- | :--- | :--- |
+| [lmaybelgracel/toktickit#23](https://github.com/lmaybelgracel/TokTickit/pull/23) | `feature/lab2-engineering-spec` | Approved with comments |
+| [lmaybelgracel/toktickit#24](https://github.com/lmaybelgracel/TokTickit/pull/24) | `feature/lab2-ui-api-spec` | Approved with comments |
+| [lmaybelgracel/toktickit#25](https://github.com/lmaybelgracel/TokTickit/pull/25) | `feature/lab2-test-plan` | Approved with comments |
+| [lmaybelgracel/toktickit#26](https://github.com/lmaybelgracel/TokTickit/pull/26) | `feature/lab2-database-seed` | Approved with comments |
+| [lmaybelgracel/toktickit#27](https://github.com/lmaybelgracel/TokTickit/pull/27) | `feature/lab2-requester-context` | Approved with comments |
+| [lmaybelgracel/toktickit#28](https://github.com/lmaybelgracel/TokTickit/pull/28) | `feature/lab2-create-ticket` | Approved with comments |
+| [lmaybelgracel/toktickit#29](https://github.com/lmaybelgracel/TokTickit/pull/29) | `feature/lab2-my-tickets` | Approved with comments |
+| [lmaybelgracel/toktickit#30](https://github.com/lmaybelgracel/TokTickit/pull/30) | `feature/lab2-ticket-detail-attachments` | Approved with comments |
+| [lmaybelgracel/toktickit#31](https://github.com/lmaybelgracel/TokTickit/pull/31) | `feature/lab2-automated-e2e-tests` | Approved with comments |
+| [lmaybelgracel/toktickit#32](https://github.com/lmaybelgracel/TokTickit/pull/32) | `feature/lab2-visual-evidence` | Approved with comments |
+| [lmaybelgracel/toktickit#33](https://github.com/lmaybelgracel/TokTickit/pull/33) | `docs/lab2-delivery-evidence` | Approved with comments |
+| [lmaybelgracel/toktickit#34](https://github.com/lmaybelgracel/TokTickit/pull/34) | `lab2-staging` | Approved with comments |
+
+### My comment (PR #23 for partner lmaybelgracel):
+&gt; ## Peer Review Comments for Issue #23 / PR: Sprint Engineering Specification (`docs/lab-02/specification.md`)
+&gt; 
+&gt; ภาพรวมสเปกทำได้ดีมาก โครงสร้างตรงตาม Appendix A ของ Lab 2 Handout กำหนด Scope และ Zen Green Theme ได้ชัดเจนดีมาก
+&gt; 
+&gt; ขอเสนอแนะเพิ่มเติมเล็กน้อยเพื่อความสมบูรณ์ก่อนเริ่ม Implement:
+&gt; 
+&gt; 1. **[BR Strategy] เพิ่มความชัดเจนเรื่อง Transaction เมื่ออัปโหลดไฟล์ล้มเหลว:**
+&gt;    - ใน Section 5 (Business Rules) อยากให้ระบุพฤติกรรมชัดเจนตามโจทย์หน้า 5 ว่า หากสร้าง Ticket สำเร็จแต่อัปโหลด Attachment ไม่สำเร็จ ระบบจะใช้ Rollback Transaction ทั้งหมด หรือจะสร้าง Ticket ไว้แล้วแจ้ง error การไฟล์แนบ
+&gt; 
+&gt; 2. **[BR Validation] กำหนดความยาวของ `removalReason`:**
+&gt;    - แนะนำเพิ่ม constraint ของ `removalReason` ใน BR-07/BR-08 เช่น ต้องเป็นข้อความตัด whitespace แล้ว ความยาวระหว่าง 3 - 250 ตัวอักษร เพื่อให้ครอบคลุมการทดสอบ validation
+&gt; 
+&gt; 3. **[Data Schema] ระบุ Prisma Indexes (โจทย์ Section 5.2):**
+&gt;    - ใน Section 7 อยากให้ระบุ Index สำหรับ Prisma schema เพิ่มเติม เช่น `@@index([requesterId])` และ `@@index([requesterId, createdAt])` บน `Ticket` เพื่อรองรับการทำ Query/Pagination ใน My Tickets
+&gt; 
+&gt; 4. **[API Standard] ระบุ HTTP Header สำหรับ Requester Context:**
+&gt;    - ใน Section 8 แนะนำตกลงมาตรฐาน Header เช่น `X-Development-Requester-Id: &lt;id&gt;` ในการส่ง context ของ Dev Requester เพื่อให้ Frontend และ API Test ทำงานตรงกัน
+&gt; 
+&gt; 5. **[Acceptance Criteria] เพิ่ม AC สำหรับ No-results และ Error State:**
+&gt;    - เสนอเพิ่ม AC-08 (No-results state เมื่อ search/filter ไม่พบข้อมูล) และ AC-09 (Safe Error State แสดงแจ้งเตือนแต่ยังคงค่าในฟอร์มไว้เมื่อสร้าง ticket ไม่สำเร็จ)
+&gt; 
+&gt; โดยรวมเขียนสเปกได้ครอบคลุมและดีมาก
+
+### Partner&apos;s response (PR #23 for partner lmaybelgracel):
+&gt; &gt; ## Peer Review Comments for Issue #23 / PR: Sprint Engineering Specification (`docs/lab-02/specification.md`)
+&gt; &gt; ภาพรวมสเปกทำได้ดีมาก โครงสร้างตรงตาม Appendix A ของ Lab 2 Handout กำหนด Scope และ Zen Green Theme ได้ชัดเจนดีมาก
+&gt; &gt; 
+&gt; &gt; ขอเสนอแนะเพิ่มเติมเล็กน้อยเพื่อความสมบูรณ์ก่อนเริ่ม Implement:
+&gt; &gt; 
+&gt; &gt; 1. **[BR Strategy] เพิ่มความชัดเจนเรื่อง Transaction เมื่ออัปโหลดไฟล์ล้มเหลว:**
+&gt; &gt;    
+&gt; &gt;    * ใน Section 5 (Business Rules) อยากให้ระบุพฤติกรรมชัดเจนตามโจทย์หน้า 5 ว่า หากสร้าง Ticket สำเร็จแต่อัปโหลด Attachment ไม่สำเร็จ ระบบจะใช้ Rollback Transaction ทั้งหมด หรือจะสร้าง Ticket ไว้แล้วแจ้ง error การไฟล์แนบ
+&gt; &gt; 2. **[BR Validation] กำหนดความยาวของ `removalReason`:**
+&gt; &gt;    
+&gt; &gt;    * แนะนำเพิ่ม constraint ของ `removalReason` ใน BR-07/BR-08 เช่น ต้องเป็นข้อความตัด whitespace แล้ว ความยาวระหว่าง 3 - 250 ตัวอักษร เพื่อให้ครอบคลุมการทดสอบ validation
+&gt; &gt; 3. **[Data Schema] ระบุ Prisma Indexes (โจทย์ Section 5.2):**
+&gt; &gt;    
+&gt; &gt;    * ใน Section 7 อยากให้ระบุ Index สำหรับ Prisma schema เพิ่มเติม เช่น `@@index([requesterId])` และ `@@index([requesterId, createdAt])` บน `Ticket` เพื่อรองรับการทำ Query/Pagination ใน My Tickets
+&gt; &gt; 4. **[API Standard] ระบุ HTTP Header สำหรับ Requester Context:**
+&gt; &gt;    
+&gt; &gt;    * ใน Section 8 แนะนำตกลงมาตรฐาน Header เช่น `X-Development-Requester-Id: &lt;id&gt;` ในการส่ง context ของ Dev Requester เพื่อให้ Frontend และ API Test ทำงานตรงกัน
+&gt; &gt; 5. **[Acceptance Criteria] เพิ่ม AC สำหรับ No-results และ Error State:**
+&gt; &gt;    
+&gt; &gt;    * เสนอเพิ่ม AC-08 (No-results state เมื่อ search/filter ไม่พบข้อมูล) และ AC-09 (Safe Error State แสดงแจ้งเตือนแต่ยังคงค่าในฟอร์มไว้เมื่อสร้าง ticket ไม่สำเร็จ)
+&gt; &gt; 
+&gt; &gt; โดยรวมเขียนสเปกได้ครอบคลุมและดีมาก
+&gt; 
+&gt; ขอบคุณมากสำหรับข้อเสนอแนะที่มีประโยชน์มากค่ะ ได้ทำการปรับปรุงเอกสาร docs/lab-02/specification.md และ push อัปเดตเข้า PR เรียบร้อยแล้วดังนี้:
+&gt; 
+&gt; 1. [BR Strategy] เพิ่ม BR-11 กำหนดการใช้ Atomic Database Transaction ในการสร้าง Ticket ร่วมกับไฟล์แนบเริ่มต้น หากการอัปโหลดหรือสร้าง metadata ล้มเหลว ระบบจะ Rollback ทั้งหมดเพื่อรักษาความถูกต้องของข้อมูล
+&gt; 2. [BR Validation] ปรับปรุง BR-07 และ BR-08 กำหนดให้ removalReason ต้องมีความยาวระหว่าง 3 - 250 ตัวอักษรหลัง trim whitespace
+&gt; 3. [Data Schema] เพิ่ม Prisma Indexes บน Ticket model (@@index([requesterId]), @@index([requesterId, createdAt])) เพื่อรองรับ Query/Pagination ใน My Tickets
+&gt; 4. [API Standard] กำหนดมาตรฐาน Header เป็น X-Development-Requester-Id ใน Section 8 สำหรับส่ง Dev Requester context
+&gt; 5. [Acceptance Criteria] เพิ่ม AC-08 (No-results state เมื่อไม่พบข้อมูล) และ AC-09 (Safe Error State คงค่าในฟอร์มไว้เมื่อเกิด error)
+&gt; 
+&gt; รบกวนตรวจสอบอีกครั้งและช่วยกด Merge pull request เข้า lab2-staging ได้เลยค่ะ
+
+### My comment (PR #24 for partner lmaybelgracel):
+&gt; ### PR Review: Issue 6 — UI and API Specifications (#24)
+&gt; 
+&gt; **Comment:**
+&gt; เอกสาร UI Specification และ API Contract ใน `docs/lab-02/specification.md` เขียนได้ครอบคลุมและชัดเจนดีมาก มีการกำหนดธีมสี Zen Green พร้อม Hex Code ชัดเจน และมี Endpoints ครอบคลุมการทำงานของ Requester ทั้งหมด รวมถึงการใช้ Header `X-Development-Requester-Id` สำหรับแยก Identity
+&gt; 
+&gt; **ข้อเสนอแนะเพิ่มเติมเล็กน้อย:**
+&gt; 1. ใน UI Spec อาจระบุสีของ Priority/Status Badge และ Visual State ของไฟล์ที่โดน Soft-remove (เช่น Strikethrough/แสดงเหตุผลการลบ) เพิ่มเติม
+&gt; 2. ใน API Spec อยากเสนอให้ใส่ HTTP Status Codes (200, 201, 400, 403, 404, 410) และ Request Body สำหรับ `DELETE /api/attachments/:id` (`removalReason`) ให้ชัดเจนยิ่งขึ้น
+
+### Partner&apos;s response (PR #24 for partner lmaybelgracel):
+&gt; &gt; ### PR Review: Issue 6 — UI and API Specifications (#24)
+&gt; &gt; **Comment:** เอกสาร UI Specification และ API Contract ใน `docs/lab-02/specification.md` เขียนได้ครอบคลุมและชัดเจนดีมาก มีการกำหนดธีมสี Zen Green พร้อม Hex Code ชัดเจน และมี Endpoints ครอบคลุมการทำงานของ Requester ทั้งหมด รวมถึงการใช้ Header `X-Development-Requester-Id` สำหรับแยก Identity
+&gt; &gt; 
+&gt; &gt; **ข้อเสนอแนะเพิ่มเติมเล็กน้อย:**
+&gt; &gt; 
+&gt; &gt; 1. ใน UI Spec อาจระบุสีของ Priority/Status Badge และ Visual State ของไฟล์ที่โดน Soft-remove (เช่น Strikethrough/แสดงเหตุผลการลบ) เพิ่มเติม
+&gt; &gt; 2. ใน API Spec อยากเสนอให้ใส่ HTTP Status Codes (200, 201, 400, 403, 404, 410) และ Request Body สำหรับ `DELETE /api/attachments/:id` (`removalReason`) ให้ชัดเจนยิ่งขึ้น
+&gt; 
+&gt; ขอบคุณมากสำหรับคำแนะนำและข้อเสนอแนะที่มีประโยชน์มากค่ะ ได้ทำการอัปเดตเอกสาร docs/lab-02/ui-spec.md และ push ขึ้น PR #24 เรียบร้อยแล้วดังนี้ค่ะ:
+&gt; 
+&gt; 1. [UI Spec - Priority/Status Badges] เพิ่ม Section 3 กำหนดโทนสี Hex Code ของ Priority Badges (HIGH: Red #B71C1C, MEDIUM: Amber #E65100, LOW: Green #2E7D32) และ Status Badge (NEW: Primary Green #006B3C)
+&gt; 2. [UI Spec - Soft-removed Visual State] ปรับปรุง Section 6.4 กำหนดรูปแบบ Visual State ของไฟล์ที่ถูกลบ ได้แก่ ชื่อไฟล์ใช้ Strikethrough, ตัวหนังสือสีจาง #5A6E63, แสดงป้าย Removed พร้อมแสดงเหตุผลการลบและเวลา, และปิดปุ่มดาวน์โหลด/พรีวิว
+&gt; 3. [API Spec] ใน api-spec.md มีตาราง HTTP Status Codes (200, 201, 400, 403, 404, 410, 422, 500) อยู่ใน Section 2 และมี Request Body ของ DELETE /api/attachments/:id ({ &quot;removalReason&quot;: &quot;...&quot; }) อยู่ใน Section 3.9 เรียบร้อยแล้วค่ะ
+&gt; 
+&gt; รบกวนตรวจสอบอีกครั้ง และช่วยกด Approve พร้อมกด &quot;Merge pull request&quot; เข้า lab2-staging ให้ด้วยนะคะ
+
+### My comment (PR #25 for partner lmaybelgracel):
+&gt; ### Peer Review: Issue 7 — Test Plan and Traceability (#25)
+&gt; 
+&gt; สวัสดีจ้า ได้ทำการรีวิวเอกสารแผนการทดสอบและตาราง Traceability Matrix สำหรับ Lab 2 เรียบร้อยแล้ว โดยรวมวางโครงสร้างและกำหนดขอบเขตการทดสอบได้ดีมาก ขอส่งสรุปผลการรีวิวและข้อแนะนำเพิ่มเติมดังนี้:
+&gt; 
+&gt; ---
+&gt; 
+&gt; #### จุดที่ทำได้ดี (Strengths)
+&gt; 1. **Multi-layer Testing Architecture:** วางแผนการทดสอบได้ครอบคลุมหลายระดับ ทั้ง API Integration (Supertest), UI Component (Vitest) และ E2E Workflow (Playwright)
+&gt; 2. **Security &amp; Data Ownership Boundary:** มีการกำหนดเคสทดสอบสำหรับสิทธิ์การเข้าถึงข้อมูลตาม Requester Context (`X-Development-Requester-Id`) ป้องกันการเข้าถึงข้อมูลข้ามตัวตน (Cross-Requester Data Access) ชัดเจน
+&gt; 3. **Requirement Mapping:** โครงสร้างตาราง Traceability Matrix มีการเชื่อมโยง Test ID กับ Functional Requirements (FR) และ Acceptance Criteria (AC) ได้อย่างเป็นระบบ
+&gt; 
+&gt; ---
+&gt; 
+&gt; #### ข้อแนะนำเพิ่มเติมสำหรับปรับปรุง (Actionable Suggestions)
+&gt; 
+&gt; 1. **เพิ่ม Test Cases สำหรับ Edge Cases &amp; Business Rules ให้ครบถ้วน:**
+&gt;    - **Soft-Removal Download Blocking (BR-07, AC-06):** แนะนำให้ระบุเคสทดสอบยืนยันว่าเมื่อซอฟต์ลบไฟล์แนบแล้ว ลิงก์ดาวน์โหลดจะต้องคืนค่า **HTTP 410 Gone / 404 Not Found** และต้องมีการตรวจสอบความยาวของเหตุผลในการลบ (`removalReason` 3 - 250 ตัวอักษร)
+&gt;    - **Active Attachment Limit (BR-06, AC-05):** เพิ่มเคสทดสอบการอัปโหลดไฟล์แนบใบที่ 6 (เมื่อมีไฟล์ Active ครบ 5 ไฟล์แล้ว) ว่าระบบต้องปฏิเสธด้วย **HTTP 400 Bad Request**
+&gt;    - **Atomic Transaction Rollback (BR-11):** เพิ่มเคสทดสอบยืนยันว่าหากการเซฟไฟล์แนบตอนสร้าง Ticket ล้มเหลว ตั๋ว Ticket ต้องถูก Rollback ทั้งหมดเพื่อไม่ให้เกิด Orphaned Record ในฐานข้อมูล
+&gt; 
+&gt; 2. **Form Data Retention on Error (BR-09, AC-09):**
+&gt;    - แนะนำให้ระบุเคสทดสอบฝั่ง UI Component ยืนยันว่าเมื่อการส่งฟอร์มสร้าง Ticket ล้มเหลว ข้อมูลที่กรอกค้างไว้ในฟอร์มจะต้องไม่สูญหาย
+&gt; 
+&gt; 3. **อัปเดต Test Evidence &amp; File Paths:**
+&gt;    - ตรวจสอบการใช้ Relative Path ของไฟล์ทดสอบให้ถูกต้อง เช่น `server/tests/lab-02/...` และ `client/tests/lab-02/...`
+&gt;    - รบกวนแนบผลลัพธ์การรันคำสั่ง `npm test` (Terminal Execution Output) ล่าสุดลงในส่วน Evidence ของเอกสาร `docs/lab-02/tests.md` เพื่อให้ตรงตาม Definition of Done (DoD)
+&gt; 
+&gt; ---
+&gt; 
+&gt; #### สรุปผลการรีวิว (Verdict)
+&gt; โดยรวมทำได้ดีมากแล้ว รบกวนลองเช็กและอัปเดตจุดข้างต้นเพิ่มเติมอีกนิดหน่อย เมื่ออัปเดตเรียบร้อยแล้วแจ้งได้เลยนะ เดี๋ยวเข้ามา Approve ให้นะ
+
+### Partner&apos;s response (PR #25 for partner lmaybelgracel):
+&gt; &gt; ### Peer Review: Issue 7 — Test Plan and Traceability (#25)
+&gt; &gt; สวัสดีจ้า ได้ทำการรีวิวเอกสารแผนการทดสอบและตาราง Traceability Matrix สำหรับ Lab 2 เรียบร้อยแล้ว โดยรวมวางโครงสร้างและกำหนดขอบเขตการทดสอบได้ดีมาก ขอส่งสรุปผลการรีวิวและข้อแนะนำเพิ่มเติมดังนี้:
+&gt; &gt; 
+&gt; &gt; #### จุดที่ทำได้ดี (Strengths)
+&gt; &gt; 1. **Multi-layer Testing Architecture:** วางแผนการทดสอบได้ครอบคลุมหลายระดับ ทั้ง API Integration (Supertest), UI Component (Vitest) และ E2E Workflow (Playwright)
+&gt; &gt; 2. **Security &amp; Data Ownership Boundary:** มีการกำหนดเคสทดสอบสำหรับสิทธิ์การเข้าถึงข้อมูลตาม Requester Context (`X-Development-Requester-Id`) ป้องกันการเข้าถึงข้อมูลข้ามตัวตน (Cross-Requester Data Access) ชัดเจน
+&gt; &gt; 3. **Requirement Mapping:** โครงสร้างตาราง Traceability Matrix มีการเชื่อมโยง Test ID กับ Functional Requirements (FR) และ Acceptance Criteria (AC) ได้อย่างเป็นระบบ
+&gt; &gt; 
+&gt; &gt; #### ข้อแนะนำเพิ่มเติมสำหรับปรับปรุง (Actionable Suggestions)
+&gt; &gt; 1. **เพิ่ม Test Cases สำหรับ Edge Cases &amp; Business Rules ให้ครบถ้วน:**
+&gt; &gt;    
+&gt; &gt;    * **Soft-Removal Download Blocking (BR-07, AC-06):** แนะนำให้ระบุเคสทดสอบยืนยันว่าเมื่อซอฟต์ลบไฟล์แนบแล้ว ลิงก์ดาวน์โหลดจะต้องคืนค่า **HTTP 410 Gone / 404 Not Found** และต้องมีการตรวจสอบความยาวของเหตุผลในการลบ (`removalReason` 3 - 250 ตัวอักษร)
+&gt; &gt;    * **Active Attachment Limit (BR-06, AC-05):** เพิ่มเคสทดสอบการอัปโหลดไฟล์แนบใบที่ 6 (เมื่อมีไฟล์ Active ครบ 5 ไฟล์แล้ว) ว่าระบบต้องปฏิเสธด้วย **HTTP 400 Bad Request**
+&gt; &gt;    * **Atomic Transaction Rollback (BR-11):** เพิ่มเคสทดสอบยืนยันว่าหากการเซฟไฟล์แนบตอนสร้าง Ticket ล้มเหลว ตั๋ว Ticket ต้องถูก Rollback ทั้งหมดเพื่อไม่ให้เกิด Orphaned Record ในฐานข้อมูล
+&gt; &gt; 2. **Form Data Retention on Error (BR-09, AC-09):**
+&gt; &gt;    
+&gt; &gt;    * แนะนำให้ระบุเคสทดสอบฝั่ง UI Component ยืนยันว่าเมื่อการส่งฟอร์มสร้าง Ticket ล้มเหลว ข้อมูลที่กรอกค้างไว้ในฟอร์มจะต้องไม่สูญหาย
+&gt; &gt; 3. **อัปเดต Test Evidence &amp; File Paths:**
+&gt; &gt;    
+&gt; &gt;    * ตรวจสอบการใช้ Relative Path ของไฟล์ทดสอบให้ถูกต้อง เช่น `server/tests/lab-02/...` และ `client/tests/lab-02/...`
+&gt; &gt;    * รบกวนแนบผลลัพธ์การรันคำสั่ง `npm test` (Terminal Execution Output) ล่าสุดลงในส่วน Evidence ของเอกสาร `docs/lab-02/tests.md` เพื่อให้ตรงตาม Definition of Done (DoD)
+&gt; &gt; 
+&gt; &gt; #### สรุปผลการรีวิว (Verdict)
+&gt; &gt; โดยรวมทำได้ดีมากแล้ว รบกวนลองเช็กและอัปเดตจุดข้างต้นเพิ่มเติมอีกนิดหน่อย เมื่ออัปเดตเรียบร้อยแล้วแจ้งได้เลยนะ เดี๋ยวเข้ามา Approve ให้นะ
+&gt; 
+&gt; ขอบคุณสำหรับคำแนะนำและข้อเสนอแนะที่มีประโยชน์มากค่ะ ได้ทำการปรับปรุงเอกสาร docs/lab-02/tests.md และ push ขึ้น PR #25 เรียบร้อยแล้วดังนี้ค่ะ:
+&gt; 
+&gt; 1. [Edge Cases &amp; Business Rules] ปรับรายละเอียดเคสทดสอบ API-07 (ปฏิเสธไฟล์ที่ 6 ด้วย HTTP 400), API-08 (ตรวจสอบ removalReason 3-250 ตัวอักษร), API-09 (บล็อกดาวน์โหลดไฟล์ที่ถูกลบด้วย HTTP 410/404) และ API-10 (Rollback ทั้งหมดเมื่อเซฟไฟล์ล้มเหลว)
+&gt; 2. [Form Data Retention] ระบุการตรวจสอบในเคส UI-03 ชัดเจนว่าเมื่อเกิด error ข้อมูลที่กรอกค้างในฟอร์มจะไม่สูญหาย
+&gt; 3. [File Paths &amp; Execution Note] ตรวจสอบ Relative Path ของไฟล์ทดสอบเรียบร้อยแล้ว และระบุหมายเหตุใน Section 6 ว่าไฟล์ทดสอบจะถูกเขียนและรันจริงพร้อมแนบ Terminal Execution Output ในขั้นตอน Implementation (Issues 8-15) ตามหลัก TDD ค่ะ
+&gt; 
+&gt; รบกวนตรวจสอบอีกครั้ง และช่วยกด Approve พร้อมกด &quot;Merge pull request&quot; เข้า lab2-staging ให้ด้วยนะคะ
+
+### My comment (PR #26 for partner lmaybelgracel):
+&gt; ดูภาพรวมของ PR #26 (Issue 8: Database Schema and Seed Data) แล้วทำได้ตรงตาม Specification ของ Lab 2 ครบถ้วนและเรียบร้อยมาก
+&gt; 
+&gt; จุดที่ชอบและออกแบบได้ดี:
+&gt; 1. schema.prisma: ออกแบบ Models ครบถ้วน มีการตั้งค่า Enums (Priority, TicketStatus), Unique Constraints และสร้าง @@index สำหรับ Foreign Keys ต่างๆ ได้ครอบคลุม ช่วยเรื่อง performance ในการ Query
+&gt; 2. Attachment Model: มี fields รองรับ Soft Removal (isRemoved, removedAt, removalReason) ตาม BR-07 และตั้งค่า onDelete: Cascade ไว้อย่างเหมาะสม
+&gt; 3. seed.ts: ใช้งาน upsert สำหรับทุก Entity ทำให้รัน Seed ซ้ำได้โดยไม่เกิดข้อมูลซ้ำ (Idempotency ตาม BR-10) รวมถึงเตรียมข้อมูล Requesters ทั้ง Active และ Inactive ไว้รองรับการทดสอบ Context Switching ได้ดีมาก
+&gt; 
+&gt; ข้อเสนอแนะเพิ่มเติมก่อน Merge:
+&gt; - อย่าลืมสร้าง/ตรวจสอบไฟล์ Prisma Migration (npx prisma migrate dev) และ commit โฟลเดอร์ server/prisma/migrations/ ขึ้น Git เพื่อให้สมาชิกในทีม sync database schema ได้ตรงกัน
+
+### Partner&apos;s response (PR #26 for partner lmaybelgracel):
+&gt; &gt; ดูภาพรวมของ PR #26 (Issue 8: Database Schema and Seed Data) แล้วทำได้ตรงตาม Specification ของ Lab 2 ครบถ้วนและเรียบร้อยมาก
+&gt; &gt; 
+&gt; &gt; จุดที่ชอบและออกแบบได้ดี:
+&gt; &gt; 
+&gt; &gt; 1. schema.prisma: ออกแบบ Models ครบถ้วน มีการตั้งค่า Enums (Priority, TicketStatus), Unique Constraints และสร้าง @@index สำหรับ Foreign Keys ต่างๆ ได้ครอบคลุม ช่วยเรื่อง performance ในการ Query
+&gt; &gt; 2. Attachment Model: มี fields รองรับ Soft Removal (isRemoved, removedAt, removalReason) ตาม BR-07 และตั้งค่า onDelete: Cascade ไว้อย่างเหมาะสม
+&gt; &gt; 3. seed.ts: ใช้งาน upsert สำหรับทุก Entity ทำให้รัน Seed ซ้ำได้โดยไม่เกิดข้อมูลซ้ำ (Idempotency ตาม BR-10) รวมถึงเตรียมข้อมูล Requesters ทั้ง Active และ Inactive ไว้รองรับการทดสอบ Context Switching ได้ดีมาก
+&gt; &gt; 
+&gt; &gt; ข้อเสนอแนะเพิ่มเติมก่อน Merge:
+&gt; &gt; 
+&gt; &gt; * อย่าลืมสร้าง/ตรวจสอบไฟล์ Prisma Migration (npx prisma migrate dev) และ commit โฟลเดอร์ server/prisma/migrations/ ขึ้น Git เพื่อให้สมาชิกในทีม sync database schema ได้ตรงกัน
+&gt; 
+&gt; ขอบคุณมากสำหรับข้อเสนอแนะ ได้ทำการสร้างไฟล์ Prisma Migration DDL สำหรับ Lab 2 (server/prisma/migrations/20260901000000_lab2_models/migration.sql) ครอบคลุม Tables, Enums, Constraints และ Indexes ทั้งหมด พร้อมทั้ง commit ขึ้น PR #26 เรียบร้อยแล้วค่ะ สมาชิกในทีมสามารถสั่ง sync schema ผ่าน npx prisma migrate dev ได้ทันที
+&gt; 
+&gt; รบกวนช่วยกด Approve และกด &quot;Merge pull request&quot; เข้า lab2-staging ให้ด้วยนะคะ
+
+### My comment (PR #27 for partner lmaybelgracel):
+&gt; ### PR #27 (feature/lab2-requester-context - Issue 9: Development Requester Context)
+&gt; **Reviewer Comment:**
+&gt; ฟีเจอร์ Development Requester Context ทำได้ตรงตามข้อกำหนด FR-01, FR-02, FR-03, BR-03, AC-02 และ AC-07
+&gt; การแสดงผลหน้า Requester Selector มี Banner แจ้งเตือนสภาวะ Context Test ชัดเจน UI สวยงามตาม Zen Green Design System 
+&gt; มี API Test ครอบคลุมการส่งคืนข้อมูล และการกรอง Inactive Users ออกจากระบบเรียบร้อยแล้ว
+&gt; 
+&gt; ข้อเสนอแนะเพิ่มเติมก่อน Merge:
+&gt; 1. ใน `client/vite.config.ts` ควรอัปเดต `include` เป็น `[&quot;src/__tests__/**/*.test.tsx&quot;, &quot;tests/**/*.test.tsx&quot;]` เพื่อให้ Vitest สามารถตรวจพบและรันไฟล์ `RequesterSelector.test.tsx` ใน `npm test` ได้อย่างสมบูรณ์
+&gt; 2. ใน `client/src/App.tsx` มี Typo property `maxWdith` ใน `styles.headerInner` แนะนำลบออกเพื่อความสะอาดของโค้ด
+
+### Partner&apos;s response (PR #27 for partner lmaybelgracel):
+&gt; &gt; ### PR #27 (feature/lab2-requester-context - Issue 9: Development Requester Context)
+&gt; &gt; **Reviewer Comment:** ฟีเจอร์ Development Requester Context ทำได้ตรงตามข้อกำหนด FR-01, FR-02, FR-03, BR-03, AC-02 และ AC-07 การแสดงผลหน้า Requester Selector มี Banner แจ้งเตือนสภาวะ Context Test ชัดเจน UI สวยงามตาม Zen Green Design System มี API Test ครอบคลุมการส่งคืนข้อมูล และการกรอง Inactive Users ออกจากระบบเรียบร้อยแล้ว
+&gt; &gt; 
+&gt; &gt; ข้อเสนอแนะเพิ่มเติมก่อน Merge:
+&gt; &gt; 
+&gt; &gt; 1. ใน `client/vite.config.ts` ควรอัปเดต `include` เป็น `[&quot;src/__tests__/**/*.test.tsx&quot;, &quot;tests/**/*.test.tsx&quot;]` เพื่อให้ Vitest สามารถตรวจพบและรันไฟล์ `RequesterSelector.test.tsx` ใน `npm test` ได้อย่างสมบูรณ์
+&gt; &gt; 2. ใน `client/src/App.tsx` มี Typo property `maxWdith` ใน `styles.headerInner` แนะนำลบออกเพื่อความสะอาดของโค้ด
+&gt; 
+&gt; ขอบคุณสำหรับ Code Review มากๆ เลยนะคะ
+&gt; 
+&gt; ได้ดำเนินการแก้ไขตามข้อเสนอแนะเพิ่มเติมเรียบร้อยแล้วค่ะ:
+&gt; 
+&gt; 1. อัปเดตไฟล์ client/vite.config.ts โดยเพิ่ม include เป็น [&quot;src/__tests__/**/*.test.tsx&quot;, &quot;tests/**/*.test.tsx&quot;] เรียบร้อยแล้วค่ะ ทำให้ Vitest สามารถตรวจพบและรันไฟล์ RequesterSelector.test.tsx ผ่านครบทุกเคสแล้วค่ะ
+&gt; 2. ลบ typo property maxWdith ออกจาก styles.headerInner ใน client/src/App.tsx เรียบร้อยแล้วค่ะ
+&gt; 3. ปรับปรุง mock ใน server/tests/lab-02/requester-context.api.test.ts ทำให้ API Test รันผ่านสมบูรณ์ 100% แล้วค่ะ
+&gt; 
+&gt; ทำการ push commit แก้ไขขึ้น PR เรียบร้อยแล้วนะคะ รบกวนตรวจสอบและ Approve เพื่อ Merge ได้เลยค่ะ ขอบคุณมากค่ะ
+
+### My comment (PR #28 for partner lmaybelgracel):
+&gt; ตรวจสอบโค้ดและผลการทดสอบของ **Issue 10: Create Ticket Workflow and Reference Data APIs (#28)** เรียบร้อยแล้ว:
+&gt; 
+&gt; 1. **Backend APIs:** Implement `GET /api/categories`, `GET /api/related-systems`, และ `POST /api/tickets` ได้ตรงตาม specification มีการตรวจเช็ก `X-Development-Requester-Id`, สถานะ active ของ Requester, validation ของ summary/description, และสร้างรหัส `TKT-YYYY-XXXXXX` พร้อมสถานะเริ่มต้น `NEW` ได้ถูกต้อง
+&gt; 2. **Frontend UI:** หน้าจอ `CreateTicket.tsx` ตกแต่งได้สวยงามตาม **Zen Green Theme** มี Read-only section, Character Counter, Segmented Priority Buttons, และทำตามข้อกำหนด Form Data Retention (BR-09) เมื่อเกิด error ได้ครบถ้วน
+&gt; 3. **Automated Tests:** รัน Vitest ทั้งฝั่ง Server (`reference-data.api.test.ts`, `create-ticket.api.test.ts`) และ Client (`CreateTicket.test.tsx`) ผ่าน 100% ครอบคลุมทุกสภาวะ
+&gt; 
+&gt; **ข้อเสนอแนะเล็กน้อย (Non-blocking):**
+&gt; - ใน `POST /api/tickets` อาจเพิ่มการเช็ก `category.isActive === true` และ `relatedSystem.isActive === true` เพื่อป้องกันการส่ง ID หมวดหมู่ที่ถูกปิดใช้งานเข้ามา
+&gt; 
+&gt; ภาพรวมทำได้ดีมาก
+
+### Partner&apos;s response (PR #28 for partner lmaybelgracel):
+&gt; &gt; ตรวจสอบโค้ดและผลการทดสอบของ **Issue 10: Create Ticket Workflow and Reference Data APIs (#28)** เรียบร้อยแล้ว:
+&gt; &gt; 
+&gt; &gt; 1. **Backend APIs:** Implement `GET /api/categories`, `GET /api/related-systems`, และ `POST /api/tickets` ได้ตรงตาม specification มีการตรวจเช็ก `X-Development-Requester-Id`, สถานะ active ของ Requester, validation ของ summary/description, และสร้างรหัส `TKT-YYYY-XXXXXX` พร้อมสถานะเริ่มต้น `NEW` ได้ถูกต้อง
+&gt; &gt; 2. **Frontend UI:** หน้าจอ `CreateTicket.tsx` ตกแต่งได้สวยงามตาม **Zen Green Theme** มี Read-only section, Character Counter, Segmented Priority Buttons, และทำตามข้อกำหนด Form Data Retention (BR-09) เมื่อเกิด error ได้ครบถ้วน
+&gt; &gt; 3. **Automated Tests:** รัน Vitest ทั้งฝั่ง Server (`reference-data.api.test.ts`, `create-ticket.api.test.ts`) และ Client (`CreateTicket.test.tsx`) ผ่าน 100% ครอบคลุมทุกสภาวะ
+&gt; &gt; 
+&gt; &gt; **ข้อเสนอแนะเล็กน้อย (Non-blocking):**
+&gt; &gt; 
+&gt; &gt; * ใน `POST /api/tickets` อาจเพิ่มการเช็ก `category.isActive === true` และ `relatedSystem.isActive === true` เพื่อป้องกันการส่ง ID หมวดหมู่ที่ถูกปิดใช้งานเข้ามา
+&gt; &gt; 
+&gt; &gt; ภาพรวมทำได้ดีมาก
+&gt; 
+&gt; ขอบคุณสำหรับ Code Review และคำแนะนำ
+&gt; 
+&gt; ได้นำข้อเสนอแนะเพิ่มเติมมาปรับปรุงในระบบเรียบร้อยแล้วค่ะ:
+&gt; 1. อัปเดต API POST /api/tickets ใน server/src/app.ts ให้ตรวจสอบ category.isActive === true และ relatedSystem.isActive === true ก่อนสร้าง Ticket เพื่อป้องกันไม่ให้ผู้ใช้ส่ง ID ของหมวดหมู่หรือระบบที่ปิดใช้งานอยู่เข้ามาได้อย่างรัดกุม 100% ค่ะ
+&gt; 2. พุชโค้ดที่ปรับปรุงเพิ่มเติมขึ้น PR #28 เรียบร้อยแล้วค่ะ ขอบคุณมากนะคะ
+
+### My comment (PR #29 for partner lmaybelgracel):
+&gt; **Review Summary:**
+&gt; ตรวจสอบ PR #29 เรียบร้อยแล้ว โค้ดตรงตามข้อกำหนดของ Issue 11 และสเปกใน `api-spec.md` และ `ui-spec.md` ครบถ้วน:
+&gt; 1. **Backend (`GET /api/tickets`):** รองรับ Header `X-Development-Requester-Id`, กรองข้อมูลแยกตาม Requester Context อย่างชัดเจน, มีการค้นหาแบบ case-insensitive บน ticketNumber และ summary, รองรับ filter ตาม category/priority/status, การเรียงลำดับ (sort), และ Pagination พร้อมส่งคืน metadata ครบถ้วน
+&gt; 2. **Frontend UI:** ออกแบบตาม Zen Green Theme แสดงผล Priority Badges (Low/Medium/High) และ Status Badge (New) ด้วยโค้ดสีตรงตามข้อกำหนด มีการจัดการ Empty State และ No-Results State พร้อมปุ่ม Clear Filters และ Pagination Footer
+&gt; 3. **Automated Tests:** ทดสอบแล้วทั้ง Server API Integration Tests (`my-tickets.api.test.ts` 4/4 passed) และ Client UI Component Tests (`MyTickets.test.tsx` 2/2 passed) ผ่าน 100%
+&gt; **ข้อเสนอแนะเพิ่มเติม (Minor Recommendations)**
+&gt; 1. Debounce สำหรับ Search Input (Client):
+&gt; ในปัจจุบันการพิมพ์ในช่อง Search จะอัปเดต state ทันที สามารถพิจารณาเติม Debounce (ประมาณ 300ms) ในอนาคต เพื่อลดจำนวน HTTP Requests ไปยัง Backend เมื่อมีข้อมูลปริมาณมาก
+&gt; 2. ขจัด Warning ใน Vitest UI Test (act(...) Warning):
+&gt; ในไฟล์ MyTickets.test.tsx มี warning ของ React เกี่ยวกับ act(...) เล็กน้อยขณะจำลองการเปลี่ยนค่าในช่องค้นหา สามารถแก้ไขได้ด้วยการห่อการเรียก fireEvent.change ไว้ใน await waitFor(...)
+
+### Partner&apos;s response (PR #29 for partner lmaybelgracel):
+&gt; &gt; **Review Summary:** ตรวจสอบ PR #29 เรียบร้อยแล้ว โค้ดตรงตามข้อกำหนดของ Issue 11 และสเปกใน `api-spec.md` และ `ui-spec.md` ครบถ้วน:
+&gt; &gt; 
+&gt; &gt; 1. **Backend (`GET /api/tickets`):** รองรับ Header `X-Development-Requester-Id`, กรองข้อมูลแยกตาม Requester Context อย่างชัดเจน, มีการค้นหาแบบ case-insensitive บน ticketNumber และ summary, รองรับ filter ตาม category/priority/status, การเรียงลำดับ (sort), และ Pagination พร้อมส่งคืน metadata ครบถ้วน
+&gt; &gt; 2. **Frontend UI:** ออกแบบตาม Zen Green Theme แสดงผล Priority Badges (Low/Medium/High) และ Status Badge (New) ด้วยโค้ดสีตรงตามข้อกำหนด มีการจัดการ Empty State และ No-Results State พร้อมปุ่ม Clear Filters และ Pagination Footer
+&gt; &gt; 3. **Automated Tests:** ทดสอบแล้วทั้ง Server API Integration Tests (`my-tickets.api.test.ts` 4/4 passed) และ Client UI Component Tests (`MyTickets.test.tsx` 2/2 passed) ผ่าน 100%
+&gt; &gt;    **ข้อเสนอแนะเพิ่มเติม (Minor Recommendations)**
+&gt; &gt; 4. Debounce สำหรับ Search Input (Client):
+&gt; &gt;    ในปัจจุบันการพิมพ์ในช่อง Search จะอัปเดต state ทันที สามารถพิจารณาเติม Debounce (ประมาณ 300ms) ในอนาคต เพื่อลดจำนวน HTTP Requests ไปยัง Backend เมื่อมีข้อมูลปริมาณมาก
+&gt; &gt; 5. ขจัด Warning ใน Vitest UI Test (act(...) Warning):
+&gt; &gt;    ในไฟล์ MyTickets.test.tsx มี warning ของ React เกี่ยวกับ act(...) เล็กน้อยขณะจำลองการเปลี่ยนค่าในช่องค้นหา สามารถแก้ไขได้ด้วยการห่อการเรียก fireEvent.change ไว้ใน await waitFor(...)
+&gt; 
+&gt; ขอบคุณสำหรับคำแนะนำนะคะ แก้เรียบร้อยแล้วค่ะ
+&gt; - เพิ่ม debounce 250ms ให้ช่อง Search เพื่อลดการเรียก API ถี่เกินไป
+&gt; - แก้ test ใน MyTickets.test.tsx แล้ว ตอนนี้ไม่มี act(...) warning
+&gt; - เพิ่ม test สำหรับ query ที่ไม่ถูกต้อง และปรับหน้า mobile เพิ่มเติม
+&gt; ตอนนี้ test ผ่านทั้งหมดและ push ขึ้น PR #29 แล้วค่ะ รบกวนช่วยตรวจอีกรอบได้เลย ขอบคุณค่ะ
+
+### My comment (PR #30 for partner lmaybelgracel):
+&gt; ตรวจ schema, migration และ seed data แล้วค่ะ ภาพรวมจัดโครงสร้างได้ดีและครอบคลุมงานส่วนฐานข้อมูลของ Feature 6 ค่ะ การใช้ upsert กับ seed data เหมาะกับการรันซ้ำ และข้อมูลที่เตรียมไว้ก็ครบตามที่ feature นี้ต้องใช้
+&gt; มีจุดหนึ่งที่อยากเสนอให้ปรับเพิ่มเติมค่ะ ใน Attachment มีฟิลด์ removedByRequesterId สำหรับเก็บผู้ที่นำไฟล์ออก แต่ตอนนี้ฟิลด์นี้ยังไม่ได้เชื่อม relation กับ DevelopmentRequester ถ้าเพิ่ม relation และ foreign key เข้าไป จะช่วยให้ข้อมูลมีความถูกต้องมากขึ้น และป้องกันการบันทึก requester ID ที่ไม่มีอยู่จริงค่ะ
+&gt; หลังจากเพิ่ม relation แล้ว แนะนำให้สร้าง migration ใหม่ และลองรัน migration, seed สองรอบ รวมถึง tests อีกครั้ง เพื่อเช็กว่ายังทำงานได้ตามเดิมและไม่มีข้อมูลซ้ำค่ะ
+&gt; ส่วนอื่นโดยรวมเรียบร้อยดีค่ะ หลังปรับจุดนี้แล้วน่าจะพร้อมสำหรับการตรวจรอบถัดไปค่ะ
+
+### Partner&apos;s response (PR #30 for partner lmaybelgracel):
+&gt; แก้ครบทั้ง 3 ข้อแล้วนะ
+&gt; 
+&gt; - เพิ่มตรวจ isActive ของ Requester ก่อนอัปโหลดไฟล์
+&gt; - เพิ่มเช็กประเภทและขนาดไฟล์ฝั่งหน้าเว็บก่อนส่ง request
+&gt; - เพิ่ม word-break: break-word ให้ชื่อไฟล์ยาวบนมือถือ
+&gt; 
+&gt; เพิ่ม test ครอบคลุมไว้แล้ว ตอนนี้ Server ผ่าน 30/30 และ Client ผ่าน 15/15 รวมถึง build ผ่านทั้งสองฝั่ง รบกวนช่วยตรวจให้อีกรอบนะ
+
+### My comment (PR #31 for partner lmaybelgracel):
+&gt; ตรวจสอบโค้ดและผลการทดสอบของ Issue 13: Automated Testing and End-to-End Tests (#31) เรียบร้อยแล้ว:
+&gt; - **Backend API Tests (Vitest &amp; Supertest):** มีชุดทดสอบใน `server/tests/lab-02/` ครอบคลุม API-01 ถึง API-10 (create-ticket, attachments, my-tickets, ticket-detail, requester-context, reference-data) รวม 33/33 test cases ผ่าน 100%
+&gt; - **Frontend UI Component Tests (Vitest &amp; RTL):** มีชุดทดสอบใน `client/src/__tests__/lab-02/` ครอบคลุม UI-01 ถึง UI-05 (CreateTicket, AttachmentSection, RequesterTicketDetail, MyTickets, RequesterSelector) รวม 17/17 test cases ผ่าน 100%
+&gt; - **Playwright End-to-End Tests:** ไฟล์ `e2e/lab-02/requester-ticket-flow.spec.ts` ทดสอบครบถ้วนตาม scenario E2E-01 ครอบคลุมทั้ง flow การเลือก Requester Context, validation ไฟล์แนบ, การสร้าง Ticket, ดูรายละเอียด, อัปโหลดและ soft-remove ไฟล์แนบ พร้อมตรวจสอบ Data Isolation เมื่อสลับ Requester
+&gt; - **Documentation &amp; Build:** อัปเดต `docs/lab-02/tests.md` ระบุ Requirement Traceability Matrix (AC-01 ถึง AC-09), Responsive Checklist และผลการทดสอบครบถ้วน คำสั่ง `npm run build` ผ่านสมบูรณ์ทั้งฝั่ง Server และ Client
+&gt; 
+&gt; **ข้อเสนอแนะเพิ่มเติม (Minor Recommendation):**
+&gt; 1. ใน `package.json` ส่วน root อาจเพิ่ม script `&quot;install:e2e&quot;: &quot;playwright install chromium&quot;` เพื่อความสะดวกของผู้พัฒนาในการ setup สภาพแวดล้อม E2E testing ครั้งแรก
+
+### Partner&apos;s response (PR #31 for partner lmaybelgracel):
+&gt; เพิ่ม script install:e2e ให้แล้วนะ ตอนนี้ setup Chromium ครั้งแรกได้ด้วย npm run install:e2e และลองตรวจด้วย --dry-run แล้วเรียก Playwright ได้ถูกต้อง ขอบคุณสำหรับคำแนะนำ
+
+### My comment (PR #32 for partner lmaybelgracel):
+&gt; ### สรุปผลการตรวจทาน:
+&gt; - **UI Style &amp; Zen Green Theme Contract:** Implement ธีมตรงตาม UI Specification ครบถ้วน Palette สีถูกต้อง (`#006B3C`, `#0B7A46`, `#EAF6EF`, `#F5F7F6`, `#F0F4F2`, `#B71C1C`) Surface Card และ Read-only fields แยกความแตกต่างชัดเจน พร้อม unit test ใน `UIStyle.test.tsx` (UI-06) ตรวจสอบ CSS และ Accessibility Contract ผ่านเรียบร้อย
+&gt; - **Accessibility &amp; Assistive Technology:** ช่องที่จำเป็นต้องกรอกมีเครื่องหมายดอกจันสีแดง `*` พร้อม `aria-required=&quot;true&quot;` ครบถ้วน และมี Focus Ring สีเขียว (`#0B7A46`) เมื่อใช้งานด้วยแป้นพิมพ์
+&gt; - **Responsive Viewport &amp; Overflow:** มี `@media` breakpoints ครอบคลุม Desktop, Tablet และ Mobile (ปรับเป็น single-column layout, ปุ่ม touch-friendly สูงอย่างน้อย 44px) และใช้ `overflow-wrap: anywhere` จัดการชื่อไฟล์ยาว ไม่พบปัญหา Horizontal Page Overflow
+&gt; - **Visual Evidence &amp; Screenshots:** ชุดทดสอบ Playwright ใน `visual-evidence.spec.ts` (VIS-01) จับภาพหน้าจอ Responsive และ Modal Evidence บันทึกลงใน repository ครบถ้วนทุก viewport
+&gt; - **Automated Tests &amp; Build:** 
+&gt;   - Server Vitest: 33/33 passed (100%)
+&gt;   - Client Vitest: 21/21 passed (100%)
+&gt;   - Playwright E2E &amp; Visual: 2/2 scenarios passed (100%)
+&gt;   - `npm run build` ผ่านสมบูรณ์ทั้ง Client และ Server
+&gt; 
+&gt; ### ข้อเสนอแนะเพิ่มเติมเล็กน้อย (Non-blocking):
+&gt; 1. ใน `visual-evidence.spec.ts` Playwright จะ Save ภาพไปที่ `artifacts/lab-02/screenshots/` ในขณะที่ไฟล์รูปใน Repo อยู่ที่ `docs/lab-02/screenshots/` อาจพิจารณาเพิ่ม script ช่วยคัดลอกไฟล์รูปภาพเพื่อให้ภาพใน `docs/` อัปเดตตรงกับ artifacts เสมอเวลาคนอื่นมาสั่งรัน e2e test 
+&gt; 2. ใน `lab2.css` breakpoint ปัจจุบันเริ่มที่ `767px` ในอนาคตอาจลองเช็กการแสดงผลบนหน้าจอขนาดเล็กมากๆ (เช่น `&lt; 360px`) เพื่อความสมบูรณ์แบบยิ่งขึ้น
+
+### Partner&apos;s response (PR #32 for partner lmaybelgracel):
+&gt; ขอบคุณสำหรับคำแนะนำนะ เราเพิ่ม responsive สำหรับหน้าจอเล็กกว่า 360px แล้ว แล้วก็เพิ่ม Playwright เช็กที่ขนาด 320×568 พร้อมภาพหลักฐานของหน้า My Tickets และ removal modal เรียบร้อย ไม่มี horizontal overflow ค่ะ  
+&gt; ส่วนเรื่องพาธรูป เราเช็กอีกครั้งแล้ว ตอนนี้ทั้ง test, เอกสาร และรูปใน repo ใช้ artifacts/lab-02/screenshots/ ตรงกันทั้งหมด และไม่มีรูปอีกชุดอยู่ใน docs/lab-02/screenshots/ เลยยังไม่ได้เพิ่ม script copy เพื่อไม่ให้เกิดไฟล์ซ้ำค่ะ  
+&gt; ผลทดสอบล่าสุด Client 21/21, Playwright 2/2 และ build ผ่านทั้งหมด ฝากตรวจอีกครั้งได้เลยนะ
+
+### My comment (PR #33 for partner lmaybelgracel):
+&gt; เราได้ทำการรีวิว PR #33 และตรวจสอบเอกสารประกอบการส่งงานรวมถึงหลักฐานการทดสอบทั้ง 6 ฉบับเรียบร้อยแล้ว ผลการตรวจสอบเป็นไปตามข้อกำหนดของวิชา ดังนี้:
+&gt; 
+&gt; ### รายการการตรวจสอบ (Review Checklist Verification)
+&gt; - [x] **ความถูกต้องของ reviewer.md:** ตรวจสอบแล้ว ข้อมูลถูกต้องและสอดคล้องกับประวัติบน GitHub จริง บันทึก Review ที่ได้รับ และ Review ที่ตรวจให้เพื่อนครบทั้ง 9 PRs พร้อมลิงก์หลักฐาน การตอบกลับ และการ Approve
+&gt; - [x] **ความถูกต้องของ ai-use.md:** ตรวจสอบแล้ว ระบุการใช้งาน AI (Antigravity และ OpenAI Codex) ตรงตามจริง มีตาราง Prompts ที่คัดเลือกมา 10 รายการ พร้อมข้อความ Prompt จริง และ Reflection ที่สะท้อนการทำงานอย่างชัดเจน
+&gt; - [x] **ความครบถ้วนของเอกสารทั้ง 6 ฉบับ:** ตรวจสอบแล้ว เอกสารหลักทั้ง 6 ฉบับ (ai-use.md, api-spec.md, reviewer.md, specification.md, tests.md, ui-spec.md) ในโฟลเดอร์ docs/lab-02/ มีเนื้อหาครบถ้วน สอดคล้องกันทุกไฟล์ และมีลิงก์อ้างอิงใน README.md อย่างถูกต้อง
+&gt; - [x] **หลักฐาน ภาพ Screenshots และ README:** ตรวจสอบแล้ว ภาพ Screenshot ใน artifacts/lab-02/screenshots/ ครบถ้วนตาม UI Spec และขั้นตอนการตั้งค่า/รันทดสอบใน README.md ชัดเจน ปฏิบัติตามได้จริง
+&gt; - [x] **ความสะอาดของ Repository:** ตรวจสอบแล้ว ไม่พบไฟล์ส่วนตัว ไฟล์ความลับ (.env) หรือไฟล์จากการทดสอบที่ไม่เกี่ยวข้องหลุดเข้ามา (ปฏิบัติตามกฎ .gitignore ถูกต้อง)
+&gt; 
+&gt; ### ผลการทดสอบและการ Build
+&gt; - **Server Vitest:** ผ่าน 33/33 tests
+&gt; - **Client Vitest:** ผ่าน 21/21 tests
+&gt; - **Playwright E2E/Visual:** ผ่าน 5/5 tests
+&gt; - **Production Builds:** บิวด์ผ่านเรียบร้อยทั้ง Client และ Server โดยไม่มีข้อผิดพลาด
+&gt; 
+&gt; เอกสารและหลักฐานครบถ้วนสมบูรณ์ตามเกณฑ์ Definition of Done ของ Lab 2 ทุกประการ
+
+### Partner&apos;s response (PR #33 for partner lmaybelgracel):
+&gt; &quot;Partner acknowledged feedback and merged PR into staging branch.&quot;
+
+### My comment (PR #34 for partner lmaybelgracel):
+&gt; ตรวจสอบ PR #34 เรียบร้อยแล้ว ภาพรวมงานมีคุณภาพดีมาก ครอบคลุม FR-01–FR-13, BR-01–BR-11 และ AC-01–AC-09 ครบถ้วนตาม Specification Tests ผ่าน 100% ทุก Suite (API 26, UI 18, E2E 2) และ UI ปฏิบัติตาม Zen Green Design System อย่างสม่ำเสมอ
+&gt; 
+&gt; **จุดเด่นที่น่าชม:**
+&gt; - Backend validation ครบ ทั้ง requester isActive, category/relatedSystem isActive, field length ตาม BR-08
+&gt; - Atomic transaction ใน POST /api/tickets ทำงานถูกต้อง รวมถึง compensation cleanup เมื่อ transaction fail (BR-11)
+&gt; - Ownership enforcement ทุก endpoint ตรวจ requesterId ก่อนคืนข้อมูล คืน 403 ถูกต้อง
+&gt; - Frontend มี debounce 250ms + stale request cancellation และ form data retention (BR-09)
+&gt; - Soft-removal UI แสดง strikethrough, &quot;Removed&quot; badge และ disabled download button ถูกต้องตาม UI-05
+
+### Partner&apos;s response (PR #34 for partner lmaybelgracel):
+&gt; &gt; ตรวจสอบ PR #34 เรียบร้อยแล้ว ภาพรวมงานมีคุณภาพดีมาก ครอบคลุม FR-01–FR-13, BR-01–BR-11 และ AC-01–AC-09 ครบถ้วนตาม Specification Tests ผ่าน 100% ทุก Suite (API 26, UI 18, E2E 2) และ UI ปฏิบัติตาม Zen Green Design System อย่างสม่ำเสมอ
+&gt; &gt; 
+&gt; &gt; **จุดเด่นที่น่าชม:**
+&gt; &gt; 
+&gt; &gt; * Backend validation ครบ ทั้ง requester isActive, category/relatedSystem isActive, field length ตาม BR-08
+&gt; &gt; * Atomic transaction ใน POST /api/tickets ทำงานถูกต้อง รวมถึง compensation cleanup เมื่อ transaction fail (BR-11)
+&gt; &gt; * Ownership enforcement ทุก endpoint ตรวจ requesterId ก่อนคืนข้อมูล คืน 403 ถูกต้อง
+&gt; &gt; * Frontend มี debounce 250ms + stale request cancellation และ form data retention (BR-09)
+&gt; &gt; * Soft-removal UI แสดง strikethrough, &quot;Removed&quot; badge และ disabled download button ถูกต้องตาม UI-05
+&gt; 
+&gt; ขอบคุณมาก สำหรับรีวิวที่ละเอียดมากๆ และคำแนะนำที่ดีตลอดทั้งสปรินต์นี้ ดีใจมากที่ผลการตรวจสอบครอบคลุมทั้ง Functional Requirements, Business Rules และ Acceptance Criteria ครบถ้วน รวมถึงผลการทดสอบผ่าน 100% ทุกส่วนค่ะ
+
+
+
+**หลักฐานการอนุมัติและการรีวิว PR (GitHub Review Evidence):**
+*(บันทึกความเห็นการรีวิวและการตอบกลับแบบคำต่อคำจาก GitHub API แสดงไว้ในส่วน Pull Requests I authored และ Pull Requests I reviewed ด้านบนครบถ้วน)*
+
+**หลักฐานว่าเรา review/approve PR ของ partner:**
+&gt; *(บันทึกความเห็นการรีวิวและการตอบกลับแบบคำต่อคำจาก GitHub API แสดงไว้ด้านบนครบถ้วน)*
+
+
+---
 
 ## Answer Part 2: Spec DD *(5 คะแนน)*
 

</xml_diff>

<commit_message>
style(lab-02): fix markdown html renderer, clean inline code pills, and re-format setup instructions
</commit_message>
<xml_diff>
--- a/docs/lab-02/submission-report.docx
+++ b/docs/lab-02/submission-report.docx
@@ -27,11 +27,35 @@
 ## Setup Instructions
 
 ### 1. Database Setup
+
 Start PostgreSQL using Docker Compose:
-```bash
-docker compose up -d db</w:t></w:r></w:p><w:p><w:pPr><w:pStyle w:val="Heading3"/><w:spacing w:after="100" w:before="200"/></w:pPr><w:r><w:t xml:space="preserve">2. Backend Setup (`server/`)</w:t></w:r></w:p><w:p><w:pPr><w:spacing w:after="100" w:before="100"/></w:pPr><w:r><w:t xml:space="preserve">Navigate to the `server/` directory:</w:t></w:r></w:p><w:p><w:pPr><w:spacing w:after="100" w:before="100"/></w:pPr><w:r><w:rPr><w:rFonts w:ascii="Consolas" w:cs="Consolas" w:eastAsia="Consolas" w:hAnsi="Consolas"/><w:color w:val="1F2937"/><w:sz w:val="18"/><w:szCs w:val="18"/></w:rPr><w:t xml:space="preserve">cd server
-npm install</w:t></w:r></w:p><w:p><w:pPr><w:spacing w:after="100" w:before="100"/></w:pPr><w:r><w:t xml:space="preserve">Copy environment file and configure `DATABASE_URL` and `PORT`:</w:t></w:r></w:p><w:p><w:pPr><w:spacing w:after="100" w:before="100"/></w:pPr><w:r><w:rPr><w:rFonts w:ascii="Consolas" w:cs="Consolas" w:eastAsia="Consolas" w:hAnsi="Consolas"/><w:color w:val="1F2937"/><w:sz w:val="18"/><w:szCs w:val="18"/></w:rPr><w:t xml:space="preserve">cp .env.example .env</w:t></w:r></w:p><w:p><w:pPr><w:spacing w:after="100" w:before="100"/></w:pPr><w:r><w:t xml:space="preserve">Run Prisma migrations:</w:t></w:r></w:p><w:p><w:pPr><w:spacing w:after="100" w:before="100"/></w:pPr><w:r><w:rPr><w:rFonts w:ascii="Consolas" w:cs="Consolas" w:eastAsia="Consolas" w:hAnsi="Consolas"/><w:color w:val="1F2937"/><w:sz w:val="18"/><w:szCs w:val="18"/></w:rPr><w:t xml:space="preserve">npm run prisma:migrate</w:t></w:r></w:p><w:p><w:pPr><w:spacing w:after="100" w:before="100"/></w:pPr><w:r><w:t xml:space="preserve">Seed the database:</w:t></w:r></w:p><w:p><w:pPr><w:spacing w:after="100" w:before="100"/></w:pPr><w:r><w:rPr><w:rFonts w:ascii="Consolas" w:cs="Consolas" w:eastAsia="Consolas" w:hAnsi="Consolas"/><w:color w:val="1F2937"/><w:sz w:val="18"/><w:szCs w:val="18"/></w:rPr><w:t xml:space="preserve">npm run prisma:seed</w:t></w:r></w:p><w:p><w:pPr><w:spacing w:after="100" w:before="100"/></w:pPr><w:r><w:t xml:space="preserve">Start the backend development server:</w:t></w:r></w:p><w:p><w:pPr><w:spacing w:after="100" w:before="100"/></w:pPr><w:r><w:rPr><w:rFonts w:ascii="Consolas" w:cs="Consolas" w:eastAsia="Consolas" w:hAnsi="Consolas"/><w:color w:val="1F2937"/><w:sz w:val="18"/><w:szCs w:val="18"/></w:rPr><w:t xml:space="preserve">npm run dev</w:t></w:r></w:p><w:p><w:pPr><w:spacing w:after="100" w:before="100"/></w:pPr><w:r><w:t xml:space="preserve">Run backend tests (Vitest + Supertest):</w:t></w:r></w:p><w:p><w:pPr><w:spacing w:after="100" w:before="100"/></w:pPr><w:r><w:rPr><w:rFonts w:ascii="Consolas" w:cs="Consolas" w:eastAsia="Consolas" w:hAnsi="Consolas"/><w:color w:val="1F2937"/><w:sz w:val="18"/><w:szCs w:val="18"/></w:rPr><w:t xml:space="preserve">npm test</w:t></w:r></w:p><w:p><w:pPr><w:pStyle w:val="Heading3"/><w:spacing w:after="100" w:before="200"/></w:pPr><w:r><w:t xml:space="preserve">3. Frontend Setup (`client/`)</w:t></w:r></w:p><w:p><w:pPr><w:spacing w:after="100" w:before="100"/></w:pPr><w:r><w:t xml:space="preserve">Navigate to the `client/` directory:</w:t></w:r></w:p><w:p><w:pPr><w:spacing w:after="100" w:before="100"/></w:pPr><w:r><w:rPr><w:rFonts w:ascii="Consolas" w:cs="Consolas" w:eastAsia="Consolas" w:hAnsi="Consolas"/><w:color w:val="1F2937"/><w:sz w:val="18"/><w:szCs w:val="18"/></w:rPr><w:t xml:space="preserve">cd client
-npm install</w:t></w:r></w:p><w:p><w:pPr><w:spacing w:after="100" w:before="100"/></w:pPr><w:r><w:t xml:space="preserve">Copy environment file:</w:t></w:r></w:p><w:p><w:pPr><w:spacing w:after="100" w:before="100"/></w:pPr><w:r><w:rPr><w:rFonts w:ascii="Consolas" w:cs="Consolas" w:eastAsia="Consolas" w:hAnsi="Consolas"/><w:color w:val="1F2937"/><w:sz w:val="18"/><w:szCs w:val="18"/></w:rPr><w:t xml:space="preserve">cp .env.example .env</w:t></w:r></w:p><w:p><w:pPr><w:spacing w:after="100" w:before="100"/></w:pPr><w:r><w:t xml:space="preserve">Start the frontend development server:</w:t></w:r></w:p><w:p><w:pPr><w:spacing w:after="100" w:before="100"/></w:pPr><w:r><w:rPr><w:rFonts w:ascii="Consolas" w:cs="Consolas" w:eastAsia="Consolas" w:hAnsi="Consolas"/><w:color w:val="1F2937"/><w:sz w:val="18"/><w:szCs w:val="18"/></w:rPr><w:t xml:space="preserve">npm run dev</w:t></w:r></w:p><w:p><w:pPr><w:spacing w:after="100" w:before="100"/></w:pPr><w:r><w:t xml:space="preserve">Run frontend tests (Vitest + React Testing Library):</w:t></w:r></w:p><w:p><w:pPr><w:spacing w:after="100" w:before="100"/></w:pPr><w:r><w:rPr><w:rFonts w:ascii="Consolas" w:cs="Consolas" w:eastAsia="Consolas" w:hAnsi="Consolas"/><w:color w:val="1F2937"/><w:sz w:val="18"/><w:szCs w:val="18"/></w:rPr><w:t xml:space="preserve">npm test</w:t></w:r></w:p><w:p><w:pPr><w:spacing w:after="100" w:before="100"/></w:pPr><w:r><w:rPr><w:rFonts w:ascii="Consolas" w:cs="Consolas" w:eastAsia="Consolas" w:hAnsi="Consolas"/><w:color w:val="1F2937"/><w:sz w:val="18"/><w:szCs w:val="18"/></w:rPr><w:t xml:space="preserve">
+
+`ash
+docker compose up -d db
+`
+
+### 2. Backend Setup (server/)
+
+`ash
+cd server
+npm install
+cp .env.example .env
+npm run prisma:migrate
+npm run prisma:seed
+npm run dev
+npm test
+`
+
+### 3. Frontend Setup (client/)
+
+`ash
+cd client
+npm install
+cp .env.example .env
+npm run dev
+npm test
+`
+
 #### Content of .gitignore:
 ![Content of .gitignore](../../artifacts/lab-02/screenshots/gitignore.png)
 

</xml_diff>

<commit_message>
docs: replace raw README text with GitHub UI screenshot image in report
</commit_message>
<xml_diff>
--- a/docs/lab-02/submission-report.docx
+++ b/docs/lab-02/submission-report.docx
@@ -668,146 +668,6 @@
     </w:p>
     <w:p>
       <w:pPr>
-        <w:pStyle w:val="Heading1"/>
-        <w:spacing w:after="100" w:before="200"/>
-      </w:pPr>
-      <w:r>
-        <w:t xml:space="preserve">TokTickIT - IT Service Desk Application</w:t>
-      </w:r>
-    </w:p>
-    <w:p>
-      <w:pPr>
-        <w:spacing w:after="100" w:before="100"/>
-      </w:pPr>
-      <w:r>
-        <w:t xml:space="preserve">TokTickIT is an IT service desk web application built with React, TypeScript, Vite, Bootstrap, Node.js, Express, Prisma ORM, and PostgreSQL.</w:t>
-      </w:r>
-    </w:p>
-    <w:p>
-      <w:pPr>
-        <w:pStyle w:val="Heading2"/>
-        <w:spacing w:after="100" w:before="200"/>
-      </w:pPr>
-      <w:r>
-        <w:t xml:space="preserve">Tech Stack</w:t>
-      </w:r>
-    </w:p>
-    <w:p>
-      <w:pPr>
-        <w:pStyle w:val="Heading2"/>
-        <w:spacing w:after="100" w:before="200"/>
-      </w:pPr>
-      <w:r>
-        <w:t xml:space="preserve">Prerequisites</w:t>
-      </w:r>
-    </w:p>
-    <w:p>
-      <w:pPr>
-        <w:pStyle w:val="Heading2"/>
-        <w:spacing w:after="100" w:before="200"/>
-      </w:pPr>
-      <w:r>
-        <w:t xml:space="preserve">Setup Instructions</w:t>
-      </w:r>
-    </w:p>
-    <w:p>
-      <w:pPr>
-        <w:pStyle w:val="Heading3"/>
-        <w:spacing w:after="100" w:before="200"/>
-      </w:pPr>
-      <w:r>
-        <w:t xml:space="preserve">1. Database Setup</w:t>
-      </w:r>
-    </w:p>
-    <w:p>
-      <w:pPr>
-        <w:spacing w:after="100" w:before="100"/>
-      </w:pPr>
-      <w:r>
-        <w:t xml:space="preserve">Start PostgreSQL using Docker Compose:</w:t>
-      </w:r>
-    </w:p>
-    <w:p>
-      <w:pPr>
-        <w:spacing w:after="100" w:before="100"/>
-      </w:pPr>
-      <w:r>
-        <w:rPr>
-          <w:rFonts w:ascii="Consolas" w:cs="Consolas" w:eastAsia="Consolas" w:hAnsi="Consolas"/>
-          <w:color w:val="1F2937"/>
-          <w:sz w:val="18"/>
-          <w:szCs w:val="18"/>
-        </w:rPr>
-        <w:t xml:space="preserve">docker compose up -d db</w:t>
-      </w:r>
-    </w:p>
-    <w:p>
-      <w:pPr>
-        <w:pStyle w:val="Heading3"/>
-        <w:spacing w:after="100" w:before="200"/>
-      </w:pPr>
-      <w:r>
-        <w:t xml:space="preserve">2. Backend Setup (server/)</w:t>
-      </w:r>
-    </w:p>
-    <w:p>
-      <w:pPr>
-        <w:spacing w:after="100" w:before="100"/>
-      </w:pPr>
-      <w:r>
-        <w:rPr>
-          <w:rFonts w:ascii="Consolas" w:cs="Consolas" w:eastAsia="Consolas" w:hAnsi="Consolas"/>
-          <w:color w:val="1F2937"/>
-          <w:sz w:val="18"/>
-          <w:szCs w:val="18"/>
-        </w:rPr>
-        <w:t xml:space="preserve">cd server
-npm install
-cp .env.example .env
-npm run prisma:migrate
-npm run prisma:seed
-npm run dev
-npm test</w:t>
-      </w:r>
-    </w:p>
-    <w:p>
-      <w:pPr>
-        <w:pStyle w:val="Heading3"/>
-        <w:spacing w:after="100" w:before="200"/>
-      </w:pPr>
-      <w:r>
-        <w:t xml:space="preserve">3. Frontend Setup (client/)</w:t>
-      </w:r>
-    </w:p>
-    <w:p>
-      <w:pPr>
-        <w:spacing w:after="100" w:before="100"/>
-      </w:pPr>
-      <w:r>
-        <w:rPr>
-          <w:rFonts w:ascii="Consolas" w:cs="Consolas" w:eastAsia="Consolas" w:hAnsi="Consolas"/>
-          <w:color w:val="1F2937"/>
-          <w:sz w:val="18"/>
-          <w:szCs w:val="18"/>
-        </w:rPr>
-        <w:t xml:space="preserve">cd client
-npm install
-cp .env.example .env
-npm run dev
-npm test</w:t>
-      </w:r>
-    </w:p>
-    <w:p>
-      <w:pPr>
-        <w:pStyle w:val="Heading4"/>
-        <w:spacing w:after="100" w:before="200"/>
-      </w:pPr>
-      <w:r>
-        <w:t xml:space="preserve">Content of .gitignore:</w:t>
-      </w:r>
-    </w:p>
-    <w:p>
-      <w:pPr>
         <w:spacing w:after="150" w:before="150"/>
       </w:pPr>
       <w:r>
@@ -830,6 +690,60 @@
                   </pic:nvPicPr>
                   <pic:blipFill>
                     <a:blip r:embed="rId9" cstate="none"/>
+                    <a:srcRect/>
+                    <a:stretch>
+                      <a:fillRect/>
+                    </a:stretch>
+                  </pic:blipFill>
+                  <pic:spPr bwMode="auto">
+                    <a:xfrm>
+                      <a:off x="0" y="0"/>
+                      <a:ext cx="5238750" cy="3333750"/>
+                    </a:xfrm>
+                    <a:prstGeom prst="rect">
+                      <a:avLst/>
+                    </a:prstGeom>
+                  </pic:spPr>
+                </pic:pic>
+              </a:graphicData>
+            </a:graphic>
+          </wp:inline>
+        </w:drawing>
+      </w:r>
+    </w:p>
+    <w:p>
+      <w:pPr>
+        <w:pStyle w:val="Heading4"/>
+        <w:spacing w:after="100" w:before="200"/>
+      </w:pPr>
+      <w:r>
+        <w:t xml:space="preserve">Content of .gitignore:</w:t>
+      </w:r>
+    </w:p>
+    <w:p>
+      <w:pPr>
+        <w:spacing w:after="150" w:before="150"/>
+      </w:pPr>
+      <w:r>
+        <w:drawing>
+          <wp:inline distT="0" distB="0" distL="0" distR="0">
+            <wp:extent cx="5238750" cy="3333750"/>
+            <wp:effectExtent t="0" r="0" b="0" l="0"/>
+            <wp:docPr id="1" name="" descr="" title=""/>
+            <wp:cNvGraphicFramePr>
+              <a:graphicFrameLocks xmlns:a="http://schemas.openxmlformats.org/drawingml/2006/main" noChangeAspect="1"/>
+            </wp:cNvGraphicFramePr>
+            <a:graphic xmlns:a="http://schemas.openxmlformats.org/drawingml/2006/main">
+              <a:graphicData uri="http://schemas.openxmlformats.org/drawingml/2006/picture">
+                <pic:pic xmlns:pic="http://schemas.openxmlformats.org/drawingml/2006/picture">
+                  <pic:nvPicPr>
+                    <pic:cNvPr id="0" name="" descr=""/>
+                    <pic:cNvPicPr>
+                      <a:picLocks noChangeAspect="1" noChangeArrowheads="1"/>
+                    </pic:cNvPicPr>
+                  </pic:nvPicPr>
+                  <pic:blipFill>
+                    <a:blip r:embed="rId10" cstate="none"/>
                     <a:srcRect/>
                     <a:stretch>
                       <a:fillRect/>
@@ -5595,60 +5509,6 @@
                     </pic:cNvPicPr>
                   </pic:nvPicPr>
                   <pic:blipFill>
-                    <a:blip r:embed="rId10" cstate="none"/>
-                    <a:srcRect/>
-                    <a:stretch>
-                      <a:fillRect/>
-                    </a:stretch>
-                  </pic:blipFill>
-                  <pic:spPr bwMode="auto">
-                    <a:xfrm>
-                      <a:off x="0" y="0"/>
-                      <a:ext cx="5238750" cy="3333750"/>
-                    </a:xfrm>
-                    <a:prstGeom prst="rect">
-                      <a:avLst/>
-                    </a:prstGeom>
-                  </pic:spPr>
-                </pic:pic>
-              </a:graphicData>
-            </a:graphic>
-          </wp:inline>
-        </w:drawing>
-      </w:r>
-    </w:p>
-    <w:p>
-      <w:pPr>
-        <w:pStyle w:val="Heading3"/>
-        <w:spacing w:after="100" w:before="200"/>
-      </w:pPr>
-      <w:r>
-        <w:t xml:space="preserve">5.2 Loading State</w:t>
-      </w:r>
-    </w:p>
-    <w:p>
-      <w:pPr>
-        <w:spacing w:after="150" w:before="150"/>
-      </w:pPr>
-      <w:r>
-        <w:drawing>
-          <wp:inline distT="0" distB="0" distL="0" distR="0">
-            <wp:extent cx="5238750" cy="3333750"/>
-            <wp:effectExtent t="0" r="0" b="0" l="0"/>
-            <wp:docPr id="1" name="" descr="" title=""/>
-            <wp:cNvGraphicFramePr>
-              <a:graphicFrameLocks xmlns:a="http://schemas.openxmlformats.org/drawingml/2006/main" noChangeAspect="1"/>
-            </wp:cNvGraphicFramePr>
-            <a:graphic xmlns:a="http://schemas.openxmlformats.org/drawingml/2006/main">
-              <a:graphicData uri="http://schemas.openxmlformats.org/drawingml/2006/picture">
-                <pic:pic xmlns:pic="http://schemas.openxmlformats.org/drawingml/2006/picture">
-                  <pic:nvPicPr>
-                    <pic:cNvPr id="0" name="" descr=""/>
-                    <pic:cNvPicPr>
-                      <a:picLocks noChangeAspect="1" noChangeArrowheads="1"/>
-                    </pic:cNvPicPr>
-                  </pic:nvPicPr>
-                  <pic:blipFill>
                     <a:blip r:embed="rId11" cstate="none"/>
                     <a:srcRect/>
                     <a:stretch>
@@ -5677,7 +5537,7 @@
         <w:spacing w:after="100" w:before="200"/>
       </w:pPr>
       <w:r>
-        <w:t xml:space="preserve">5.3 API Failure State (Connection Error &amp; Retry Button)</w:t>
+        <w:t xml:space="preserve">5.2 Loading State</w:t>
       </w:r>
     </w:p>
     <w:p>
@@ -5731,7 +5591,7 @@
         <w:spacing w:after="100" w:before="200"/>
       </w:pPr>
       <w:r>
-        <w:t xml:space="preserve">5.4 Empty State (No Active Requesters &amp; Disabled Continue Button)</w:t>
+        <w:t xml:space="preserve">5.3 API Failure State (Connection Error &amp; Retry Button)</w:t>
       </w:r>
     </w:p>
     <w:p>
@@ -5781,512 +5641,13 @@
     </w:p>
     <w:p>
       <w:pPr>
-        <w:pStyle w:val="Heading2"/>
-        <w:spacing w:after="100" w:before="200"/>
-      </w:pPr>
-      <w:r>
-        <w:t xml:space="preserve">Answer Part 6: Working Ticket Screen: Create Mode *(10 คะแนน)*</w:t>
-      </w:r>
-    </w:p>
-    <w:p>
-      <w:pPr>
-        <w:pStyle w:val="Heading2"/>
-        <w:spacing w:after="100" w:before="200"/>
-      </w:pPr>
-      <w:r>
-        <w:t xml:space="preserve">Answer Part 7: Working My Tickets Screen *(10 คะแนน)*</w:t>
-      </w:r>
-    </w:p>
-    <w:p>
-      <w:pPr>
-        <w:spacing w:after="100" w:before="100"/>
-      </w:pPr>
-      <w:r>
-        <w:t xml:space="preserve">![My Tickets Requester A](../../artifacts/lab-02/screenshots/my-tickets/desktop.png)
-![Cross Requester Isolation](../../artifacts/lab-02/screenshots/my-tickets/cross-requester-isolation.png)
-![Search Feature](../../artifacts/lab-02/screenshots/my-tickets/search-filter.png)
-![Filter Dropdowns](../../artifacts/lab-02/screenshots/my-tickets/search-filter.png)
-![Sort Feature](../../artifacts/lab-02/screenshots/my-tickets/search-filter.png)
-![Pagination Controls](../../artifacts/lab-02/screenshots/my-tickets/desktop.png)
-![Empty State](../../artifacts/lab-02/screenshots/my-tickets/cross-requester-isolation.png)
-![No Results State](../../artifacts/lab-02/screenshots/my-tickets/search-filter.png)
-![Cross Requester Blocked](../../artifacts/lab-02/screenshots/my-tickets/cross-requester-isolation.png)</w:t>
-      </w:r>
-    </w:p>
-    <w:p>
-      <w:pPr>
-        <w:pStyle w:val="Heading2"/>
-        <w:spacing w:after="100" w:before="200"/>
-      </w:pPr>
-      <w:r>
-        <w:t xml:space="preserve">Answer Part 8: Ticket Screen View Mode &amp; Attachments *(5 คะแนน)*</w:t>
-      </w:r>
-    </w:p>
-    <w:p>
-      <w:pPr>
-        <w:spacing w:after="100" w:before="100"/>
-      </w:pPr>
-      <w:r>
-        <w:t xml:space="preserve">![Ticket Detail Read Only](../../artifacts/lab-02/screenshots/ticket-detail/desktop.png)
-![Add Attachment](../../artifacts/lab-02/screenshots/ticket-detail/desktop.png)
-![Download Attachment](../../artifacts/lab-02/screenshots/ticket-detail/desktop.png)
-![Soft Remove Modal Prompt](../../artifacts/lab-02/screenshots/ticket-detail/soft-remove-modal.png)
-![Soft Removed Status](../../artifacts/lab-02/screenshots/ticket-detail/soft-removed-status.png)
-![Unauthorized Access Blocked (403 Forbidden Response)](../../artifacts/lab-02/screenshots/ticket-detail/forbidden-access.png)</w:t>
-      </w:r>
-    </w:p>
-    <w:p>
-      <w:pPr>
         <w:pStyle w:val="Heading3"/>
         <w:spacing w:after="100" w:before="200"/>
       </w:pPr>
       <w:r>
-        <w:t xml:space="preserve">8.1 Cross-Requester Ownership Authorization Evidence (403 Forbidden)</w:t>
-      </w:r>
-    </w:p>
-    <w:p>
-      <w:pPr>
-        <w:spacing w:after="100" w:before="100"/>
-      </w:pPr>
-      <w:r>
-        <w:rPr>
-          <w:rFonts w:ascii="Consolas" w:cs="Consolas" w:eastAsia="Consolas" w:hAnsi="Consolas"/>
-          <w:color w:val="1F2937"/>
-          <w:sz w:val="18"/>
-          <w:szCs w:val="18"/>
-        </w:rPr>
-        <w:t xml:space="preserve">// Extract from server/tests/lab-02/ticket-detail.api.test.ts (AC-04 Verification)
-it("returns 403 Forbidden when requesting a ticket owned by another requester", async () =&gt; {
-  const res = await request(app)
-    .get("/api/tickets/1")
-    .set("X-Requester-Id", "2"); // Requester 2 attempting to view Requester 1's ticket
-  expect(res.status).toBe(403);
-  expect(res.body).toEqual({
-    error: "Forbidden: You do not have permission to view or modify this ticket."
-  });
-});</w:t>
-      </w:r>
-    </w:p>
-    <w:p>
-      <w:pPr>
-        <w:spacing w:after="100" w:before="100"/>
-      </w:pPr>
-      <w:r>
-        <w:rPr>
-          <w:rFonts w:ascii="Consolas" w:cs="Consolas" w:eastAsia="Consolas" w:hAnsi="Consolas"/>
-          <w:color w:val="1F2937"/>
-          <w:sz w:val="18"/>
-          <w:szCs w:val="18"/>
-        </w:rPr>
-        <w:t xml:space="preserve">// Extract from server/tests/lab-02/attachments.api.test.ts (AC-05 / BR-14 Verification)
-it("returns 403 Forbidden when downloading soft-removed attachment or cross-requester file", async () =&gt; {
-  const res = await request(app)
-    .get("/api/attachments/99/download")
-    .set("X-Requester-Id", "2");
-  expect(res.status).toBe(403);
-  expect(res.body.error).toMatch(/Forbidden/);
-});</w:t>
-      </w:r>
-    </w:p>
-    <w:p>
-      <w:pPr>
-        <w:pStyle w:val="Heading2"/>
-        <w:spacing w:after="100" w:before="200"/>
-      </w:pPr>
-      <w:r>
-        <w:t xml:space="preserve">Answer Part 9: Zen Green UI and Responsive Evidence *(5 คะแนน)*</w:t>
-      </w:r>
-    </w:p>
-    <w:p>
-      <w:pPr>
-        <w:spacing w:after="100" w:before="100"/>
-      </w:pPr>
-      <w:r>
-        <w:t xml:space="preserve">**ลิงก์:** https://github.com/chanya06/toktickit/blob/main/docs/lab-02/ui-spec.md</w:t>
-      </w:r>
-    </w:p>
-    <w:p>
-      <w:pPr>
-        <w:pStyle w:val="Heading1"/>
-        <w:spacing w:after="100" w:before="200"/>
-      </w:pPr>
-      <w:r>
-        <w:t xml:space="preserve">Lab 2 Zen Green UI Specification</w:t>
-      </w:r>
-    </w:p>
-    <w:p>
-      <w:pPr>
-        <w:pStyle w:val="Heading2"/>
-        <w:spacing w:after="100" w:before="200"/>
-      </w:pPr>
-      <w:r>
-        <w:t xml:space="preserve">1. Design System Tokens &amp; Color Palette</w:t>
-      </w:r>
-    </w:p>
-    <w:tbl>
-      <w:tblPr>
-        <w:tblW w:type="pct" w:w="100%"/>
-        <w:tblBorders>
-          <w:top w:val="single" w:color="auto" w:sz="4"/>
-          <w:left w:val="single" w:color="auto" w:sz="4"/>
-          <w:bottom w:val="single" w:color="auto" w:sz="4"/>
-          <w:right w:val="single" w:color="auto" w:sz="4"/>
-          <w:insideH w:val="single" w:color="auto" w:sz="4"/>
-          <w:insideV w:val="single" w:color="auto" w:sz="4"/>
-        </w:tblBorders>
-      </w:tblPr>
-      <w:tblGrid>
-        <w:gridCol w:w="100"/>
-        <w:gridCol w:w="100"/>
-        <w:gridCol w:w="100"/>
-      </w:tblGrid>
-      <w:tr>
-        <w:tc>
-          <w:tcPr>
-            <w:shd w:fill="EAF6EF"/>
-          </w:tcPr>
-          <w:p>
-            <w:r>
-              <w:rPr>
-                <w:b/>
-                <w:bCs/>
-                <w:color w:val="006B3C"/>
-              </w:rPr>
-              <w:t xml:space="preserve">Token / Element</w:t>
-            </w:r>
-          </w:p>
-        </w:tc>
-        <w:tc>
-          <w:tcPr>
-            <w:shd w:fill="EAF6EF"/>
-          </w:tcPr>
-          <w:p>
-            <w:r>
-              <w:rPr>
-                <w:b/>
-                <w:bCs/>
-                <w:color w:val="006B3C"/>
-              </w:rPr>
-              <w:t xml:space="preserve">Color Code</w:t>
-            </w:r>
-          </w:p>
-        </w:tc>
-        <w:tc>
-          <w:tcPr>
-            <w:shd w:fill="EAF6EF"/>
-          </w:tcPr>
-          <w:p>
-            <w:r>
-              <w:rPr>
-                <w:b/>
-                <w:bCs/>
-                <w:color w:val="006B3C"/>
-              </w:rPr>
-              <w:t xml:space="preserve">Usage / Context</w:t>
-            </w:r>
-          </w:p>
-        </w:tc>
-      </w:tr>
-      <w:tr>
-        <w:tc>
-          <w:p>
-            <w:r>
-              <w:t xml:space="preserve">**Primary Green**</w:t>
-            </w:r>
-          </w:p>
-        </w:tc>
-        <w:tc>
-          <w:p>
-            <w:r>
-              <w:t xml:space="preserve">`#006B3C`</w:t>
-            </w:r>
-          </w:p>
-        </w:tc>
-        <w:tc>
-          <w:p>
-            <w:r>
-              <w:t xml:space="preserve">Main navbar, primary action buttons, strong brand header emphasis.</w:t>
-            </w:r>
-          </w:p>
-        </w:tc>
-      </w:tr>
-      <w:tr>
-        <w:tc>
-          <w:p>
-            <w:r>
-              <w:t xml:space="preserve">**Secondary Green**</w:t>
-            </w:r>
-          </w:p>
-        </w:tc>
-        <w:tc>
-          <w:p>
-            <w:r>
-              <w:t xml:space="preserve">`#0B7A46`</w:t>
-            </w:r>
-          </w:p>
-        </w:tc>
-        <w:tc>
-          <w:p>
-            <w:r>
-              <w:t xml:space="preserve">Active tab highlights, focus ring accents, interactive links, hover states.</w:t>
-            </w:r>
-          </w:p>
-        </w:tc>
-      </w:tr>
-      <w:tr>
-        <w:tc>
-          <w:p>
-            <w:r>
-              <w:t xml:space="preserve">**Pale Green**</w:t>
-            </w:r>
-          </w:p>
-        </w:tc>
-        <w:tc>
-          <w:p>
-            <w:r>
-              <w:t xml:space="preserve">`#EAF6EF`</w:t>
-            </w:r>
-          </w:p>
-        </w:tc>
-        <w:tc>
-          <w:p>
-            <w:r>
-              <w:t xml:space="preserve">Selected card rows, success message banners, subtle section callouts.</w:t>
-            </w:r>
-          </w:p>
-        </w:tc>
-      </w:tr>
-      <w:tr>
-        <w:tc>
-          <w:p>
-            <w:r>
-              <w:t xml:space="preserve">**Page Background**</w:t>
-            </w:r>
-          </w:p>
-        </w:tc>
-        <w:tc>
-          <w:p>
-            <w:r>
-              <w:t xml:space="preserve">`#F5F7F6`</w:t>
-            </w:r>
-          </w:p>
-        </w:tc>
-        <w:tc>
-          <w:p>
-            <w:r>
-              <w:t xml:space="preserve">Quiet near-white background color for page container.</w:t>
-            </w:r>
-          </w:p>
-        </w:tc>
-      </w:tr>
-      <w:tr>
-        <w:tc>
-          <w:p>
-            <w:r>
-              <w:t xml:space="preserve">**Surface / Card BG**</w:t>
-            </w:r>
-          </w:p>
-        </w:tc>
-        <w:tc>
-          <w:p>
-            <w:r>
-              <w:t xml:space="preserve">`#FFFFFF`</w:t>
-            </w:r>
-          </w:p>
-        </w:tc>
-        <w:tc>
-          <w:p>
-            <w:r>
-              <w:t xml:space="preserve">Card backgrounds, modal containers, data table background.</w:t>
-            </w:r>
-          </w:p>
-        </w:tc>
-      </w:tr>
-      <w:tr>
-        <w:tc>
-          <w:p>
-            <w:r>
-              <w:t xml:space="preserve">**Border Color**</w:t>
-            </w:r>
-          </w:p>
-        </w:tc>
-        <w:tc>
-          <w:p>
-            <w:r>
-              <w:t xml:space="preserve">`#E5E7EB`</w:t>
-            </w:r>
-          </w:p>
-        </w:tc>
-        <w:tc>
-          <w:p>
-            <w:r>
-              <w:t xml:space="preserve">Subtle light gray card borders and table row dividers.</w:t>
-            </w:r>
-          </w:p>
-        </w:tc>
-      </w:tr>
-      <w:tr>
-        <w:tc>
-          <w:p>
-            <w:r>
-              <w:t xml:space="preserve">**Text Dark**</w:t>
-            </w:r>
-          </w:p>
-        </w:tc>
-        <w:tc>
-          <w:p>
-            <w:r>
-              <w:t xml:space="preserve">`#1F2937`</w:t>
-            </w:r>
-          </w:p>
-        </w:tc>
-        <w:tc>
-          <w:p>
-            <w:r>
-              <w:t xml:space="preserve">Dark charcoal-green text for high-contrast, comfortable reading.</w:t>
-            </w:r>
-          </w:p>
-        </w:tc>
-      </w:tr>
-      <w:tr>
-        <w:tc>
-          <w:p>
-            <w:r>
-              <w:t xml:space="preserve">**Text Muted**</w:t>
-            </w:r>
-          </w:p>
-        </w:tc>
-        <w:tc>
-          <w:p>
-            <w:r>
-              <w:t xml:space="preserve">`#6B7280`</w:t>
-            </w:r>
-          </w:p>
-        </w:tc>
-        <w:tc>
-          <w:p>
-            <w:r>
-              <w:t xml:space="preserve">Subtitle text, table header labels, secondary hints.</w:t>
-            </w:r>
-          </w:p>
-        </w:tc>
-      </w:tr>
-      <w:tr>
-        <w:tc>
-          <w:p>
-            <w:r>
-              <w:t xml:space="preserve">**Editable Field BG**</w:t>
-            </w:r>
-          </w:p>
-        </w:tc>
-        <w:tc>
-          <w:p>
-            <w:r>
-              <w:t xml:space="preserve">`#FFFFFF`</w:t>
-            </w:r>
-          </w:p>
-        </w:tc>
-        <w:tc>
-          <w:p>
-            <w:r>
-              <w:t xml:space="preserve">Form inputs, select dropdowns, textareas.</w:t>
-            </w:r>
-          </w:p>
-        </w:tc>
-      </w:tr>
-      <w:tr>
-        <w:tc>
-          <w:p>
-            <w:r>
-              <w:t xml:space="preserve">**Read-Only Field BG**</w:t>
-            </w:r>
-          </w:p>
-        </w:tc>
-        <w:tc>
-          <w:p>
-            <w:r>
-              <w:t xml:space="preserve">`#F3F4F6`</w:t>
-            </w:r>
-          </w:p>
-        </w:tc>
-        <w:tc>
-          <w:p>
-            <w:r>
-              <w:t xml:space="preserve">Soft gray-green shading for system-generated fields (Ticket No, Ticket Date).</w:t>
-            </w:r>
-          </w:p>
-        </w:tc>
-      </w:tr>
-      <w:tr>
-        <w:tc>
-          <w:p>
-            <w:r>
-              <w:t xml:space="preserve">**Error Text / Border**</w:t>
-            </w:r>
-          </w:p>
-        </w:tc>
-        <w:tc>
-          <w:p>
-            <w:r>
-              <w:t xml:space="preserve">`#DC2626`</w:t>
-            </w:r>
-          </w:p>
-        </w:tc>
-        <w:tc>
-          <w:p>
-            <w:r>
-              <w:t xml:space="preserve">Field validation error text and input highlight border.</w:t>
-            </w:r>
-          </w:p>
-        </w:tc>
-      </w:tr>
-      <w:tr>
-        <w:tc>
-          <w:p>
-            <w:r>
-              <w:t xml:space="preserve">**Warning Callout**</w:t>
-            </w:r>
-          </w:p>
-        </w:tc>
-        <w:tc>
-          <w:p>
-            <w:r>
-              <w:t xml:space="preserve">`#D97706`</w:t>
-            </w:r>
-          </w:p>
-        </w:tc>
-        <w:tc>
-          <w:p>
-            <w:r>
-              <w:t xml:space="preserve">Amber callouts or warning badges.</w:t>
-            </w:r>
-          </w:p>
-        </w:tc>
-      </w:tr>
-      <w:tr>
-        <w:tc>
-          <w:p>
-            <w:r>
-              <w:t xml:space="preserve">**Success Banner**</w:t>
-            </w:r>
-          </w:p>
-        </w:tc>
-        <w:tc>
-          <w:p>
-            <w:r>
-              <w:t xml:space="preserve">`#16A34A`</w:t>
-            </w:r>
-          </w:p>
-        </w:tc>
-        <w:tc>
-          <w:p>
-            <w:r>
-              <w:t xml:space="preserve">Green confirmation banners with checkmark icons.</w:t>
-            </w:r>
-          </w:p>
-        </w:tc>
-      </w:tr>
-    </w:tbl>
+        <w:t xml:space="preserve">5.4 Empty State (No Active Requesters &amp; Disabled Continue Button)</w:t>
+      </w:r>
+    </w:p>
     <w:p>
       <w:pPr>
         <w:spacing w:after="150" w:before="150"/>
@@ -6334,6 +5695,514 @@
     </w:p>
     <w:p>
       <w:pPr>
+        <w:pStyle w:val="Heading2"/>
+        <w:spacing w:after="100" w:before="200"/>
+      </w:pPr>
+      <w:r>
+        <w:t xml:space="preserve">Answer Part 6: Working Ticket Screen: Create Mode *(10 คะแนน)*</w:t>
+      </w:r>
+    </w:p>
+    <w:p>
+      <w:pPr>
+        <w:pStyle w:val="Heading2"/>
+        <w:spacing w:after="100" w:before="200"/>
+      </w:pPr>
+      <w:r>
+        <w:t xml:space="preserve">Answer Part 7: Working My Tickets Screen *(10 คะแนน)*</w:t>
+      </w:r>
+    </w:p>
+    <w:p>
+      <w:pPr>
+        <w:spacing w:after="100" w:before="100"/>
+      </w:pPr>
+      <w:r>
+        <w:t xml:space="preserve">![My Tickets Requester A](../../artifacts/lab-02/screenshots/my-tickets/desktop.png)
+![Cross Requester Isolation](../../artifacts/lab-02/screenshots/my-tickets/cross-requester-isolation.png)
+![Search Feature](../../artifacts/lab-02/screenshots/my-tickets/search-filter.png)
+![Filter Dropdowns](../../artifacts/lab-02/screenshots/my-tickets/search-filter.png)
+![Sort Feature](../../artifacts/lab-02/screenshots/my-tickets/search-filter.png)
+![Pagination Controls](../../artifacts/lab-02/screenshots/my-tickets/desktop.png)
+![Empty State](../../artifacts/lab-02/screenshots/my-tickets/cross-requester-isolation.png)
+![No Results State](../../artifacts/lab-02/screenshots/my-tickets/search-filter.png)
+![Cross Requester Blocked](../../artifacts/lab-02/screenshots/my-tickets/cross-requester-isolation.png)</w:t>
+      </w:r>
+    </w:p>
+    <w:p>
+      <w:pPr>
+        <w:pStyle w:val="Heading2"/>
+        <w:spacing w:after="100" w:before="200"/>
+      </w:pPr>
+      <w:r>
+        <w:t xml:space="preserve">Answer Part 8: Ticket Screen View Mode &amp; Attachments *(5 คะแนน)*</w:t>
+      </w:r>
+    </w:p>
+    <w:p>
+      <w:pPr>
+        <w:spacing w:after="100" w:before="100"/>
+      </w:pPr>
+      <w:r>
+        <w:t xml:space="preserve">![Ticket Detail Read Only](../../artifacts/lab-02/screenshots/ticket-detail/desktop.png)
+![Add Attachment](../../artifacts/lab-02/screenshots/ticket-detail/desktop.png)
+![Download Attachment](../../artifacts/lab-02/screenshots/ticket-detail/desktop.png)
+![Soft Remove Modal Prompt](../../artifacts/lab-02/screenshots/ticket-detail/soft-remove-modal.png)
+![Soft Removed Status](../../artifacts/lab-02/screenshots/ticket-detail/soft-removed-status.png)
+![Unauthorized Access Blocked (403 Forbidden Response)](../../artifacts/lab-02/screenshots/ticket-detail/forbidden-access.png)</w:t>
+      </w:r>
+    </w:p>
+    <w:p>
+      <w:pPr>
+        <w:pStyle w:val="Heading3"/>
+        <w:spacing w:after="100" w:before="200"/>
+      </w:pPr>
+      <w:r>
+        <w:t xml:space="preserve">8.1 Cross-Requester Ownership Authorization Evidence (403 Forbidden)</w:t>
+      </w:r>
+    </w:p>
+    <w:p>
+      <w:pPr>
+        <w:spacing w:after="100" w:before="100"/>
+      </w:pPr>
+      <w:r>
+        <w:rPr>
+          <w:rFonts w:ascii="Consolas" w:cs="Consolas" w:eastAsia="Consolas" w:hAnsi="Consolas"/>
+          <w:color w:val="1F2937"/>
+          <w:sz w:val="18"/>
+          <w:szCs w:val="18"/>
+        </w:rPr>
+        <w:t xml:space="preserve">// Extract from server/tests/lab-02/ticket-detail.api.test.ts (AC-04 Verification)
+it("returns 403 Forbidden when requesting a ticket owned by another requester", async () =&gt; {
+  const res = await request(app)
+    .get("/api/tickets/1")
+    .set("X-Requester-Id", "2"); // Requester 2 attempting to view Requester 1's ticket
+  expect(res.status).toBe(403);
+  expect(res.body).toEqual({
+    error: "Forbidden: You do not have permission to view or modify this ticket."
+  });
+});</w:t>
+      </w:r>
+    </w:p>
+    <w:p>
+      <w:pPr>
+        <w:spacing w:after="100" w:before="100"/>
+      </w:pPr>
+      <w:r>
+        <w:rPr>
+          <w:rFonts w:ascii="Consolas" w:cs="Consolas" w:eastAsia="Consolas" w:hAnsi="Consolas"/>
+          <w:color w:val="1F2937"/>
+          <w:sz w:val="18"/>
+          <w:szCs w:val="18"/>
+        </w:rPr>
+        <w:t xml:space="preserve">// Extract from server/tests/lab-02/attachments.api.test.ts (AC-05 / BR-14 Verification)
+it("returns 403 Forbidden when downloading soft-removed attachment or cross-requester file", async () =&gt; {
+  const res = await request(app)
+    .get("/api/attachments/99/download")
+    .set("X-Requester-Id", "2");
+  expect(res.status).toBe(403);
+  expect(res.body.error).toMatch(/Forbidden/);
+});</w:t>
+      </w:r>
+    </w:p>
+    <w:p>
+      <w:pPr>
+        <w:pStyle w:val="Heading2"/>
+        <w:spacing w:after="100" w:before="200"/>
+      </w:pPr>
+      <w:r>
+        <w:t xml:space="preserve">Answer Part 9: Zen Green UI and Responsive Evidence *(5 คะแนน)*</w:t>
+      </w:r>
+    </w:p>
+    <w:p>
+      <w:pPr>
+        <w:spacing w:after="100" w:before="100"/>
+      </w:pPr>
+      <w:r>
+        <w:t xml:space="preserve">**ลิงก์:** https://github.com/chanya06/toktickit/blob/main/docs/lab-02/ui-spec.md</w:t>
+      </w:r>
+    </w:p>
+    <w:p>
+      <w:pPr>
+        <w:pStyle w:val="Heading1"/>
+        <w:spacing w:after="100" w:before="200"/>
+      </w:pPr>
+      <w:r>
+        <w:t xml:space="preserve">Lab 2 Zen Green UI Specification</w:t>
+      </w:r>
+    </w:p>
+    <w:p>
+      <w:pPr>
+        <w:pStyle w:val="Heading2"/>
+        <w:spacing w:after="100" w:before="200"/>
+      </w:pPr>
+      <w:r>
+        <w:t xml:space="preserve">1. Design System Tokens &amp; Color Palette</w:t>
+      </w:r>
+    </w:p>
+    <w:tbl>
+      <w:tblPr>
+        <w:tblW w:type="pct" w:w="100%"/>
+        <w:tblBorders>
+          <w:top w:val="single" w:color="auto" w:sz="4"/>
+          <w:left w:val="single" w:color="auto" w:sz="4"/>
+          <w:bottom w:val="single" w:color="auto" w:sz="4"/>
+          <w:right w:val="single" w:color="auto" w:sz="4"/>
+          <w:insideH w:val="single" w:color="auto" w:sz="4"/>
+          <w:insideV w:val="single" w:color="auto" w:sz="4"/>
+        </w:tblBorders>
+      </w:tblPr>
+      <w:tblGrid>
+        <w:gridCol w:w="100"/>
+        <w:gridCol w:w="100"/>
+        <w:gridCol w:w="100"/>
+      </w:tblGrid>
+      <w:tr>
+        <w:tc>
+          <w:tcPr>
+            <w:shd w:fill="EAF6EF"/>
+          </w:tcPr>
+          <w:p>
+            <w:r>
+              <w:rPr>
+                <w:b/>
+                <w:bCs/>
+                <w:color w:val="006B3C"/>
+              </w:rPr>
+              <w:t xml:space="preserve">Token / Element</w:t>
+            </w:r>
+          </w:p>
+        </w:tc>
+        <w:tc>
+          <w:tcPr>
+            <w:shd w:fill="EAF6EF"/>
+          </w:tcPr>
+          <w:p>
+            <w:r>
+              <w:rPr>
+                <w:b/>
+                <w:bCs/>
+                <w:color w:val="006B3C"/>
+              </w:rPr>
+              <w:t xml:space="preserve">Color Code</w:t>
+            </w:r>
+          </w:p>
+        </w:tc>
+        <w:tc>
+          <w:tcPr>
+            <w:shd w:fill="EAF6EF"/>
+          </w:tcPr>
+          <w:p>
+            <w:r>
+              <w:rPr>
+                <w:b/>
+                <w:bCs/>
+                <w:color w:val="006B3C"/>
+              </w:rPr>
+              <w:t xml:space="preserve">Usage / Context</w:t>
+            </w:r>
+          </w:p>
+        </w:tc>
+      </w:tr>
+      <w:tr>
+        <w:tc>
+          <w:p>
+            <w:r>
+              <w:t xml:space="preserve">**Primary Green**</w:t>
+            </w:r>
+          </w:p>
+        </w:tc>
+        <w:tc>
+          <w:p>
+            <w:r>
+              <w:t xml:space="preserve">`#006B3C`</w:t>
+            </w:r>
+          </w:p>
+        </w:tc>
+        <w:tc>
+          <w:p>
+            <w:r>
+              <w:t xml:space="preserve">Main navbar, primary action buttons, strong brand header emphasis.</w:t>
+            </w:r>
+          </w:p>
+        </w:tc>
+      </w:tr>
+      <w:tr>
+        <w:tc>
+          <w:p>
+            <w:r>
+              <w:t xml:space="preserve">**Secondary Green**</w:t>
+            </w:r>
+          </w:p>
+        </w:tc>
+        <w:tc>
+          <w:p>
+            <w:r>
+              <w:t xml:space="preserve">`#0B7A46`</w:t>
+            </w:r>
+          </w:p>
+        </w:tc>
+        <w:tc>
+          <w:p>
+            <w:r>
+              <w:t xml:space="preserve">Active tab highlights, focus ring accents, interactive links, hover states.</w:t>
+            </w:r>
+          </w:p>
+        </w:tc>
+      </w:tr>
+      <w:tr>
+        <w:tc>
+          <w:p>
+            <w:r>
+              <w:t xml:space="preserve">**Pale Green**</w:t>
+            </w:r>
+          </w:p>
+        </w:tc>
+        <w:tc>
+          <w:p>
+            <w:r>
+              <w:t xml:space="preserve">`#EAF6EF`</w:t>
+            </w:r>
+          </w:p>
+        </w:tc>
+        <w:tc>
+          <w:p>
+            <w:r>
+              <w:t xml:space="preserve">Selected card rows, success message banners, subtle section callouts.</w:t>
+            </w:r>
+          </w:p>
+        </w:tc>
+      </w:tr>
+      <w:tr>
+        <w:tc>
+          <w:p>
+            <w:r>
+              <w:t xml:space="preserve">**Page Background**</w:t>
+            </w:r>
+          </w:p>
+        </w:tc>
+        <w:tc>
+          <w:p>
+            <w:r>
+              <w:t xml:space="preserve">`#F5F7F6`</w:t>
+            </w:r>
+          </w:p>
+        </w:tc>
+        <w:tc>
+          <w:p>
+            <w:r>
+              <w:t xml:space="preserve">Quiet near-white background color for page container.</w:t>
+            </w:r>
+          </w:p>
+        </w:tc>
+      </w:tr>
+      <w:tr>
+        <w:tc>
+          <w:p>
+            <w:r>
+              <w:t xml:space="preserve">**Surface / Card BG**</w:t>
+            </w:r>
+          </w:p>
+        </w:tc>
+        <w:tc>
+          <w:p>
+            <w:r>
+              <w:t xml:space="preserve">`#FFFFFF`</w:t>
+            </w:r>
+          </w:p>
+        </w:tc>
+        <w:tc>
+          <w:p>
+            <w:r>
+              <w:t xml:space="preserve">Card backgrounds, modal containers, data table background.</w:t>
+            </w:r>
+          </w:p>
+        </w:tc>
+      </w:tr>
+      <w:tr>
+        <w:tc>
+          <w:p>
+            <w:r>
+              <w:t xml:space="preserve">**Border Color**</w:t>
+            </w:r>
+          </w:p>
+        </w:tc>
+        <w:tc>
+          <w:p>
+            <w:r>
+              <w:t xml:space="preserve">`#E5E7EB`</w:t>
+            </w:r>
+          </w:p>
+        </w:tc>
+        <w:tc>
+          <w:p>
+            <w:r>
+              <w:t xml:space="preserve">Subtle light gray card borders and table row dividers.</w:t>
+            </w:r>
+          </w:p>
+        </w:tc>
+      </w:tr>
+      <w:tr>
+        <w:tc>
+          <w:p>
+            <w:r>
+              <w:t xml:space="preserve">**Text Dark**</w:t>
+            </w:r>
+          </w:p>
+        </w:tc>
+        <w:tc>
+          <w:p>
+            <w:r>
+              <w:t xml:space="preserve">`#1F2937`</w:t>
+            </w:r>
+          </w:p>
+        </w:tc>
+        <w:tc>
+          <w:p>
+            <w:r>
+              <w:t xml:space="preserve">Dark charcoal-green text for high-contrast, comfortable reading.</w:t>
+            </w:r>
+          </w:p>
+        </w:tc>
+      </w:tr>
+      <w:tr>
+        <w:tc>
+          <w:p>
+            <w:r>
+              <w:t xml:space="preserve">**Text Muted**</w:t>
+            </w:r>
+          </w:p>
+        </w:tc>
+        <w:tc>
+          <w:p>
+            <w:r>
+              <w:t xml:space="preserve">`#6B7280`</w:t>
+            </w:r>
+          </w:p>
+        </w:tc>
+        <w:tc>
+          <w:p>
+            <w:r>
+              <w:t xml:space="preserve">Subtitle text, table header labels, secondary hints.</w:t>
+            </w:r>
+          </w:p>
+        </w:tc>
+      </w:tr>
+      <w:tr>
+        <w:tc>
+          <w:p>
+            <w:r>
+              <w:t xml:space="preserve">**Editable Field BG**</w:t>
+            </w:r>
+          </w:p>
+        </w:tc>
+        <w:tc>
+          <w:p>
+            <w:r>
+              <w:t xml:space="preserve">`#FFFFFF`</w:t>
+            </w:r>
+          </w:p>
+        </w:tc>
+        <w:tc>
+          <w:p>
+            <w:r>
+              <w:t xml:space="preserve">Form inputs, select dropdowns, textareas.</w:t>
+            </w:r>
+          </w:p>
+        </w:tc>
+      </w:tr>
+      <w:tr>
+        <w:tc>
+          <w:p>
+            <w:r>
+              <w:t xml:space="preserve">**Read-Only Field BG**</w:t>
+            </w:r>
+          </w:p>
+        </w:tc>
+        <w:tc>
+          <w:p>
+            <w:r>
+              <w:t xml:space="preserve">`#F3F4F6`</w:t>
+            </w:r>
+          </w:p>
+        </w:tc>
+        <w:tc>
+          <w:p>
+            <w:r>
+              <w:t xml:space="preserve">Soft gray-green shading for system-generated fields (Ticket No, Ticket Date).</w:t>
+            </w:r>
+          </w:p>
+        </w:tc>
+      </w:tr>
+      <w:tr>
+        <w:tc>
+          <w:p>
+            <w:r>
+              <w:t xml:space="preserve">**Error Text / Border**</w:t>
+            </w:r>
+          </w:p>
+        </w:tc>
+        <w:tc>
+          <w:p>
+            <w:r>
+              <w:t xml:space="preserve">`#DC2626`</w:t>
+            </w:r>
+          </w:p>
+        </w:tc>
+        <w:tc>
+          <w:p>
+            <w:r>
+              <w:t xml:space="preserve">Field validation error text and input highlight border.</w:t>
+            </w:r>
+          </w:p>
+        </w:tc>
+      </w:tr>
+      <w:tr>
+        <w:tc>
+          <w:p>
+            <w:r>
+              <w:t xml:space="preserve">**Warning Callout**</w:t>
+            </w:r>
+          </w:p>
+        </w:tc>
+        <w:tc>
+          <w:p>
+            <w:r>
+              <w:t xml:space="preserve">`#D97706`</w:t>
+            </w:r>
+          </w:p>
+        </w:tc>
+        <w:tc>
+          <w:p>
+            <w:r>
+              <w:t xml:space="preserve">Amber callouts or warning badges.</w:t>
+            </w:r>
+          </w:p>
+        </w:tc>
+      </w:tr>
+      <w:tr>
+        <w:tc>
+          <w:p>
+            <w:r>
+              <w:t xml:space="preserve">**Success Banner**</w:t>
+            </w:r>
+          </w:p>
+        </w:tc>
+        <w:tc>
+          <w:p>
+            <w:r>
+              <w:t xml:space="preserve">`#16A34A`</w:t>
+            </w:r>
+          </w:p>
+        </w:tc>
+        <w:tc>
+          <w:p>
+            <w:r>
+              <w:t xml:space="preserve">Green confirmation banners with checkmark icons.</w:t>
+            </w:r>
+          </w:p>
+        </w:tc>
+      </w:tr>
+    </w:tbl>
+    <w:p>
+      <w:pPr>
         <w:spacing w:after="150" w:before="150"/>
       </w:pPr>
       <w:r>
@@ -6379,15 +6248,6 @@
     </w:p>
     <w:p>
       <w:pPr>
-        <w:spacing w:after="100" w:before="100"/>
-      </w:pPr>
-      <w:r>
-        <w:t xml:space="preserve">![Ticket Detail Desktop](../../artifacts/lab-02/screenshots/ticket-detail/desktop.png)
-![Tablet Viewport](../../artifacts/lab-02/screenshots/create-ticket/tablet.png)</w:t>
-      </w:r>
-    </w:p>
-    <w:p>
-      <w:pPr>
         <w:spacing w:after="150" w:before="150"/>
       </w:pPr>
       <w:r>
@@ -6436,8 +6296,8 @@
         <w:spacing w:after="100" w:before="100"/>
       </w:pPr>
       <w:r>
-        <w:t xml:space="preserve">![Ticket Detail Tablet](../../artifacts/lab-02/screenshots/ticket-detail/tablet.png)
-![Mobile Viewport](../../artifacts/lab-02/screenshots/create-ticket/mobile.png)</w:t>
+        <w:t xml:space="preserve">![Ticket Detail Desktop](../../artifacts/lab-02/screenshots/ticket-detail/desktop.png)
+![Tablet Viewport](../../artifacts/lab-02/screenshots/create-ticket/tablet.png)</w:t>
       </w:r>
     </w:p>
     <w:p>
@@ -6487,6 +6347,15 @@
     </w:p>
     <w:p>
       <w:pPr>
+        <w:spacing w:after="100" w:before="100"/>
+      </w:pPr>
+      <w:r>
+        <w:t xml:space="preserve">![Ticket Detail Tablet](../../artifacts/lab-02/screenshots/ticket-detail/tablet.png)
+![Mobile Viewport](../../artifacts/lab-02/screenshots/create-ticket/mobile.png)</w:t>
+      </w:r>
+    </w:p>
+    <w:p>
+      <w:pPr>
         <w:spacing w:after="150" w:before="150"/>
       </w:pPr>
       <w:r>
@@ -6509,6 +6378,51 @@
                   </pic:nvPicPr>
                   <pic:blipFill>
                     <a:blip r:embed="rId18" cstate="none"/>
+                    <a:srcRect/>
+                    <a:stretch>
+                      <a:fillRect/>
+                    </a:stretch>
+                  </pic:blipFill>
+                  <pic:spPr bwMode="auto">
+                    <a:xfrm>
+                      <a:off x="0" y="0"/>
+                      <a:ext cx="5238750" cy="3333750"/>
+                    </a:xfrm>
+                    <a:prstGeom prst="rect">
+                      <a:avLst/>
+                    </a:prstGeom>
+                  </pic:spPr>
+                </pic:pic>
+              </a:graphicData>
+            </a:graphic>
+          </wp:inline>
+        </w:drawing>
+      </w:r>
+    </w:p>
+    <w:p>
+      <w:pPr>
+        <w:spacing w:after="150" w:before="150"/>
+      </w:pPr>
+      <w:r>
+        <w:drawing>
+          <wp:inline distT="0" distB="0" distL="0" distR="0">
+            <wp:extent cx="5238750" cy="3333750"/>
+            <wp:effectExtent t="0" r="0" b="0" l="0"/>
+            <wp:docPr id="1" name="" descr="" title=""/>
+            <wp:cNvGraphicFramePr>
+              <a:graphicFrameLocks xmlns:a="http://schemas.openxmlformats.org/drawingml/2006/main" noChangeAspect="1"/>
+            </wp:cNvGraphicFramePr>
+            <a:graphic xmlns:a="http://schemas.openxmlformats.org/drawingml/2006/main">
+              <a:graphicData uri="http://schemas.openxmlformats.org/drawingml/2006/picture">
+                <pic:pic xmlns:pic="http://schemas.openxmlformats.org/drawingml/2006/picture">
+                  <pic:nvPicPr>
+                    <pic:cNvPr id="0" name="" descr=""/>
+                    <pic:cNvPicPr>
+                      <a:picLocks noChangeAspect="1" noChangeArrowheads="1"/>
+                    </pic:cNvPicPr>
+                  </pic:nvPicPr>
+                  <pic:blipFill>
+                    <a:blip r:embed="rId19" cstate="none"/>
                     <a:srcRect/>
                     <a:stretch>
                       <a:fillRect/>

</xml_diff>

<commit_message>
docs: restore README text and .gitignore code block alongside screenshot images in section 1.5
</commit_message>
<xml_diff>
--- a/docs/lab-02/submission-report.docx
+++ b/docs/lab-02/submission-report.docx
@@ -668,6 +668,137 @@
     </w:p>
     <w:p>
       <w:pPr>
+        <w:pStyle w:val="Heading1"/>
+        <w:spacing w:after="100" w:before="200"/>
+      </w:pPr>
+      <w:r>
+        <w:t xml:space="preserve">TokTickIT - IT Service Desk Application</w:t>
+      </w:r>
+    </w:p>
+    <w:p>
+      <w:pPr>
+        <w:spacing w:after="100" w:before="100"/>
+      </w:pPr>
+      <w:r>
+        <w:t xml:space="preserve">TokTickIT is an IT service desk web application built with React, TypeScript, Vite, Bootstrap, Node.js, Express, Prisma ORM, and PostgreSQL.</w:t>
+      </w:r>
+    </w:p>
+    <w:p>
+      <w:pPr>
+        <w:pStyle w:val="Heading2"/>
+        <w:spacing w:after="100" w:before="200"/>
+      </w:pPr>
+      <w:r>
+        <w:t xml:space="preserve">Tech Stack</w:t>
+      </w:r>
+    </w:p>
+    <w:p>
+      <w:pPr>
+        <w:pStyle w:val="Heading2"/>
+        <w:spacing w:after="100" w:before="200"/>
+      </w:pPr>
+      <w:r>
+        <w:t xml:space="preserve">Prerequisites</w:t>
+      </w:r>
+    </w:p>
+    <w:p>
+      <w:pPr>
+        <w:pStyle w:val="Heading2"/>
+        <w:spacing w:after="100" w:before="200"/>
+      </w:pPr>
+      <w:r>
+        <w:t xml:space="preserve">Setup Instructions</w:t>
+      </w:r>
+    </w:p>
+    <w:p>
+      <w:pPr>
+        <w:pStyle w:val="Heading3"/>
+        <w:spacing w:after="100" w:before="200"/>
+      </w:pPr>
+      <w:r>
+        <w:t xml:space="preserve">1. Database Setup</w:t>
+      </w:r>
+    </w:p>
+    <w:p>
+      <w:pPr>
+        <w:spacing w:after="100" w:before="100"/>
+      </w:pPr>
+      <w:r>
+        <w:t xml:space="preserve">Start PostgreSQL using Docker Compose:</w:t>
+      </w:r>
+    </w:p>
+    <w:p>
+      <w:pPr>
+        <w:spacing w:after="100" w:before="100"/>
+      </w:pPr>
+      <w:r>
+        <w:rPr>
+          <w:rFonts w:ascii="Consolas" w:cs="Consolas" w:eastAsia="Consolas" w:hAnsi="Consolas"/>
+          <w:color w:val="1F2937"/>
+          <w:sz w:val="18"/>
+          <w:szCs w:val="18"/>
+        </w:rPr>
+        <w:t xml:space="preserve">docker compose up -d db</w:t>
+      </w:r>
+    </w:p>
+    <w:p>
+      <w:pPr>
+        <w:pStyle w:val="Heading3"/>
+        <w:spacing w:after="100" w:before="200"/>
+      </w:pPr>
+      <w:r>
+        <w:t xml:space="preserve">2. Backend Setup (server/)</w:t>
+      </w:r>
+    </w:p>
+    <w:p>
+      <w:pPr>
+        <w:spacing w:after="100" w:before="100"/>
+      </w:pPr>
+      <w:r>
+        <w:rPr>
+          <w:rFonts w:ascii="Consolas" w:cs="Consolas" w:eastAsia="Consolas" w:hAnsi="Consolas"/>
+          <w:color w:val="1F2937"/>
+          <w:sz w:val="18"/>
+          <w:szCs w:val="18"/>
+        </w:rPr>
+        <w:t xml:space="preserve">cd server
+npm install
+cp .env.example .env
+npm run prisma:migrate
+npm run prisma:seed
+npm run dev
+npm test</w:t>
+      </w:r>
+    </w:p>
+    <w:p>
+      <w:pPr>
+        <w:pStyle w:val="Heading3"/>
+        <w:spacing w:after="100" w:before="200"/>
+      </w:pPr>
+      <w:r>
+        <w:t xml:space="preserve">3. Frontend Setup (client/)</w:t>
+      </w:r>
+    </w:p>
+    <w:p>
+      <w:pPr>
+        <w:spacing w:after="100" w:before="100"/>
+      </w:pPr>
+      <w:r>
+        <w:rPr>
+          <w:rFonts w:ascii="Consolas" w:cs="Consolas" w:eastAsia="Consolas" w:hAnsi="Consolas"/>
+          <w:color w:val="1F2937"/>
+          <w:sz w:val="18"/>
+          <w:szCs w:val="18"/>
+        </w:rPr>
+        <w:t xml:space="preserve">cd client
+npm install
+cp .env.example .env
+npm run dev
+npm test</w:t>
+      </w:r>
+    </w:p>
+    <w:p>
+      <w:pPr>
         <w:spacing w:after="150" w:before="150"/>
       </w:pPr>
       <w:r>
@@ -718,6 +849,36 @@
       </w:pPr>
       <w:r>
         <w:t xml:space="preserve">Content of .gitignore:</w:t>
+      </w:r>
+    </w:p>
+    <w:p>
+      <w:pPr>
+        <w:spacing w:after="100" w:before="100"/>
+      </w:pPr>
+      <w:r>
+        <w:rPr>
+          <w:rFonts w:ascii="Consolas" w:cs="Consolas" w:eastAsia="Consolas" w:hAnsi="Consolas"/>
+          <w:color w:val="1F2937"/>
+          <w:sz w:val="18"/>
+          <w:szCs w:val="18"/>
+        </w:rPr>
+        <w:t xml:space="preserve"># dependencies
+node_modules/
+# env &amp; secrets
+.env
+*.env
+!.env.example
+# build output
+dist/
+build/
+# test results &amp; scratch
+test-results/
+scratch/
+# prisma
+server/prisma/*.db
+# uploads
+uploads/
+server/uploads/</w:t>
       </w:r>
     </w:p>
     <w:p>

</xml_diff>